<commit_message>
mudança nos Stories + Eventos 1ª Sprint
</commit_message>
<xml_diff>
--- a/IPL-TeSP-PSI-MDS-2526-Template_Projeto.docx
+++ b/IPL-TeSP-PSI-MDS-2526-Template_Projeto.docx
@@ -7316,7 +7316,21 @@
                 <w:b w:val="0"/>
                 <w:bCs w:val="0"/>
               </w:rPr>
-              <w:t>Como membro do agregado familiar, quero autenticar-me com as minhas credenciais para que apenas utilizadores registados possam aceder à aplicação.</w:t>
+              <w:t xml:space="preserve">Como </w:t>
+            </w:r>
+            <w:r>
+              <w:rPr>
+                <w:b w:val="0"/>
+                <w:bCs w:val="0"/>
+              </w:rPr>
+              <w:t>utilizador</w:t>
+            </w:r>
+            <w:r>
+              <w:rPr>
+                <w:b w:val="0"/>
+                <w:bCs w:val="0"/>
+              </w:rPr>
+              <w:t>, quero autenticar-me com as minhas credenciais para que apenas utilizadores registados possam aceder à aplicação.</w:t>
             </w:r>
           </w:p>
           <w:p>
@@ -7472,7 +7486,21 @@
                 <w:b w:val="0"/>
                 <w:bCs w:val="0"/>
               </w:rPr>
-              <w:t>Como membro do agregado familiar, quero gerir os utilizadores da aplicação para que todos os membros possam ter acesso ao sistema.</w:t>
+              <w:t>Como</w:t>
+            </w:r>
+            <w:r>
+              <w:rPr>
+                <w:b w:val="0"/>
+                <w:bCs w:val="0"/>
+              </w:rPr>
+              <w:t xml:space="preserve"> utilizador</w:t>
+            </w:r>
+            <w:r>
+              <w:rPr>
+                <w:b w:val="0"/>
+                <w:bCs w:val="0"/>
+              </w:rPr>
+              <w:t>, quero gerir os utilizadores da aplicação para que todos os membros possam ter acesso ao sistema.</w:t>
             </w:r>
           </w:p>
           <w:p>
@@ -7639,7 +7667,21 @@
                 <w:b w:val="0"/>
                 <w:bCs w:val="0"/>
               </w:rPr>
-              <w:t>Como membro do agregado familiar, quero gerir os tipos de artigo para que os artigos possam estar organizados por categorias.</w:t>
+              <w:t xml:space="preserve">Como </w:t>
+            </w:r>
+            <w:r>
+              <w:rPr>
+                <w:b w:val="0"/>
+                <w:bCs w:val="0"/>
+              </w:rPr>
+              <w:t>utilizador</w:t>
+            </w:r>
+            <w:r>
+              <w:rPr>
+                <w:b w:val="0"/>
+                <w:bCs w:val="0"/>
+              </w:rPr>
+              <w:t>, quero gerir os tipos de artigo para que os artigos possam estar organizados por categorias.</w:t>
             </w:r>
           </w:p>
           <w:p>
@@ -7805,7 +7847,21 @@
                 <w:b w:val="0"/>
                 <w:bCs w:val="0"/>
               </w:rPr>
-              <w:t>Como membro do agregado familiar, quero gerir os artigos disponíveis para que possam ser utilizados no planeamento e execução de compras.</w:t>
+              <w:t xml:space="preserve">Como </w:t>
+            </w:r>
+            <w:r>
+              <w:rPr>
+                <w:b w:val="0"/>
+                <w:bCs w:val="0"/>
+              </w:rPr>
+              <w:t>utilizador</w:t>
+            </w:r>
+            <w:r>
+              <w:rPr>
+                <w:b w:val="0"/>
+                <w:bCs w:val="0"/>
+              </w:rPr>
+              <w:t>, quero gerir os artigos disponíveis para que possam ser utilizados no planeamento e execução de compras.</w:t>
             </w:r>
           </w:p>
           <w:p>
@@ -7985,7 +8041,21 @@
                 <w:b w:val="0"/>
                 <w:bCs w:val="0"/>
               </w:rPr>
-              <w:t>Como membro do agregado familiar, quero definir e gerir o orçamento mensal para que exista um limite de despesa controlado para as compras do mês.</w:t>
+              <w:t>Como</w:t>
+            </w:r>
+            <w:r>
+              <w:rPr>
+                <w:b w:val="0"/>
+                <w:bCs w:val="0"/>
+              </w:rPr>
+              <w:t xml:space="preserve"> utilizador</w:t>
+            </w:r>
+            <w:r>
+              <w:rPr>
+                <w:b w:val="0"/>
+                <w:bCs w:val="0"/>
+              </w:rPr>
+              <w:t>, quero definir e gerir o orçamento mensal para que exista um limite de despesa controlado para as compras do mês.</w:t>
             </w:r>
           </w:p>
           <w:p>
@@ -8168,7 +8238,21 @@
                 <w:b w:val="0"/>
                 <w:bCs w:val="0"/>
               </w:rPr>
-              <w:t>Como membro do agregado familiar, quero criar uma lista de compras com artigos e quantidades previstas para que a compra possa ser organizada antecipadamente.</w:t>
+              <w:t xml:space="preserve">Como </w:t>
+            </w:r>
+            <w:r>
+              <w:rPr>
+                <w:b w:val="0"/>
+                <w:bCs w:val="0"/>
+              </w:rPr>
+              <w:t>utilizador</w:t>
+            </w:r>
+            <w:r>
+              <w:rPr>
+                <w:b w:val="0"/>
+                <w:bCs w:val="0"/>
+              </w:rPr>
+              <w:t>, quero criar uma lista de compras com artigos e quantidades previstas para que a compra possa ser organizada antecipadamente.</w:t>
             </w:r>
           </w:p>
           <w:p>
@@ -8349,7 +8433,21 @@
                 <w:b w:val="0"/>
                 <w:bCs w:val="0"/>
               </w:rPr>
-              <w:t>Como membro do agregado familiar, quero visualizar todas as minhas compras e filtrá-las por estado para que possa gerir facilmente as compras em aberto e as fechadas.</w:t>
+              <w:t xml:space="preserve">Como </w:t>
+            </w:r>
+            <w:r>
+              <w:rPr>
+                <w:b w:val="0"/>
+                <w:bCs w:val="0"/>
+              </w:rPr>
+              <w:t>utilizador</w:t>
+            </w:r>
+            <w:r>
+              <w:rPr>
+                <w:b w:val="0"/>
+                <w:bCs w:val="0"/>
+              </w:rPr>
+              <w:t>, quero visualizar todas as minhas compras e filtrá-las por estado para que possa gerir facilmente as compras em aberto e as fechadas.</w:t>
             </w:r>
           </w:p>
           <w:p>
@@ -8523,7 +8621,21 @@
                 <w:b w:val="0"/>
                 <w:bCs w:val="0"/>
               </w:rPr>
-              <w:t>Como membro do agregado familiar, quero editar uma compra que ainda não foi fechada para que possa ajustar os itens planeados antes de ir às compras.</w:t>
+              <w:t>Co</w:t>
+            </w:r>
+            <w:r>
+              <w:rPr>
+                <w:b w:val="0"/>
+                <w:bCs w:val="0"/>
+              </w:rPr>
+              <w:t>mo utilizador</w:t>
+            </w:r>
+            <w:r>
+              <w:rPr>
+                <w:b w:val="0"/>
+                <w:bCs w:val="0"/>
+              </w:rPr>
+              <w:t>, quero editar uma compra que ainda não foi fechada para que possa ajustar os itens planeados antes de ir às compras.</w:t>
             </w:r>
           </w:p>
           <w:p>
@@ -8721,7 +8833,21 @@
                 <w:b w:val="0"/>
                 <w:bCs w:val="0"/>
               </w:rPr>
-              <w:t>Como membro do agregado familiar, quero registar os artigos que estou a adquirir com quantidade e preço unitário para que a compra fique devidamente documentada.</w:t>
+              <w:t xml:space="preserve">Como </w:t>
+            </w:r>
+            <w:r>
+              <w:rPr>
+                <w:b w:val="0"/>
+                <w:bCs w:val="0"/>
+              </w:rPr>
+              <w:t>utilizador</w:t>
+            </w:r>
+            <w:r>
+              <w:rPr>
+                <w:b w:val="0"/>
+                <w:bCs w:val="0"/>
+              </w:rPr>
+              <w:t>, quero registar os artigos que estou a adquirir com quantidade e preço unitário para que a compra fique devidamente documentada.</w:t>
             </w:r>
           </w:p>
           <w:p>
@@ -8915,7 +9041,21 @@
                 <w:b w:val="0"/>
                 <w:bCs w:val="0"/>
               </w:rPr>
-              <w:t>Como membro do agregado familiar, quero adicionar artigos não planeados durante a compra para que despesas imprevistas também fiquem registadas.</w:t>
+              <w:t xml:space="preserve">Como </w:t>
+            </w:r>
+            <w:r>
+              <w:rPr>
+                <w:b w:val="0"/>
+                <w:bCs w:val="0"/>
+              </w:rPr>
+              <w:t>utilizador</w:t>
+            </w:r>
+            <w:r>
+              <w:rPr>
+                <w:b w:val="0"/>
+                <w:bCs w:val="0"/>
+              </w:rPr>
+              <w:t>, quero adicionar artigos não planeados durante a compra para que despesas imprevistas também fiquem registadas.</w:t>
             </w:r>
           </w:p>
           <w:p>
@@ -9042,14 +9182,7 @@
                 <w:b w:val="0"/>
                 <w:bCs w:val="0"/>
               </w:rPr>
-              <w:t>1</w:t>
-            </w:r>
-            <w:r>
-              <w:rPr>
-                <w:b w:val="0"/>
-                <w:bCs w:val="0"/>
-              </w:rPr>
-              <w:t>1</w:t>
+              <w:t>11</w:t>
             </w:r>
             <w:r>
               <w:rPr>
@@ -9063,14 +9196,7 @@
                 <w:b w:val="0"/>
                 <w:bCs w:val="0"/>
               </w:rPr>
-              <w:t xml:space="preserve"> </w:t>
-            </w:r>
-            <w:r>
-              <w:rPr>
-                <w:b w:val="0"/>
-                <w:bCs w:val="0"/>
-              </w:rPr>
-              <w:t>Fechar uma compra</w:t>
+              <w:t xml:space="preserve"> Fechar uma compra</w:t>
             </w:r>
           </w:p>
         </w:tc>
@@ -9120,7 +9246,21 @@
                 <w:b w:val="0"/>
                 <w:bCs w:val="0"/>
               </w:rPr>
-              <w:t>Como membro do agregado familiar, quero fechar uma compra concluída para que fique registada como finalizada e não possa ser alterada.</w:t>
+              <w:t xml:space="preserve">Como </w:t>
+            </w:r>
+            <w:r>
+              <w:rPr>
+                <w:b w:val="0"/>
+                <w:bCs w:val="0"/>
+              </w:rPr>
+              <w:t>utilizador</w:t>
+            </w:r>
+            <w:r>
+              <w:rPr>
+                <w:b w:val="0"/>
+                <w:bCs w:val="0"/>
+              </w:rPr>
+              <w:t>, quero fechar uma compra concluída para que fique registada como finalizada e não possa ser alterada.</w:t>
             </w:r>
           </w:p>
           <w:p>
@@ -9227,14 +9367,7 @@
                 <w:b w:val="0"/>
                 <w:bCs w:val="0"/>
               </w:rPr>
-              <w:t>1</w:t>
-            </w:r>
-            <w:r>
-              <w:rPr>
-                <w:b w:val="0"/>
-                <w:bCs w:val="0"/>
-              </w:rPr>
-              <w:t>2</w:t>
+              <w:t>12</w:t>
             </w:r>
             <w:r>
               <w:rPr>
@@ -9305,7 +9438,21 @@
                 <w:b w:val="0"/>
                 <w:bCs w:val="0"/>
               </w:rPr>
-              <w:t>Como membro do agregado familiar, quero exportar as minhas compras fechadas para um ficheiro CSV para que possa analisar os dados externamente.</w:t>
+              <w:t xml:space="preserve">Como </w:t>
+            </w:r>
+            <w:r>
+              <w:rPr>
+                <w:b w:val="0"/>
+                <w:bCs w:val="0"/>
+              </w:rPr>
+              <w:t>utilizador</w:t>
+            </w:r>
+            <w:r>
+              <w:rPr>
+                <w:b w:val="0"/>
+                <w:bCs w:val="0"/>
+              </w:rPr>
+              <w:t>, quero exportar as minhas compras fechadas para um ficheiro CSV para que possa analisar os dados externamente.</w:t>
             </w:r>
           </w:p>
           <w:p>
@@ -9410,14 +9557,7 @@
                 <w:b w:val="0"/>
                 <w:bCs w:val="0"/>
               </w:rPr>
-              <w:t>1</w:t>
-            </w:r>
-            <w:r>
-              <w:rPr>
-                <w:b w:val="0"/>
-                <w:bCs w:val="0"/>
-              </w:rPr>
-              <w:t>3</w:t>
+              <w:t>13</w:t>
             </w:r>
             <w:r>
               <w:rPr>
@@ -9431,14 +9571,7 @@
                 <w:b w:val="0"/>
                 <w:bCs w:val="0"/>
               </w:rPr>
-              <w:t xml:space="preserve"> </w:t>
-            </w:r>
-            <w:r>
-              <w:rPr>
-                <w:b w:val="0"/>
-                <w:bCs w:val="0"/>
-              </w:rPr>
-              <w:t>Consultar estatísticas de orçamento</w:t>
+              <w:t xml:space="preserve"> Consultar estatísticas de orçamento</w:t>
             </w:r>
           </w:p>
         </w:tc>
@@ -9488,7 +9621,21 @@
                 <w:b w:val="0"/>
                 <w:bCs w:val="0"/>
               </w:rPr>
-              <w:t>Como membro do agregado familiar, quero consultar os valores de orçamento e total gasto por mês para que possa acompanhar a evolução das despesas ao longo do tempo.</w:t>
+              <w:t>Como</w:t>
+            </w:r>
+            <w:r>
+              <w:rPr>
+                <w:b w:val="0"/>
+                <w:bCs w:val="0"/>
+              </w:rPr>
+              <w:t xml:space="preserve"> utilizador</w:t>
+            </w:r>
+            <w:r>
+              <w:rPr>
+                <w:b w:val="0"/>
+                <w:bCs w:val="0"/>
+              </w:rPr>
+              <w:t>, quero consultar os valores de orçamento e total gasto por mês para que possa acompanhar a evolução das despesas ao longo do tempo.</w:t>
             </w:r>
           </w:p>
           <w:p>
@@ -9575,14 +9722,7 @@
                 <w:b w:val="0"/>
                 <w:bCs w:val="0"/>
               </w:rPr>
-              <w:t>1</w:t>
-            </w:r>
-            <w:r>
-              <w:rPr>
-                <w:b w:val="0"/>
-                <w:bCs w:val="0"/>
-              </w:rPr>
-              <w:t>4</w:t>
+              <w:t>14</w:t>
             </w:r>
             <w:r>
               <w:rPr>
@@ -9653,7 +9793,21 @@
                 <w:b w:val="0"/>
                 <w:bCs w:val="0"/>
               </w:rPr>
-              <w:t>Como membro do agregado familiar, quero ver a percentagem de artigos previstos e não previstos por compra fechada para que possa avaliar a qualidade do meu planeamento.</w:t>
+              <w:t xml:space="preserve">Como </w:t>
+            </w:r>
+            <w:r>
+              <w:rPr>
+                <w:b w:val="0"/>
+                <w:bCs w:val="0"/>
+              </w:rPr>
+              <w:t>utilizador</w:t>
+            </w:r>
+            <w:r>
+              <w:rPr>
+                <w:b w:val="0"/>
+                <w:bCs w:val="0"/>
+              </w:rPr>
+              <w:t>, quero ver a percentagem de artigos previstos e não previstos por compra fechada para que possa avaliar a qualidade do meu planeamento.</w:t>
             </w:r>
           </w:p>
           <w:p>
@@ -9807,7 +9961,21 @@
                 <w:b w:val="0"/>
                 <w:bCs w:val="0"/>
               </w:rPr>
-              <w:t>Como membro do agregado familiar, quero receber uma sugestão de orçamento baseada nos meses anteriores para que possa definir um valor mais informado.</w:t>
+              <w:t xml:space="preserve">Como </w:t>
+            </w:r>
+            <w:r>
+              <w:rPr>
+                <w:b w:val="0"/>
+                <w:bCs w:val="0"/>
+              </w:rPr>
+              <w:t>utilizador</w:t>
+            </w:r>
+            <w:r>
+              <w:rPr>
+                <w:b w:val="0"/>
+                <w:bCs w:val="0"/>
+              </w:rPr>
+              <w:t>, quero receber uma sugestão de orçamento baseada nos meses anteriores para que possa definir um valor mais informado.</w:t>
             </w:r>
           </w:p>
           <w:p>
@@ -9894,14 +10062,7 @@
                 <w:b w:val="0"/>
                 <w:bCs w:val="0"/>
               </w:rPr>
-              <w:t>1</w:t>
-            </w:r>
-            <w:r>
-              <w:rPr>
-                <w:b w:val="0"/>
-                <w:bCs w:val="0"/>
-              </w:rPr>
-              <w:t>6</w:t>
+              <w:t>16</w:t>
             </w:r>
             <w:r>
               <w:rPr>
@@ -9972,7 +10133,21 @@
                 <w:b w:val="0"/>
                 <w:bCs w:val="0"/>
               </w:rPr>
-              <w:t>Como membro do agregado familiar, quero receber uma sugestão de lista de compras baseada na semana atual do mês para que possa planear as compras de forma mais eficiente.</w:t>
+              <w:t xml:space="preserve">Como </w:t>
+            </w:r>
+            <w:r>
+              <w:rPr>
+                <w:b w:val="0"/>
+                <w:bCs w:val="0"/>
+              </w:rPr>
+              <w:t>utilizador</w:t>
+            </w:r>
+            <w:r>
+              <w:rPr>
+                <w:b w:val="0"/>
+                <w:bCs w:val="0"/>
+              </w:rPr>
+              <w:t>, quero receber uma sugestão de lista de compras baseada na semana atual do mês para que possa planear as compras de forma mais eficiente.</w:t>
             </w:r>
           </w:p>
           <w:p>
@@ -10332,22 +10507,13 @@
               <w:cnfStyle w:val="000000100000" w:firstRow="0" w:lastRow="0" w:firstColumn="0" w:lastColumn="0" w:oddVBand="0" w:evenVBand="0" w:oddHBand="1" w:evenHBand="0" w:firstRowFirstColumn="0" w:firstRowLastColumn="0" w:lastRowFirstColumn="0" w:lastRowLastColumn="0"/>
             </w:pPr>
             <w:r>
-              <w:rPr>
-                <w:highlight w:val="yellow"/>
-              </w:rPr>
-              <w:t>&lt;</w:t>
-            </w:r>
-            <w:r>
-              <w:rPr>
-                <w:highlight w:val="yellow"/>
-              </w:rPr>
-              <w:t>1 de Maio de 20xx</w:t>
-            </w:r>
-            <w:r>
-              <w:rPr>
-                <w:highlight w:val="yellow"/>
-              </w:rPr>
-              <w:t>&gt;</w:t>
+              <w:t>6</w:t>
+            </w:r>
+            <w:r>
+              <w:t xml:space="preserve"> de Maio de 20</w:t>
+            </w:r>
+            <w:r>
+              <w:t>26</w:t>
             </w:r>
           </w:p>
         </w:tc>
@@ -10368,27 +10534,16 @@
               <w:t>Sprint Backlog</w:t>
             </w:r>
             <w:r>
-              <w:t xml:space="preserve">: </w:t>
-            </w:r>
-            <w:r>
-              <w:rPr>
-                <w:b w:val="0"/>
-                <w:bCs w:val="0"/>
-                <w:highlight w:val="yellow"/>
-              </w:rPr>
-              <w:t>&lt;retirar do jira tal como na imagem:&gt;</w:t>
-            </w:r>
-          </w:p>
-          <w:p>
-            <w:r>
-              <w:rPr>
-                <w:noProof/>
-              </w:rPr>
+              <w:t>:</w:t>
+            </w:r>
+          </w:p>
+          <w:p>
+            <w:r>
               <w:drawing>
-                <wp:inline distT="0" distB="0" distL="0" distR="0" wp14:anchorId="08DD57DF" wp14:editId="2E80B405">
-                  <wp:extent cx="6120130" cy="1844040"/>
-                  <wp:effectExtent l="0" t="0" r="1270" b="0"/>
-                  <wp:docPr id="15" name="Picture 15" descr="Graphical user interface, application&#10;&#10;Description automatically generated"/>
+                <wp:inline distT="0" distB="0" distL="0" distR="0" wp14:anchorId="39371D5E" wp14:editId="126E843B">
+                  <wp:extent cx="6120130" cy="1384300"/>
+                  <wp:effectExtent l="0" t="0" r="0" b="6350"/>
+                  <wp:docPr id="1503144944" name="Picture 1"/>
                   <wp:cNvGraphicFramePr>
                     <a:graphicFrameLocks xmlns:a="http://schemas.openxmlformats.org/drawingml/2006/main" noChangeAspect="1"/>
                   </wp:cNvGraphicFramePr>
@@ -10396,7 +10551,7 @@
                     <a:graphicData uri="http://schemas.openxmlformats.org/drawingml/2006/picture">
                       <pic:pic xmlns:pic="http://schemas.openxmlformats.org/drawingml/2006/picture">
                         <pic:nvPicPr>
-                          <pic:cNvPr id="15" name="Picture 15" descr="Graphical user interface, application&#10;&#10;Description automatically generated"/>
+                          <pic:cNvPr id="1503144944" name=""/>
                           <pic:cNvPicPr/>
                         </pic:nvPicPr>
                         <pic:blipFill>
@@ -10408,7 +10563,7 @@
                         <pic:spPr>
                           <a:xfrm>
                             <a:off x="0" y="0"/>
-                            <a:ext cx="6120130" cy="1844040"/>
+                            <a:ext cx="6120130" cy="1384300"/>
                           </a:xfrm>
                           <a:prstGeom prst="rect">
                             <a:avLst/>
@@ -10512,21 +10667,18 @@
               <w:cnfStyle w:val="000000100000" w:firstRow="0" w:lastRow="0" w:firstColumn="0" w:lastColumn="0" w:oddVBand="0" w:evenVBand="0" w:oddHBand="1" w:evenHBand="0" w:firstRowFirstColumn="0" w:firstRowLastColumn="0" w:lastRowFirstColumn="0" w:lastRowLastColumn="0"/>
             </w:pPr>
             <w:r>
-              <w:rPr>
-                <w:highlight w:val="yellow"/>
-              </w:rPr>
               <w:t>&lt;</w:t>
             </w:r>
             <w:r>
-              <w:rPr>
-                <w:highlight w:val="yellow"/>
-              </w:rPr>
-              <w:t>1 de Maio de 20xx</w:t>
-            </w:r>
-            <w:r>
-              <w:rPr>
-                <w:highlight w:val="yellow"/>
-              </w:rPr>
+              <w:t>6</w:t>
+            </w:r>
+            <w:r>
+              <w:t xml:space="preserve"> de Maio de 20</w:t>
+            </w:r>
+            <w:r>
+              <w:t>26</w:t>
+            </w:r>
+            <w:r>
               <w:t>&gt;</w:t>
             </w:r>
           </w:p>
@@ -10548,10 +10700,7 @@
               </w:rPr>
             </w:pPr>
             <w:r>
-              <w:rPr>
-                <w:highlight w:val="yellow"/>
-              </w:rPr>
-              <w:t>&lt;nome do membro 1 da equipa&gt;</w:t>
+              <w:t>Thomaz</w:t>
             </w:r>
           </w:p>
           <w:p>
@@ -10574,7 +10723,7 @@
                 <w:bCs w:val="0"/>
                 <w:u w:val="single"/>
               </w:rPr>
-              <w:t>O que fez na semana anterior</w:t>
+              <w:t>O que vai fazer esta semana</w:t>
             </w:r>
             <w:r>
               <w:rPr>
@@ -10582,6 +10731,72 @@
                 <w:bCs w:val="0"/>
               </w:rPr>
               <w:t xml:space="preserve">: </w:t>
+            </w:r>
+          </w:p>
+          <w:p>
+            <w:pPr>
+              <w:pStyle w:val="ListParagraph"/>
+              <w:numPr>
+                <w:ilvl w:val="2"/>
+                <w:numId w:val="33"/>
+              </w:numPr>
+              <w:contextualSpacing w:val="0"/>
+              <w:jc w:val="left"/>
+              <w:rPr>
+                <w:b w:val="0"/>
+                <w:bCs w:val="0"/>
+              </w:rPr>
+            </w:pPr>
+            <w:r>
+              <w:rPr>
+                <w:b w:val="0"/>
+                <w:bCs w:val="0"/>
+              </w:rPr>
+              <w:t>Criação do GitHub para o projeto</w:t>
+            </w:r>
+          </w:p>
+          <w:p>
+            <w:pPr>
+              <w:pStyle w:val="ListParagraph"/>
+              <w:numPr>
+                <w:ilvl w:val="2"/>
+                <w:numId w:val="33"/>
+              </w:numPr>
+              <w:contextualSpacing w:val="0"/>
+              <w:jc w:val="left"/>
+              <w:rPr>
+                <w:b w:val="0"/>
+                <w:bCs w:val="0"/>
+              </w:rPr>
+            </w:pPr>
+            <w:r>
+              <w:rPr>
+                <w:b w:val="0"/>
+                <w:bCs w:val="0"/>
+              </w:rPr>
+              <w:t xml:space="preserve">Criação das User Stories e dos respetivos critérios de aceitação </w:t>
+            </w:r>
+          </w:p>
+          <w:p>
+            <w:pPr>
+              <w:pStyle w:val="ListParagraph"/>
+              <w:numPr>
+                <w:ilvl w:val="2"/>
+                <w:numId w:val="33"/>
+              </w:numPr>
+              <w:contextualSpacing w:val="0"/>
+              <w:jc w:val="left"/>
+              <w:rPr>
+                <w:b w:val="0"/>
+                <w:bCs w:val="0"/>
+              </w:rPr>
+            </w:pPr>
+            <w:r>
+              <w:rPr>
+                <w:b w:val="0"/>
+                <w:bCs w:val="0"/>
+              </w:rPr>
+              <w:t>Desenvolvimento da estrutura base do projeto</w:t>
             </w:r>
           </w:p>
           <w:p>
@@ -10604,22 +10819,29 @@
                 <w:bCs w:val="0"/>
                 <w:u w:val="single"/>
               </w:rPr>
-              <w:t>O que vai fazer esta semana</w:t>
-            </w:r>
-            <w:r>
-              <w:rPr>
-                <w:b w:val="0"/>
-                <w:bCs w:val="0"/>
-              </w:rPr>
-              <w:t xml:space="preserve">: </w:t>
+              <w:t>Dificuldades que prevê</w:t>
+            </w:r>
+            <w:r>
+              <w:rPr>
+                <w:b w:val="0"/>
+                <w:bCs w:val="0"/>
+              </w:rPr>
+              <w:t>:</w:t>
+            </w:r>
+            <w:r>
+              <w:rPr>
+                <w:b w:val="0"/>
+                <w:bCs w:val="0"/>
+              </w:rPr>
+              <w:t xml:space="preserve"> </w:t>
             </w:r>
           </w:p>
           <w:p>
             <w:pPr>
               <w:pStyle w:val="ListParagraph"/>
               <w:numPr>
-                <w:ilvl w:val="0"/>
-                <w:numId w:val="12"/>
+                <w:ilvl w:val="2"/>
+                <w:numId w:val="34"/>
               </w:numPr>
               <w:contextualSpacing w:val="0"/>
               <w:jc w:val="left"/>
@@ -10632,16 +10854,8 @@
               <w:rPr>
                 <w:b w:val="0"/>
                 <w:bCs w:val="0"/>
-                <w:u w:val="single"/>
-              </w:rPr>
-              <w:t>Dificuldades que prevê</w:t>
-            </w:r>
-            <w:r>
-              <w:rPr>
-                <w:b w:val="0"/>
-                <w:bCs w:val="0"/>
-              </w:rPr>
-              <w:t>:</w:t>
+              </w:rPr>
+              <w:t>(nada)</w:t>
             </w:r>
           </w:p>
           <w:p>
@@ -10652,11 +10866,22 @@
                 <w:bCs w:val="0"/>
               </w:rPr>
             </w:pPr>
-            <w:r>
-              <w:rPr>
-                <w:highlight w:val="yellow"/>
-              </w:rPr>
-              <w:t>&lt;nome do membro 2 da equipa&gt;</w:t>
+          </w:p>
+          <w:p>
+            <w:pPr>
+              <w:jc w:val="left"/>
+            </w:pPr>
+          </w:p>
+          <w:p>
+            <w:pPr>
+              <w:jc w:val="left"/>
+              <w:rPr>
+                <w:b w:val="0"/>
+                <w:bCs w:val="0"/>
+              </w:rPr>
+            </w:pPr>
+            <w:r>
+              <w:t>Paulo</w:t>
             </w:r>
           </w:p>
           <w:p>
@@ -10679,14 +10904,80 @@
                 <w:bCs w:val="0"/>
                 <w:u w:val="single"/>
               </w:rPr>
-              <w:t>O que fez na semana anterior</w:t>
-            </w:r>
-            <w:r>
-              <w:rPr>
-                <w:b w:val="0"/>
-                <w:bCs w:val="0"/>
-              </w:rPr>
-              <w:t xml:space="preserve">: </w:t>
+              <w:t>O que vai fazer esta semana</w:t>
+            </w:r>
+            <w:r>
+              <w:rPr>
+                <w:b w:val="0"/>
+                <w:bCs w:val="0"/>
+              </w:rPr>
+              <w:t>:</w:t>
+            </w:r>
+          </w:p>
+          <w:p>
+            <w:pPr>
+              <w:pStyle w:val="ListParagraph"/>
+              <w:numPr>
+                <w:ilvl w:val="2"/>
+                <w:numId w:val="34"/>
+              </w:numPr>
+              <w:contextualSpacing w:val="0"/>
+              <w:jc w:val="left"/>
+              <w:rPr>
+                <w:b w:val="0"/>
+                <w:bCs w:val="0"/>
+              </w:rPr>
+            </w:pPr>
+            <w:r>
+              <w:rPr>
+                <w:b w:val="0"/>
+                <w:bCs w:val="0"/>
+              </w:rPr>
+              <w:t>Criação do Diagrama de Classes</w:t>
+            </w:r>
+          </w:p>
+          <w:p>
+            <w:pPr>
+              <w:pStyle w:val="ListParagraph"/>
+              <w:numPr>
+                <w:ilvl w:val="2"/>
+                <w:numId w:val="34"/>
+              </w:numPr>
+              <w:contextualSpacing w:val="0"/>
+              <w:jc w:val="left"/>
+              <w:rPr>
+                <w:b w:val="0"/>
+                <w:bCs w:val="0"/>
+              </w:rPr>
+            </w:pPr>
+            <w:r>
+              <w:rPr>
+                <w:b w:val="0"/>
+                <w:bCs w:val="0"/>
+              </w:rPr>
+              <w:t>Implementação da Base de Dados</w:t>
+            </w:r>
+          </w:p>
+          <w:p>
+            <w:pPr>
+              <w:pStyle w:val="ListParagraph"/>
+              <w:numPr>
+                <w:ilvl w:val="2"/>
+                <w:numId w:val="34"/>
+              </w:numPr>
+              <w:contextualSpacing w:val="0"/>
+              <w:jc w:val="left"/>
+              <w:rPr>
+                <w:b w:val="0"/>
+                <w:bCs w:val="0"/>
+              </w:rPr>
+            </w:pPr>
+            <w:r>
+              <w:rPr>
+                <w:b w:val="0"/>
+                <w:bCs w:val="0"/>
+              </w:rPr>
+              <w:t>Desenvolvimento da estrutura base do projeto</w:t>
             </w:r>
           </w:p>
           <w:p>
@@ -10709,8 +11000,7 @@
                 <w:bCs w:val="0"/>
                 <w:u w:val="single"/>
               </w:rPr>
-              <w:lastRenderedPageBreak/>
-              <w:t>O que vai fazer esta semana</w:t>
+              <w:t>Dificuldades que prevê</w:t>
             </w:r>
             <w:r>
               <w:rPr>
@@ -10724,8 +11014,8 @@
             <w:pPr>
               <w:pStyle w:val="ListParagraph"/>
               <w:numPr>
-                <w:ilvl w:val="0"/>
-                <w:numId w:val="13"/>
+                <w:ilvl w:val="2"/>
+                <w:numId w:val="35"/>
               </w:numPr>
               <w:contextualSpacing w:val="0"/>
               <w:jc w:val="left"/>
@@ -10738,16 +11028,8 @@
               <w:rPr>
                 <w:b w:val="0"/>
                 <w:bCs w:val="0"/>
-                <w:u w:val="single"/>
-              </w:rPr>
-              <w:t>Dificuldades que prevê</w:t>
-            </w:r>
-            <w:r>
-              <w:rPr>
-                <w:b w:val="0"/>
-                <w:bCs w:val="0"/>
-              </w:rPr>
-              <w:t>:</w:t>
+              </w:rPr>
+              <w:t>(nada)</w:t>
             </w:r>
           </w:p>
           <w:p>
@@ -10759,10 +11041,7 @@
               </w:rPr>
             </w:pPr>
             <w:r>
-              <w:rPr>
-                <w:highlight w:val="yellow"/>
-              </w:rPr>
-              <w:t>&lt;nome do membro 3 da equipa&gt;</w:t>
+              <w:t>Artur</w:t>
             </w:r>
           </w:p>
           <w:p>
@@ -11522,6 +11801,7 @@
                 <w:bCs w:val="0"/>
                 <w:highlight w:val="yellow"/>
               </w:rPr>
+              <w:lastRenderedPageBreak/>
               <w:t>&lt;</w:t>
             </w:r>
             <w:r>
@@ -11554,7 +11834,6 @@
               <w:rPr>
                 <w:noProof/>
               </w:rPr>
-              <w:lastRenderedPageBreak/>
               <w:drawing>
                 <wp:inline distT="0" distB="0" distL="0" distR="0" wp14:anchorId="16694A60" wp14:editId="605708C2">
                   <wp:extent cx="6120130" cy="6272530"/>
@@ -11769,6 +12048,7 @@
                 <w:i/>
                 <w:iCs/>
               </w:rPr>
+              <w:lastRenderedPageBreak/>
               <w:t>Sprint Backlog</w:t>
             </w:r>
             <w:r>
@@ -12663,6 +12943,7 @@
         <w:pStyle w:val="Heading4"/>
       </w:pPr>
       <w:r>
+        <w:lastRenderedPageBreak/>
         <w:t>Sprint Retrospective</w:t>
       </w:r>
     </w:p>
@@ -12729,7 +13010,6 @@
               </w:rPr>
             </w:pPr>
             <w:r>
-              <w:lastRenderedPageBreak/>
               <w:t>Data:</w:t>
             </w:r>
           </w:p>
@@ -13569,6 +13849,7 @@
                 <w:bCs w:val="0"/>
                 <w:u w:val="single"/>
               </w:rPr>
+              <w:lastRenderedPageBreak/>
               <w:t>Dificuldades que prevê</w:t>
             </w:r>
             <w:r>
@@ -13645,7 +13926,6 @@
               </w:rPr>
             </w:pPr>
             <w:r>
-              <w:lastRenderedPageBreak/>
               <w:t>Data:</w:t>
             </w:r>
           </w:p>
@@ -14437,6 +14717,7 @@
                 <w:b w:val="0"/>
                 <w:bCs w:val="0"/>
               </w:rPr>
+              <w:lastRenderedPageBreak/>
               <w:t>...</w:t>
             </w:r>
           </w:p>
@@ -14504,7 +14785,6 @@
                 <w:iCs/>
                 <w:lang w:val="en-US"/>
               </w:rPr>
-              <w:lastRenderedPageBreak/>
               <w:t>Things that could have gone better</w:t>
             </w:r>
           </w:p>
@@ -15459,10 +15739,7 @@
               <w:t xml:space="preserve">                                                            </w:t>
             </w:r>
             <w:r>
-              <w:t xml:space="preserve">              </w:t>
-            </w:r>
-            <w:r>
-              <w:t xml:space="preserve">Página </w:t>
+              <w:t xml:space="preserve">              Página </w:t>
             </w:r>
             <w:r>
               <w:rPr>
@@ -15793,6 +16070,119 @@
     </w:lvl>
   </w:abstractNum>
   <w:abstractNum w:abstractNumId="2" w15:restartNumberingAfterBreak="0">
+    <w:nsid w:val="08F0154E"/>
+    <w:multiLevelType w:val="multilevel"/>
+    <w:tmpl w:val="08090021"/>
+    <w:lvl w:ilvl="0">
+      <w:start w:val="1"/>
+      <w:numFmt w:val="bullet"/>
+      <w:lvlText w:val=""/>
+      <w:lvlJc w:val="left"/>
+      <w:pPr>
+        <w:ind w:left="360" w:hanging="360"/>
+      </w:pPr>
+      <w:rPr>
+        <w:rFonts w:ascii="Wingdings" w:hAnsi="Wingdings" w:hint="default"/>
+      </w:rPr>
+    </w:lvl>
+    <w:lvl w:ilvl="1">
+      <w:start w:val="1"/>
+      <w:numFmt w:val="bullet"/>
+      <w:lvlText w:val=""/>
+      <w:lvlJc w:val="left"/>
+      <w:pPr>
+        <w:ind w:left="720" w:hanging="360"/>
+      </w:pPr>
+      <w:rPr>
+        <w:rFonts w:ascii="Wingdings" w:hAnsi="Wingdings" w:hint="default"/>
+      </w:rPr>
+    </w:lvl>
+    <w:lvl w:ilvl="2">
+      <w:start w:val="1"/>
+      <w:numFmt w:val="bullet"/>
+      <w:lvlText w:val=""/>
+      <w:lvlJc w:val="left"/>
+      <w:pPr>
+        <w:ind w:left="1080" w:hanging="360"/>
+      </w:pPr>
+      <w:rPr>
+        <w:rFonts w:ascii="Wingdings" w:hAnsi="Wingdings" w:hint="default"/>
+      </w:rPr>
+    </w:lvl>
+    <w:lvl w:ilvl="3">
+      <w:start w:val="1"/>
+      <w:numFmt w:val="bullet"/>
+      <w:lvlText w:val=""/>
+      <w:lvlJc w:val="left"/>
+      <w:pPr>
+        <w:ind w:left="1440" w:hanging="360"/>
+      </w:pPr>
+      <w:rPr>
+        <w:rFonts w:ascii="Symbol" w:hAnsi="Symbol" w:hint="default"/>
+      </w:rPr>
+    </w:lvl>
+    <w:lvl w:ilvl="4">
+      <w:start w:val="1"/>
+      <w:numFmt w:val="bullet"/>
+      <w:lvlText w:val=""/>
+      <w:lvlJc w:val="left"/>
+      <w:pPr>
+        <w:ind w:left="1800" w:hanging="360"/>
+      </w:pPr>
+      <w:rPr>
+        <w:rFonts w:ascii="Symbol" w:hAnsi="Symbol" w:hint="default"/>
+      </w:rPr>
+    </w:lvl>
+    <w:lvl w:ilvl="5">
+      <w:start w:val="1"/>
+      <w:numFmt w:val="bullet"/>
+      <w:lvlText w:val=""/>
+      <w:lvlJc w:val="left"/>
+      <w:pPr>
+        <w:ind w:left="2160" w:hanging="360"/>
+      </w:pPr>
+      <w:rPr>
+        <w:rFonts w:ascii="Wingdings" w:hAnsi="Wingdings" w:hint="default"/>
+      </w:rPr>
+    </w:lvl>
+    <w:lvl w:ilvl="6">
+      <w:start w:val="1"/>
+      <w:numFmt w:val="bullet"/>
+      <w:lvlText w:val=""/>
+      <w:lvlJc w:val="left"/>
+      <w:pPr>
+        <w:ind w:left="2520" w:hanging="360"/>
+      </w:pPr>
+      <w:rPr>
+        <w:rFonts w:ascii="Wingdings" w:hAnsi="Wingdings" w:hint="default"/>
+      </w:rPr>
+    </w:lvl>
+    <w:lvl w:ilvl="7">
+      <w:start w:val="1"/>
+      <w:numFmt w:val="bullet"/>
+      <w:lvlText w:val=""/>
+      <w:lvlJc w:val="left"/>
+      <w:pPr>
+        <w:ind w:left="2880" w:hanging="360"/>
+      </w:pPr>
+      <w:rPr>
+        <w:rFonts w:ascii="Symbol" w:hAnsi="Symbol" w:hint="default"/>
+      </w:rPr>
+    </w:lvl>
+    <w:lvl w:ilvl="8">
+      <w:start w:val="1"/>
+      <w:numFmt w:val="bullet"/>
+      <w:lvlText w:val=""/>
+      <w:lvlJc w:val="left"/>
+      <w:pPr>
+        <w:ind w:left="3240" w:hanging="360"/>
+      </w:pPr>
+      <w:rPr>
+        <w:rFonts w:ascii="Symbol" w:hAnsi="Symbol" w:hint="default"/>
+      </w:rPr>
+    </w:lvl>
+  </w:abstractNum>
+  <w:abstractNum w:abstractNumId="3" w15:restartNumberingAfterBreak="0">
     <w:nsid w:val="0EB27552"/>
     <w:multiLevelType w:val="hybridMultilevel"/>
     <w:tmpl w:val="37483E94"/>
@@ -15881,7 +16271,7 @@
       </w:pPr>
     </w:lvl>
   </w:abstractNum>
-  <w:abstractNum w:abstractNumId="3" w15:restartNumberingAfterBreak="0">
+  <w:abstractNum w:abstractNumId="4" w15:restartNumberingAfterBreak="0">
     <w:nsid w:val="19F57BF9"/>
     <w:multiLevelType w:val="hybridMultilevel"/>
     <w:tmpl w:val="C01A2A7E"/>
@@ -15970,7 +16360,7 @@
       </w:pPr>
     </w:lvl>
   </w:abstractNum>
-  <w:abstractNum w:abstractNumId="4" w15:restartNumberingAfterBreak="0">
+  <w:abstractNum w:abstractNumId="5" w15:restartNumberingAfterBreak="0">
     <w:nsid w:val="1A4E5D5E"/>
     <w:multiLevelType w:val="hybridMultilevel"/>
     <w:tmpl w:val="58900FF8"/>
@@ -16083,7 +16473,7 @@
       </w:rPr>
     </w:lvl>
   </w:abstractNum>
-  <w:abstractNum w:abstractNumId="5" w15:restartNumberingAfterBreak="0">
+  <w:abstractNum w:abstractNumId="6" w15:restartNumberingAfterBreak="0">
     <w:nsid w:val="1AF142CE"/>
     <w:multiLevelType w:val="hybridMultilevel"/>
     <w:tmpl w:val="77486102"/>
@@ -16196,7 +16586,7 @@
       </w:rPr>
     </w:lvl>
   </w:abstractNum>
-  <w:abstractNum w:abstractNumId="6" w15:restartNumberingAfterBreak="0">
+  <w:abstractNum w:abstractNumId="7" w15:restartNumberingAfterBreak="0">
     <w:nsid w:val="206323D3"/>
     <w:multiLevelType w:val="hybridMultilevel"/>
     <w:tmpl w:val="2B3858E4"/>
@@ -16309,7 +16699,7 @@
       </w:rPr>
     </w:lvl>
   </w:abstractNum>
-  <w:abstractNum w:abstractNumId="7" w15:restartNumberingAfterBreak="0">
+  <w:abstractNum w:abstractNumId="8" w15:restartNumberingAfterBreak="0">
     <w:nsid w:val="26926937"/>
     <w:multiLevelType w:val="hybridMultilevel"/>
     <w:tmpl w:val="73AAB580"/>
@@ -16422,7 +16812,120 @@
       </w:rPr>
     </w:lvl>
   </w:abstractNum>
-  <w:abstractNum w:abstractNumId="8" w15:restartNumberingAfterBreak="0">
+  <w:abstractNum w:abstractNumId="9" w15:restartNumberingAfterBreak="0">
+    <w:nsid w:val="29892485"/>
+    <w:multiLevelType w:val="multilevel"/>
+    <w:tmpl w:val="08090021"/>
+    <w:lvl w:ilvl="0">
+      <w:start w:val="1"/>
+      <w:numFmt w:val="bullet"/>
+      <w:lvlText w:val=""/>
+      <w:lvlJc w:val="left"/>
+      <w:pPr>
+        <w:ind w:left="360" w:hanging="360"/>
+      </w:pPr>
+      <w:rPr>
+        <w:rFonts w:ascii="Wingdings" w:hAnsi="Wingdings" w:hint="default"/>
+      </w:rPr>
+    </w:lvl>
+    <w:lvl w:ilvl="1">
+      <w:start w:val="1"/>
+      <w:numFmt w:val="bullet"/>
+      <w:lvlText w:val=""/>
+      <w:lvlJc w:val="left"/>
+      <w:pPr>
+        <w:ind w:left="720" w:hanging="360"/>
+      </w:pPr>
+      <w:rPr>
+        <w:rFonts w:ascii="Wingdings" w:hAnsi="Wingdings" w:hint="default"/>
+      </w:rPr>
+    </w:lvl>
+    <w:lvl w:ilvl="2">
+      <w:start w:val="1"/>
+      <w:numFmt w:val="bullet"/>
+      <w:lvlText w:val=""/>
+      <w:lvlJc w:val="left"/>
+      <w:pPr>
+        <w:ind w:left="1080" w:hanging="360"/>
+      </w:pPr>
+      <w:rPr>
+        <w:rFonts w:ascii="Wingdings" w:hAnsi="Wingdings" w:hint="default"/>
+      </w:rPr>
+    </w:lvl>
+    <w:lvl w:ilvl="3">
+      <w:start w:val="1"/>
+      <w:numFmt w:val="bullet"/>
+      <w:lvlText w:val=""/>
+      <w:lvlJc w:val="left"/>
+      <w:pPr>
+        <w:ind w:left="1440" w:hanging="360"/>
+      </w:pPr>
+      <w:rPr>
+        <w:rFonts w:ascii="Symbol" w:hAnsi="Symbol" w:hint="default"/>
+      </w:rPr>
+    </w:lvl>
+    <w:lvl w:ilvl="4">
+      <w:start w:val="1"/>
+      <w:numFmt w:val="bullet"/>
+      <w:lvlText w:val=""/>
+      <w:lvlJc w:val="left"/>
+      <w:pPr>
+        <w:ind w:left="1800" w:hanging="360"/>
+      </w:pPr>
+      <w:rPr>
+        <w:rFonts w:ascii="Symbol" w:hAnsi="Symbol" w:hint="default"/>
+      </w:rPr>
+    </w:lvl>
+    <w:lvl w:ilvl="5">
+      <w:start w:val="1"/>
+      <w:numFmt w:val="bullet"/>
+      <w:lvlText w:val=""/>
+      <w:lvlJc w:val="left"/>
+      <w:pPr>
+        <w:ind w:left="2160" w:hanging="360"/>
+      </w:pPr>
+      <w:rPr>
+        <w:rFonts w:ascii="Wingdings" w:hAnsi="Wingdings" w:hint="default"/>
+      </w:rPr>
+    </w:lvl>
+    <w:lvl w:ilvl="6">
+      <w:start w:val="1"/>
+      <w:numFmt w:val="bullet"/>
+      <w:lvlText w:val=""/>
+      <w:lvlJc w:val="left"/>
+      <w:pPr>
+        <w:ind w:left="2520" w:hanging="360"/>
+      </w:pPr>
+      <w:rPr>
+        <w:rFonts w:ascii="Wingdings" w:hAnsi="Wingdings" w:hint="default"/>
+      </w:rPr>
+    </w:lvl>
+    <w:lvl w:ilvl="7">
+      <w:start w:val="1"/>
+      <w:numFmt w:val="bullet"/>
+      <w:lvlText w:val=""/>
+      <w:lvlJc w:val="left"/>
+      <w:pPr>
+        <w:ind w:left="2880" w:hanging="360"/>
+      </w:pPr>
+      <w:rPr>
+        <w:rFonts w:ascii="Symbol" w:hAnsi="Symbol" w:hint="default"/>
+      </w:rPr>
+    </w:lvl>
+    <w:lvl w:ilvl="8">
+      <w:start w:val="1"/>
+      <w:numFmt w:val="bullet"/>
+      <w:lvlText w:val=""/>
+      <w:lvlJc w:val="left"/>
+      <w:pPr>
+        <w:ind w:left="3240" w:hanging="360"/>
+      </w:pPr>
+      <w:rPr>
+        <w:rFonts w:ascii="Symbol" w:hAnsi="Symbol" w:hint="default"/>
+      </w:rPr>
+    </w:lvl>
+  </w:abstractNum>
+  <w:abstractNum w:abstractNumId="10" w15:restartNumberingAfterBreak="0">
     <w:nsid w:val="2CA167CF"/>
     <w:multiLevelType w:val="hybridMultilevel"/>
     <w:tmpl w:val="95C2C98A"/>
@@ -16511,7 +17014,7 @@
       </w:pPr>
     </w:lvl>
   </w:abstractNum>
-  <w:abstractNum w:abstractNumId="9" w15:restartNumberingAfterBreak="0">
+  <w:abstractNum w:abstractNumId="11" w15:restartNumberingAfterBreak="0">
     <w:nsid w:val="2CDD5DDE"/>
     <w:multiLevelType w:val="hybridMultilevel"/>
     <w:tmpl w:val="D27C5AB2"/>
@@ -16600,7 +17103,7 @@
       </w:pPr>
     </w:lvl>
   </w:abstractNum>
-  <w:abstractNum w:abstractNumId="10" w15:restartNumberingAfterBreak="0">
+  <w:abstractNum w:abstractNumId="12" w15:restartNumberingAfterBreak="0">
     <w:nsid w:val="2DB951C3"/>
     <w:multiLevelType w:val="hybridMultilevel"/>
     <w:tmpl w:val="F2006FAA"/>
@@ -16689,7 +17192,7 @@
       </w:pPr>
     </w:lvl>
   </w:abstractNum>
-  <w:abstractNum w:abstractNumId="11" w15:restartNumberingAfterBreak="0">
+  <w:abstractNum w:abstractNumId="13" w15:restartNumberingAfterBreak="0">
     <w:nsid w:val="2FC009C9"/>
     <w:multiLevelType w:val="hybridMultilevel"/>
     <w:tmpl w:val="4A70404A"/>
@@ -16802,7 +17305,7 @@
       </w:rPr>
     </w:lvl>
   </w:abstractNum>
-  <w:abstractNum w:abstractNumId="12" w15:restartNumberingAfterBreak="0">
+  <w:abstractNum w:abstractNumId="14" w15:restartNumberingAfterBreak="0">
     <w:nsid w:val="343474E4"/>
     <w:multiLevelType w:val="hybridMultilevel"/>
     <w:tmpl w:val="4EB4A474"/>
@@ -16915,7 +17418,7 @@
       </w:rPr>
     </w:lvl>
   </w:abstractNum>
-  <w:abstractNum w:abstractNumId="13" w15:restartNumberingAfterBreak="0">
+  <w:abstractNum w:abstractNumId="15" w15:restartNumberingAfterBreak="0">
     <w:nsid w:val="35250DC6"/>
     <w:multiLevelType w:val="hybridMultilevel"/>
     <w:tmpl w:val="1B2E197C"/>
@@ -17028,7 +17531,7 @@
       </w:rPr>
     </w:lvl>
   </w:abstractNum>
-  <w:abstractNum w:abstractNumId="14" w15:restartNumberingAfterBreak="0">
+  <w:abstractNum w:abstractNumId="16" w15:restartNumberingAfterBreak="0">
     <w:nsid w:val="3D7F006E"/>
     <w:multiLevelType w:val="hybridMultilevel"/>
     <w:tmpl w:val="32DC94D4"/>
@@ -17117,7 +17620,7 @@
       </w:pPr>
     </w:lvl>
   </w:abstractNum>
-  <w:abstractNum w:abstractNumId="15" w15:restartNumberingAfterBreak="0">
+  <w:abstractNum w:abstractNumId="17" w15:restartNumberingAfterBreak="0">
     <w:nsid w:val="40AA07A1"/>
     <w:multiLevelType w:val="multilevel"/>
     <w:tmpl w:val="7E68E422"/>
@@ -17231,7 +17734,7 @@
       </w:rPr>
     </w:lvl>
   </w:abstractNum>
-  <w:abstractNum w:abstractNumId="16" w15:restartNumberingAfterBreak="0">
+  <w:abstractNum w:abstractNumId="18" w15:restartNumberingAfterBreak="0">
     <w:nsid w:val="42724513"/>
     <w:multiLevelType w:val="hybridMultilevel"/>
     <w:tmpl w:val="3932B1AC"/>
@@ -17344,7 +17847,7 @@
       </w:rPr>
     </w:lvl>
   </w:abstractNum>
-  <w:abstractNum w:abstractNumId="17" w15:restartNumberingAfterBreak="0">
+  <w:abstractNum w:abstractNumId="19" w15:restartNumberingAfterBreak="0">
     <w:nsid w:val="4C494EAF"/>
     <w:multiLevelType w:val="hybridMultilevel"/>
     <w:tmpl w:val="BE0204BC"/>
@@ -17433,7 +17936,7 @@
       </w:pPr>
     </w:lvl>
   </w:abstractNum>
-  <w:abstractNum w:abstractNumId="18" w15:restartNumberingAfterBreak="0">
+  <w:abstractNum w:abstractNumId="20" w15:restartNumberingAfterBreak="0">
     <w:nsid w:val="4E085877"/>
     <w:multiLevelType w:val="hybridMultilevel"/>
     <w:tmpl w:val="4E8E2FB6"/>
@@ -17546,7 +18049,7 @@
       </w:rPr>
     </w:lvl>
   </w:abstractNum>
-  <w:abstractNum w:abstractNumId="19" w15:restartNumberingAfterBreak="0">
+  <w:abstractNum w:abstractNumId="21" w15:restartNumberingAfterBreak="0">
     <w:nsid w:val="56A245CA"/>
     <w:multiLevelType w:val="hybridMultilevel"/>
     <w:tmpl w:val="266ECFCC"/>
@@ -17659,7 +18162,7 @@
       </w:rPr>
     </w:lvl>
   </w:abstractNum>
-  <w:abstractNum w:abstractNumId="20" w15:restartNumberingAfterBreak="0">
+  <w:abstractNum w:abstractNumId="22" w15:restartNumberingAfterBreak="0">
     <w:nsid w:val="56F8252E"/>
     <w:multiLevelType w:val="multilevel"/>
     <w:tmpl w:val="5FFCA586"/>
@@ -17754,7 +18257,7 @@
       </w:pPr>
     </w:lvl>
   </w:abstractNum>
-  <w:abstractNum w:abstractNumId="21" w15:restartNumberingAfterBreak="0">
+  <w:abstractNum w:abstractNumId="23" w15:restartNumberingAfterBreak="0">
     <w:nsid w:val="57727338"/>
     <w:multiLevelType w:val="hybridMultilevel"/>
     <w:tmpl w:val="F72850BA"/>
@@ -17867,7 +18370,7 @@
       </w:rPr>
     </w:lvl>
   </w:abstractNum>
-  <w:abstractNum w:abstractNumId="22" w15:restartNumberingAfterBreak="0">
+  <w:abstractNum w:abstractNumId="24" w15:restartNumberingAfterBreak="0">
     <w:nsid w:val="5B0F18B6"/>
     <w:multiLevelType w:val="hybridMultilevel"/>
     <w:tmpl w:val="4D181508"/>
@@ -17980,7 +18483,7 @@
       </w:rPr>
     </w:lvl>
   </w:abstractNum>
-  <w:abstractNum w:abstractNumId="23" w15:restartNumberingAfterBreak="0">
+  <w:abstractNum w:abstractNumId="25" w15:restartNumberingAfterBreak="0">
     <w:nsid w:val="5B7F5424"/>
     <w:multiLevelType w:val="hybridMultilevel"/>
     <w:tmpl w:val="2F08BE48"/>
@@ -18068,7 +18571,7 @@
       </w:pPr>
     </w:lvl>
   </w:abstractNum>
-  <w:abstractNum w:abstractNumId="24" w15:restartNumberingAfterBreak="0">
+  <w:abstractNum w:abstractNumId="26" w15:restartNumberingAfterBreak="0">
     <w:nsid w:val="5C7F40B6"/>
     <w:multiLevelType w:val="hybridMultilevel"/>
     <w:tmpl w:val="7E642F88"/>
@@ -18181,7 +18684,7 @@
       </w:rPr>
     </w:lvl>
   </w:abstractNum>
-  <w:abstractNum w:abstractNumId="25" w15:restartNumberingAfterBreak="0">
+  <w:abstractNum w:abstractNumId="27" w15:restartNumberingAfterBreak="0">
     <w:nsid w:val="62314B0E"/>
     <w:multiLevelType w:val="hybridMultilevel"/>
     <w:tmpl w:val="1E50642C"/>
@@ -18267,7 +18770,7 @@
       </w:pPr>
     </w:lvl>
   </w:abstractNum>
-  <w:abstractNum w:abstractNumId="26" w15:restartNumberingAfterBreak="0">
+  <w:abstractNum w:abstractNumId="28" w15:restartNumberingAfterBreak="0">
     <w:nsid w:val="6C750030"/>
     <w:multiLevelType w:val="hybridMultilevel"/>
     <w:tmpl w:val="B6D0BC3E"/>
@@ -18356,7 +18859,7 @@
       </w:pPr>
     </w:lvl>
   </w:abstractNum>
-  <w:abstractNum w:abstractNumId="27" w15:restartNumberingAfterBreak="0">
+  <w:abstractNum w:abstractNumId="29" w15:restartNumberingAfterBreak="0">
     <w:nsid w:val="6FB25278"/>
     <w:multiLevelType w:val="hybridMultilevel"/>
     <w:tmpl w:val="36B06160"/>
@@ -18469,7 +18972,120 @@
       </w:rPr>
     </w:lvl>
   </w:abstractNum>
-  <w:abstractNum w:abstractNumId="28" w15:restartNumberingAfterBreak="0">
+  <w:abstractNum w:abstractNumId="30" w15:restartNumberingAfterBreak="0">
+    <w:nsid w:val="774F5FAF"/>
+    <w:multiLevelType w:val="multilevel"/>
+    <w:tmpl w:val="08090021"/>
+    <w:lvl w:ilvl="0">
+      <w:start w:val="1"/>
+      <w:numFmt w:val="bullet"/>
+      <w:lvlText w:val=""/>
+      <w:lvlJc w:val="left"/>
+      <w:pPr>
+        <w:ind w:left="360" w:hanging="360"/>
+      </w:pPr>
+      <w:rPr>
+        <w:rFonts w:ascii="Wingdings" w:hAnsi="Wingdings" w:hint="default"/>
+      </w:rPr>
+    </w:lvl>
+    <w:lvl w:ilvl="1">
+      <w:start w:val="1"/>
+      <w:numFmt w:val="bullet"/>
+      <w:lvlText w:val=""/>
+      <w:lvlJc w:val="left"/>
+      <w:pPr>
+        <w:ind w:left="720" w:hanging="360"/>
+      </w:pPr>
+      <w:rPr>
+        <w:rFonts w:ascii="Wingdings" w:hAnsi="Wingdings" w:hint="default"/>
+      </w:rPr>
+    </w:lvl>
+    <w:lvl w:ilvl="2">
+      <w:start w:val="1"/>
+      <w:numFmt w:val="bullet"/>
+      <w:lvlText w:val=""/>
+      <w:lvlJc w:val="left"/>
+      <w:pPr>
+        <w:ind w:left="1080" w:hanging="360"/>
+      </w:pPr>
+      <w:rPr>
+        <w:rFonts w:ascii="Wingdings" w:hAnsi="Wingdings" w:hint="default"/>
+      </w:rPr>
+    </w:lvl>
+    <w:lvl w:ilvl="3">
+      <w:start w:val="1"/>
+      <w:numFmt w:val="bullet"/>
+      <w:lvlText w:val=""/>
+      <w:lvlJc w:val="left"/>
+      <w:pPr>
+        <w:ind w:left="1440" w:hanging="360"/>
+      </w:pPr>
+      <w:rPr>
+        <w:rFonts w:ascii="Symbol" w:hAnsi="Symbol" w:hint="default"/>
+      </w:rPr>
+    </w:lvl>
+    <w:lvl w:ilvl="4">
+      <w:start w:val="1"/>
+      <w:numFmt w:val="bullet"/>
+      <w:lvlText w:val=""/>
+      <w:lvlJc w:val="left"/>
+      <w:pPr>
+        <w:ind w:left="1800" w:hanging="360"/>
+      </w:pPr>
+      <w:rPr>
+        <w:rFonts w:ascii="Symbol" w:hAnsi="Symbol" w:hint="default"/>
+      </w:rPr>
+    </w:lvl>
+    <w:lvl w:ilvl="5">
+      <w:start w:val="1"/>
+      <w:numFmt w:val="bullet"/>
+      <w:lvlText w:val=""/>
+      <w:lvlJc w:val="left"/>
+      <w:pPr>
+        <w:ind w:left="2160" w:hanging="360"/>
+      </w:pPr>
+      <w:rPr>
+        <w:rFonts w:ascii="Wingdings" w:hAnsi="Wingdings" w:hint="default"/>
+      </w:rPr>
+    </w:lvl>
+    <w:lvl w:ilvl="6">
+      <w:start w:val="1"/>
+      <w:numFmt w:val="bullet"/>
+      <w:lvlText w:val=""/>
+      <w:lvlJc w:val="left"/>
+      <w:pPr>
+        <w:ind w:left="2520" w:hanging="360"/>
+      </w:pPr>
+      <w:rPr>
+        <w:rFonts w:ascii="Wingdings" w:hAnsi="Wingdings" w:hint="default"/>
+      </w:rPr>
+    </w:lvl>
+    <w:lvl w:ilvl="7">
+      <w:start w:val="1"/>
+      <w:numFmt w:val="bullet"/>
+      <w:lvlText w:val=""/>
+      <w:lvlJc w:val="left"/>
+      <w:pPr>
+        <w:ind w:left="2880" w:hanging="360"/>
+      </w:pPr>
+      <w:rPr>
+        <w:rFonts w:ascii="Symbol" w:hAnsi="Symbol" w:hint="default"/>
+      </w:rPr>
+    </w:lvl>
+    <w:lvl w:ilvl="8">
+      <w:start w:val="1"/>
+      <w:numFmt w:val="bullet"/>
+      <w:lvlText w:val=""/>
+      <w:lvlJc w:val="left"/>
+      <w:pPr>
+        <w:ind w:left="3240" w:hanging="360"/>
+      </w:pPr>
+      <w:rPr>
+        <w:rFonts w:ascii="Symbol" w:hAnsi="Symbol" w:hint="default"/>
+      </w:rPr>
+    </w:lvl>
+  </w:abstractNum>
+  <w:abstractNum w:abstractNumId="31" w15:restartNumberingAfterBreak="0">
     <w:nsid w:val="77D44B5A"/>
     <w:multiLevelType w:val="hybridMultilevel"/>
     <w:tmpl w:val="1AA0C640"/>
@@ -18558,7 +19174,7 @@
       </w:pPr>
     </w:lvl>
   </w:abstractNum>
-  <w:abstractNum w:abstractNumId="29" w15:restartNumberingAfterBreak="0">
+  <w:abstractNum w:abstractNumId="32" w15:restartNumberingAfterBreak="0">
     <w:nsid w:val="78633291"/>
     <w:multiLevelType w:val="hybridMultilevel"/>
     <w:tmpl w:val="4E6C0242"/>
@@ -18647,7 +19263,7 @@
       </w:pPr>
     </w:lvl>
   </w:abstractNum>
-  <w:abstractNum w:abstractNumId="30" w15:restartNumberingAfterBreak="0">
+  <w:abstractNum w:abstractNumId="33" w15:restartNumberingAfterBreak="0">
     <w:nsid w:val="7F040BEF"/>
     <w:multiLevelType w:val="hybridMultilevel"/>
     <w:tmpl w:val="F7DEB53A"/>
@@ -18760,7 +19376,7 @@
       </w:rPr>
     </w:lvl>
   </w:abstractNum>
-  <w:abstractNum w:abstractNumId="31" w15:restartNumberingAfterBreak="0">
+  <w:abstractNum w:abstractNumId="34" w15:restartNumberingAfterBreak="0">
     <w:nsid w:val="7F3155BC"/>
     <w:multiLevelType w:val="hybridMultilevel"/>
     <w:tmpl w:val="997CA6F4"/>
@@ -18850,100 +19466,109 @@
     </w:lvl>
   </w:abstractNum>
   <w:num w:numId="1" w16cid:durableId="274945660">
+    <w:abstractNumId w:val="17"/>
+  </w:num>
+  <w:num w:numId="2" w16cid:durableId="540284225">
+    <w:abstractNumId w:val="25"/>
+  </w:num>
+  <w:num w:numId="3" w16cid:durableId="1363434330">
+    <w:abstractNumId w:val="22"/>
+  </w:num>
+  <w:num w:numId="4" w16cid:durableId="968166831">
+    <w:abstractNumId w:val="23"/>
+  </w:num>
+  <w:num w:numId="5" w16cid:durableId="1068652566">
+    <w:abstractNumId w:val="24"/>
+  </w:num>
+  <w:num w:numId="6" w16cid:durableId="1900243924">
+    <w:abstractNumId w:val="6"/>
+  </w:num>
+  <w:num w:numId="7" w16cid:durableId="255401366">
+    <w:abstractNumId w:val="13"/>
+  </w:num>
+  <w:num w:numId="8" w16cid:durableId="574517222">
     <w:abstractNumId w:val="15"/>
   </w:num>
-  <w:num w:numId="2" w16cid:durableId="540284225">
-    <w:abstractNumId w:val="23"/>
+  <w:num w:numId="9" w16cid:durableId="1139999751">
+    <w:abstractNumId w:val="16"/>
   </w:num>
-  <w:num w:numId="3" w16cid:durableId="1363434330">
-    <w:abstractNumId w:val="20"/>
+  <w:num w:numId="10" w16cid:durableId="1586183799">
+    <w:abstractNumId w:val="3"/>
   </w:num>
-  <w:num w:numId="4" w16cid:durableId="968166831">
-    <w:abstractNumId w:val="21"/>
+  <w:num w:numId="11" w16cid:durableId="530845578">
+    <w:abstractNumId w:val="4"/>
   </w:num>
-  <w:num w:numId="5" w16cid:durableId="1068652566">
-    <w:abstractNumId w:val="22"/>
+  <w:num w:numId="12" w16cid:durableId="2096320210">
+    <w:abstractNumId w:val="19"/>
   </w:num>
-  <w:num w:numId="6" w16cid:durableId="1900243924">
-    <w:abstractNumId w:val="5"/>
+  <w:num w:numId="13" w16cid:durableId="692995223">
+    <w:abstractNumId w:val="31"/>
   </w:num>
-  <w:num w:numId="7" w16cid:durableId="255401366">
+  <w:num w:numId="14" w16cid:durableId="741681648">
+    <w:abstractNumId w:val="34"/>
+  </w:num>
+  <w:num w:numId="15" w16cid:durableId="92215374">
+    <w:abstractNumId w:val="12"/>
+  </w:num>
+  <w:num w:numId="16" w16cid:durableId="1175416252">
+    <w:abstractNumId w:val="10"/>
+  </w:num>
+  <w:num w:numId="17" w16cid:durableId="309138382">
     <w:abstractNumId w:val="11"/>
   </w:num>
-  <w:num w:numId="8" w16cid:durableId="574517222">
-    <w:abstractNumId w:val="13"/>
-  </w:num>
-  <w:num w:numId="9" w16cid:durableId="1139999751">
-    <w:abstractNumId w:val="14"/>
-  </w:num>
-  <w:num w:numId="10" w16cid:durableId="1586183799">
-    <w:abstractNumId w:val="2"/>
-  </w:num>
-  <w:num w:numId="11" w16cid:durableId="530845578">
-    <w:abstractNumId w:val="3"/>
-  </w:num>
-  <w:num w:numId="12" w16cid:durableId="2096320210">
-    <w:abstractNumId w:val="17"/>
-  </w:num>
-  <w:num w:numId="13" w16cid:durableId="692995223">
-    <w:abstractNumId w:val="28"/>
-  </w:num>
-  <w:num w:numId="14" w16cid:durableId="741681648">
-    <w:abstractNumId w:val="31"/>
-  </w:num>
-  <w:num w:numId="15" w16cid:durableId="92215374">
-    <w:abstractNumId w:val="10"/>
-  </w:num>
-  <w:num w:numId="16" w16cid:durableId="1175416252">
-    <w:abstractNumId w:val="8"/>
-  </w:num>
-  <w:num w:numId="17" w16cid:durableId="309138382">
-    <w:abstractNumId w:val="9"/>
-  </w:num>
   <w:num w:numId="18" w16cid:durableId="442456630">
-    <w:abstractNumId w:val="29"/>
+    <w:abstractNumId w:val="32"/>
   </w:num>
   <w:num w:numId="19" w16cid:durableId="294411698">
     <w:abstractNumId w:val="0"/>
   </w:num>
   <w:num w:numId="20" w16cid:durableId="1670140064">
+    <w:abstractNumId w:val="28"/>
+  </w:num>
+  <w:num w:numId="21" w16cid:durableId="1813522467">
+    <w:abstractNumId w:val="33"/>
+  </w:num>
+  <w:num w:numId="22" w16cid:durableId="1748569989">
+    <w:abstractNumId w:val="8"/>
+  </w:num>
+  <w:num w:numId="23" w16cid:durableId="659384323">
+    <w:abstractNumId w:val="5"/>
+  </w:num>
+  <w:num w:numId="24" w16cid:durableId="580061708">
+    <w:abstractNumId w:val="7"/>
+  </w:num>
+  <w:num w:numId="25" w16cid:durableId="882903682">
+    <w:abstractNumId w:val="27"/>
+  </w:num>
+  <w:num w:numId="26" w16cid:durableId="578372391">
+    <w:abstractNumId w:val="29"/>
+  </w:num>
+  <w:num w:numId="27" w16cid:durableId="329069439">
+    <w:abstractNumId w:val="20"/>
+  </w:num>
+  <w:num w:numId="28" w16cid:durableId="2078748606">
+    <w:abstractNumId w:val="18"/>
+  </w:num>
+  <w:num w:numId="29" w16cid:durableId="1912888041">
     <w:abstractNumId w:val="26"/>
   </w:num>
-  <w:num w:numId="21" w16cid:durableId="1813522467">
-    <w:abstractNumId w:val="30"/>
-  </w:num>
-  <w:num w:numId="22" w16cid:durableId="1748569989">
-    <w:abstractNumId w:val="7"/>
-  </w:num>
-  <w:num w:numId="23" w16cid:durableId="659384323">
-    <w:abstractNumId w:val="4"/>
-  </w:num>
-  <w:num w:numId="24" w16cid:durableId="580061708">
-    <w:abstractNumId w:val="6"/>
-  </w:num>
-  <w:num w:numId="25" w16cid:durableId="882903682">
-    <w:abstractNumId w:val="25"/>
-  </w:num>
-  <w:num w:numId="26" w16cid:durableId="578372391">
-    <w:abstractNumId w:val="27"/>
-  </w:num>
-  <w:num w:numId="27" w16cid:durableId="329069439">
-    <w:abstractNumId w:val="18"/>
-  </w:num>
-  <w:num w:numId="28" w16cid:durableId="2078748606">
-    <w:abstractNumId w:val="16"/>
-  </w:num>
-  <w:num w:numId="29" w16cid:durableId="1912888041">
-    <w:abstractNumId w:val="24"/>
-  </w:num>
   <w:num w:numId="30" w16cid:durableId="1323699401">
-    <w:abstractNumId w:val="12"/>
+    <w:abstractNumId w:val="14"/>
   </w:num>
   <w:num w:numId="31" w16cid:durableId="730276190">
-    <w:abstractNumId w:val="19"/>
+    <w:abstractNumId w:val="21"/>
   </w:num>
   <w:num w:numId="32" w16cid:durableId="891228587">
     <w:abstractNumId w:val="1"/>
+  </w:num>
+  <w:num w:numId="33" w16cid:durableId="814564883">
+    <w:abstractNumId w:val="30"/>
+  </w:num>
+  <w:num w:numId="34" w16cid:durableId="1944341262">
+    <w:abstractNumId w:val="9"/>
+  </w:num>
+  <w:num w:numId="35" w16cid:durableId="201750736">
+    <w:abstractNumId w:val="2"/>
   </w:num>
   <w:numIdMacAtCleanup w:val="20"/>
 </w:numbering>

</xml_diff>

<commit_message>
Feita a introdução no relatório
</commit_message>
<xml_diff>
--- a/IPL-TeSP-PSI-MDS-2526-Template_Projeto.docx
+++ b/IPL-TeSP-PSI-MDS-2526-Template_Projeto.docx
@@ -765,60 +765,6 @@
             <w:tcBorders>
               <w:top w:val="single" w:sz="4" w:space="0" w:color="FFFFFF" w:themeColor="background1"/>
               <w:left w:val="nil"/>
-              <w:bottom w:val="single" w:sz="4" w:space="0" w:color="FFFFFF" w:themeColor="background1"/>
-              <w:right w:val="nil"/>
-            </w:tcBorders>
-          </w:tcPr>
-          <w:p>
-            <w:pPr>
-              <w:rPr>
-                <w:b/>
-                <w:bCs/>
-              </w:rPr>
-            </w:pPr>
-            <w:r>
-              <w:rPr>
-                <w:b/>
-                <w:bCs/>
-              </w:rPr>
-              <w:t xml:space="preserve">Nº </w:t>
-            </w:r>
-            <w:r>
-              <w:rPr>
-                <w:b/>
-                <w:bCs/>
-              </w:rPr>
-              <w:t>2025179153</w:t>
-            </w:r>
-          </w:p>
-        </w:tc>
-        <w:tc>
-          <w:tcPr>
-            <w:tcW w:w="7512" w:type="dxa"/>
-            <w:tcBorders>
-              <w:top w:val="single" w:sz="4" w:space="0" w:color="FFFFFF" w:themeColor="background1"/>
-              <w:left w:val="nil"/>
-              <w:bottom w:val="single" w:sz="4" w:space="0" w:color="FFFFFF" w:themeColor="background1"/>
-              <w:right w:val="nil"/>
-            </w:tcBorders>
-          </w:tcPr>
-          <w:p>
-            <w:pPr>
-              <w:jc w:val="left"/>
-            </w:pPr>
-            <w:r>
-              <w:t>Paulo Zhang Liu</w:t>
-            </w:r>
-          </w:p>
-        </w:tc>
-      </w:tr>
-      <w:tr>
-        <w:tc>
-          <w:tcPr>
-            <w:tcW w:w="2132" w:type="dxa"/>
-            <w:tcBorders>
-              <w:top w:val="single" w:sz="4" w:space="0" w:color="FFFFFF" w:themeColor="background1"/>
-              <w:left w:val="nil"/>
               <w:bottom w:val="single" w:sz="12" w:space="0" w:color="5B9BD5" w:themeColor="accent1"/>
               <w:right w:val="nil"/>
             </w:tcBorders>
@@ -842,7 +788,7 @@
                 <w:b/>
                 <w:bCs/>
               </w:rPr>
-              <w:t>2025139991</w:t>
+              <w:t>2025179153</w:t>
             </w:r>
           </w:p>
         </w:tc>
@@ -861,7 +807,7 @@
               <w:jc w:val="left"/>
             </w:pPr>
             <w:r>
-              <w:t>Artur Henrique Cesar Antenor</w:t>
+              <w:t>Paulo Zhang Liu</w:t>
             </w:r>
           </w:p>
         </w:tc>
@@ -987,7 +933,7 @@
               <w:sz w:val="24"/>
               <w:szCs w:val="24"/>
               <w:u w:val="none"/>
-              <w:lang w:eastAsia="en-GB"/>
+              <w:lang w:val="en-GB" w:eastAsia="en-GB"/>
               <w14:ligatures w14:val="standardContextual"/>
             </w:rPr>
           </w:pPr>
@@ -1008,7 +954,7 @@
             </w:rPr>
             <w:fldChar w:fldCharType="separate"/>
           </w:r>
-          <w:hyperlink w:anchor="_Toc227748413" w:history="1">
+          <w:hyperlink w:anchor="_Toc230871593" w:history="1">
             <w:r>
               <w:rPr>
                 <w:rStyle w:val="Hyperlink"/>
@@ -1035,7 +981,7 @@
                 <w:noProof/>
                 <w:webHidden/>
               </w:rPr>
-              <w:instrText xml:space="preserve"> PAGEREF _Toc227748413 \h </w:instrText>
+              <w:instrText xml:space="preserve"> PAGEREF _Toc230871593 \h </w:instrText>
             </w:r>
             <w:r>
               <w:rPr>
@@ -1082,11 +1028,11 @@
               <w:sz w:val="24"/>
               <w:szCs w:val="24"/>
               <w:u w:val="none"/>
-              <w:lang w:eastAsia="en-GB"/>
+              <w:lang w:val="en-GB" w:eastAsia="en-GB"/>
               <w14:ligatures w14:val="standardContextual"/>
             </w:rPr>
           </w:pPr>
-          <w:hyperlink w:anchor="_Toc227748414" w:history="1">
+          <w:hyperlink w:anchor="_Toc230871594" w:history="1">
             <w:r>
               <w:rPr>
                 <w:rStyle w:val="Hyperlink"/>
@@ -1113,7 +1059,7 @@
                 <w:noProof/>
                 <w:webHidden/>
               </w:rPr>
-              <w:instrText xml:space="preserve"> PAGEREF _Toc227748414 \h </w:instrText>
+              <w:instrText xml:space="preserve"> PAGEREF _Toc230871594 \h </w:instrText>
             </w:r>
             <w:r>
               <w:rPr>
@@ -1148,7 +1094,7 @@
           <w:pPr>
             <w:pStyle w:val="TOC1"/>
             <w:tabs>
-              <w:tab w:val="left" w:pos="352"/>
+              <w:tab w:val="left" w:pos="358"/>
               <w:tab w:val="right" w:leader="dot" w:pos="9628"/>
             </w:tabs>
             <w:rPr>
@@ -1161,11 +1107,11 @@
               <w:sz w:val="24"/>
               <w:szCs w:val="24"/>
               <w:u w:val="none"/>
-              <w:lang w:eastAsia="en-GB"/>
+              <w:lang w:val="en-GB" w:eastAsia="en-GB"/>
               <w14:ligatures w14:val="standardContextual"/>
             </w:rPr>
           </w:pPr>
-          <w:hyperlink w:anchor="_Toc227748415" w:history="1">
+          <w:hyperlink w:anchor="_Toc230871595" w:history="1">
             <w:r>
               <w:rPr>
                 <w:rStyle w:val="Hyperlink"/>
@@ -1184,7 +1130,7 @@
                 <w:sz w:val="24"/>
                 <w:szCs w:val="24"/>
                 <w:u w:val="none"/>
-                <w:lang w:eastAsia="en-GB"/>
+                <w:lang w:val="en-GB" w:eastAsia="en-GB"/>
                 <w14:ligatures w14:val="standardContextual"/>
               </w:rPr>
               <w:tab/>
@@ -1215,7 +1161,7 @@
                 <w:noProof/>
                 <w:webHidden/>
               </w:rPr>
-              <w:instrText xml:space="preserve"> PAGEREF _Toc227748415 \h </w:instrText>
+              <w:instrText xml:space="preserve"> PAGEREF _Toc230871595 \h </w:instrText>
             </w:r>
             <w:r>
               <w:rPr>
@@ -1250,7 +1196,7 @@
           <w:pPr>
             <w:pStyle w:val="TOC2"/>
             <w:tabs>
-              <w:tab w:val="left" w:pos="522"/>
+              <w:tab w:val="left" w:pos="541"/>
               <w:tab w:val="right" w:leader="dot" w:pos="9628"/>
             </w:tabs>
             <w:rPr>
@@ -1262,11 +1208,11 @@
               <w:kern w:val="2"/>
               <w:sz w:val="24"/>
               <w:szCs w:val="24"/>
-              <w:lang w:eastAsia="en-GB"/>
+              <w:lang w:val="en-GB" w:eastAsia="en-GB"/>
               <w14:ligatures w14:val="standardContextual"/>
             </w:rPr>
           </w:pPr>
-          <w:hyperlink w:anchor="_Toc227748416" w:history="1">
+          <w:hyperlink w:anchor="_Toc230871596" w:history="1">
             <w:r>
               <w:rPr>
                 <w:rStyle w:val="Hyperlink"/>
@@ -1284,7 +1230,7 @@
                 <w:kern w:val="2"/>
                 <w:sz w:val="24"/>
                 <w:szCs w:val="24"/>
-                <w:lang w:eastAsia="en-GB"/>
+                <w:lang w:val="en-GB" w:eastAsia="en-GB"/>
                 <w14:ligatures w14:val="standardContextual"/>
               </w:rPr>
               <w:tab/>
@@ -1315,7 +1261,7 @@
                 <w:noProof/>
                 <w:webHidden/>
               </w:rPr>
-              <w:instrText xml:space="preserve"> PAGEREF _Toc227748416 \h </w:instrText>
+              <w:instrText xml:space="preserve"> PAGEREF _Toc230871596 \h </w:instrText>
             </w:r>
             <w:r>
               <w:rPr>
@@ -1350,7 +1296,7 @@
           <w:pPr>
             <w:pStyle w:val="TOC1"/>
             <w:tabs>
-              <w:tab w:val="left" w:pos="352"/>
+              <w:tab w:val="left" w:pos="358"/>
               <w:tab w:val="right" w:leader="dot" w:pos="9628"/>
             </w:tabs>
             <w:rPr>
@@ -1363,11 +1309,11 @@
               <w:sz w:val="24"/>
               <w:szCs w:val="24"/>
               <w:u w:val="none"/>
-              <w:lang w:eastAsia="en-GB"/>
+              <w:lang w:val="en-GB" w:eastAsia="en-GB"/>
               <w14:ligatures w14:val="standardContextual"/>
             </w:rPr>
           </w:pPr>
-          <w:hyperlink w:anchor="_Toc227748417" w:history="1">
+          <w:hyperlink w:anchor="_Toc230871597" w:history="1">
             <w:r>
               <w:rPr>
                 <w:rStyle w:val="Hyperlink"/>
@@ -1386,7 +1332,7 @@
                 <w:sz w:val="24"/>
                 <w:szCs w:val="24"/>
                 <w:u w:val="none"/>
-                <w:lang w:eastAsia="en-GB"/>
+                <w:lang w:val="en-GB" w:eastAsia="en-GB"/>
                 <w14:ligatures w14:val="standardContextual"/>
               </w:rPr>
               <w:tab/>
@@ -1417,7 +1363,7 @@
                 <w:noProof/>
                 <w:webHidden/>
               </w:rPr>
-              <w:instrText xml:space="preserve"> PAGEREF _Toc227748417 \h </w:instrText>
+              <w:instrText xml:space="preserve"> PAGEREF _Toc230871597 \h </w:instrText>
             </w:r>
             <w:r>
               <w:rPr>
@@ -1452,7 +1398,7 @@
           <w:pPr>
             <w:pStyle w:val="TOC2"/>
             <w:tabs>
-              <w:tab w:val="left" w:pos="522"/>
+              <w:tab w:val="left" w:pos="541"/>
               <w:tab w:val="right" w:leader="dot" w:pos="9628"/>
             </w:tabs>
             <w:rPr>
@@ -1464,11 +1410,11 @@
               <w:kern w:val="2"/>
               <w:sz w:val="24"/>
               <w:szCs w:val="24"/>
-              <w:lang w:eastAsia="en-GB"/>
+              <w:lang w:val="en-GB" w:eastAsia="en-GB"/>
               <w14:ligatures w14:val="standardContextual"/>
             </w:rPr>
           </w:pPr>
-          <w:hyperlink w:anchor="_Toc227748418" w:history="1">
+          <w:hyperlink w:anchor="_Toc230871598" w:history="1">
             <w:r>
               <w:rPr>
                 <w:rStyle w:val="Hyperlink"/>
@@ -1486,7 +1432,7 @@
                 <w:kern w:val="2"/>
                 <w:sz w:val="24"/>
                 <w:szCs w:val="24"/>
-                <w:lang w:eastAsia="en-GB"/>
+                <w:lang w:val="en-GB" w:eastAsia="en-GB"/>
                 <w14:ligatures w14:val="standardContextual"/>
               </w:rPr>
               <w:tab/>
@@ -1517,7 +1463,7 @@
                 <w:noProof/>
                 <w:webHidden/>
               </w:rPr>
-              <w:instrText xml:space="preserve"> PAGEREF _Toc227748418 \h </w:instrText>
+              <w:instrText xml:space="preserve"> PAGEREF _Toc230871598 \h </w:instrText>
             </w:r>
             <w:r>
               <w:rPr>
@@ -1552,7 +1498,7 @@
           <w:pPr>
             <w:pStyle w:val="TOC3"/>
             <w:tabs>
-              <w:tab w:val="left" w:pos="686"/>
+              <w:tab w:val="left" w:pos="718"/>
               <w:tab w:val="right" w:leader="dot" w:pos="9628"/>
             </w:tabs>
             <w:rPr>
@@ -1562,11 +1508,11 @@
               <w:kern w:val="2"/>
               <w:sz w:val="24"/>
               <w:szCs w:val="24"/>
-              <w:lang w:eastAsia="en-GB"/>
+              <w:lang w:val="en-GB" w:eastAsia="en-GB"/>
               <w14:ligatures w14:val="standardContextual"/>
             </w:rPr>
           </w:pPr>
-          <w:hyperlink w:anchor="_Toc227748419" w:history="1">
+          <w:hyperlink w:anchor="_Toc230871599" w:history="1">
             <w:r>
               <w:rPr>
                 <w:rStyle w:val="Hyperlink"/>
@@ -1582,7 +1528,7 @@
                 <w:kern w:val="2"/>
                 <w:sz w:val="24"/>
                 <w:szCs w:val="24"/>
-                <w:lang w:eastAsia="en-GB"/>
+                <w:lang w:val="en-GB" w:eastAsia="en-GB"/>
                 <w14:ligatures w14:val="standardContextual"/>
               </w:rPr>
               <w:tab/>
@@ -1614,7 +1560,7 @@
                 <w:noProof/>
                 <w:webHidden/>
               </w:rPr>
-              <w:instrText xml:space="preserve"> PAGEREF _Toc227748419 \h </w:instrText>
+              <w:instrText xml:space="preserve"> PAGEREF _Toc230871599 \h </w:instrText>
             </w:r>
             <w:r>
               <w:rPr>
@@ -1649,7 +1595,7 @@
           <w:pPr>
             <w:pStyle w:val="TOC3"/>
             <w:tabs>
-              <w:tab w:val="left" w:pos="686"/>
+              <w:tab w:val="left" w:pos="718"/>
               <w:tab w:val="right" w:leader="dot" w:pos="9628"/>
             </w:tabs>
             <w:rPr>
@@ -1659,11 +1605,11 @@
               <w:kern w:val="2"/>
               <w:sz w:val="24"/>
               <w:szCs w:val="24"/>
-              <w:lang w:eastAsia="en-GB"/>
+              <w:lang w:val="en-GB" w:eastAsia="en-GB"/>
               <w14:ligatures w14:val="standardContextual"/>
             </w:rPr>
           </w:pPr>
-          <w:hyperlink w:anchor="_Toc227748420" w:history="1">
+          <w:hyperlink w:anchor="_Toc230871600" w:history="1">
             <w:r>
               <w:rPr>
                 <w:rStyle w:val="Hyperlink"/>
@@ -1679,7 +1625,7 @@
                 <w:kern w:val="2"/>
                 <w:sz w:val="24"/>
                 <w:szCs w:val="24"/>
-                <w:lang w:eastAsia="en-GB"/>
+                <w:lang w:val="en-GB" w:eastAsia="en-GB"/>
                 <w14:ligatures w14:val="standardContextual"/>
               </w:rPr>
               <w:tab/>
@@ -1711,7 +1657,7 @@
                 <w:noProof/>
                 <w:webHidden/>
               </w:rPr>
-              <w:instrText xml:space="preserve"> PAGEREF _Toc227748420 \h </w:instrText>
+              <w:instrText xml:space="preserve"> PAGEREF _Toc230871600 \h </w:instrText>
             </w:r>
             <w:r>
               <w:rPr>
@@ -1746,7 +1692,7 @@
           <w:pPr>
             <w:pStyle w:val="TOC3"/>
             <w:tabs>
-              <w:tab w:val="left" w:pos="686"/>
+              <w:tab w:val="left" w:pos="718"/>
               <w:tab w:val="right" w:leader="dot" w:pos="9628"/>
             </w:tabs>
             <w:rPr>
@@ -1756,11 +1702,11 @@
               <w:kern w:val="2"/>
               <w:sz w:val="24"/>
               <w:szCs w:val="24"/>
-              <w:lang w:eastAsia="en-GB"/>
+              <w:lang w:val="en-GB" w:eastAsia="en-GB"/>
               <w14:ligatures w14:val="standardContextual"/>
             </w:rPr>
           </w:pPr>
-          <w:hyperlink w:anchor="_Toc227748421" w:history="1">
+          <w:hyperlink w:anchor="_Toc230871601" w:history="1">
             <w:r>
               <w:rPr>
                 <w:rStyle w:val="Hyperlink"/>
@@ -1776,7 +1722,7 @@
                 <w:kern w:val="2"/>
                 <w:sz w:val="24"/>
                 <w:szCs w:val="24"/>
-                <w:lang w:eastAsia="en-GB"/>
+                <w:lang w:val="en-GB" w:eastAsia="en-GB"/>
                 <w14:ligatures w14:val="standardContextual"/>
               </w:rPr>
               <w:tab/>
@@ -1808,7 +1754,7 @@
                 <w:noProof/>
                 <w:webHidden/>
               </w:rPr>
-              <w:instrText xml:space="preserve"> PAGEREF _Toc227748421 \h </w:instrText>
+              <w:instrText xml:space="preserve"> PAGEREF _Toc230871601 \h </w:instrText>
             </w:r>
             <w:r>
               <w:rPr>
@@ -1843,7 +1789,7 @@
           <w:pPr>
             <w:pStyle w:val="TOC3"/>
             <w:tabs>
-              <w:tab w:val="left" w:pos="686"/>
+              <w:tab w:val="left" w:pos="718"/>
               <w:tab w:val="right" w:leader="dot" w:pos="9628"/>
             </w:tabs>
             <w:rPr>
@@ -1853,11 +1799,11 @@
               <w:kern w:val="2"/>
               <w:sz w:val="24"/>
               <w:szCs w:val="24"/>
-              <w:lang w:eastAsia="en-GB"/>
+              <w:lang w:val="en-GB" w:eastAsia="en-GB"/>
               <w14:ligatures w14:val="standardContextual"/>
             </w:rPr>
           </w:pPr>
-          <w:hyperlink w:anchor="_Toc227748422" w:history="1">
+          <w:hyperlink w:anchor="_Toc230871602" w:history="1">
             <w:r>
               <w:rPr>
                 <w:rStyle w:val="Hyperlink"/>
@@ -1873,7 +1819,7 @@
                 <w:kern w:val="2"/>
                 <w:sz w:val="24"/>
                 <w:szCs w:val="24"/>
-                <w:lang w:eastAsia="en-GB"/>
+                <w:lang w:val="en-GB" w:eastAsia="en-GB"/>
                 <w14:ligatures w14:val="standardContextual"/>
               </w:rPr>
               <w:tab/>
@@ -1904,7 +1850,7 @@
                 <w:noProof/>
                 <w:webHidden/>
               </w:rPr>
-              <w:instrText xml:space="preserve"> PAGEREF _Toc227748422 \h </w:instrText>
+              <w:instrText xml:space="preserve"> PAGEREF _Toc230871602 \h </w:instrText>
             </w:r>
             <w:r>
               <w:rPr>
@@ -1939,7 +1885,7 @@
           <w:pPr>
             <w:pStyle w:val="TOC3"/>
             <w:tabs>
-              <w:tab w:val="left" w:pos="686"/>
+              <w:tab w:val="left" w:pos="718"/>
               <w:tab w:val="right" w:leader="dot" w:pos="9628"/>
             </w:tabs>
             <w:rPr>
@@ -1949,11 +1895,11 @@
               <w:kern w:val="2"/>
               <w:sz w:val="24"/>
               <w:szCs w:val="24"/>
-              <w:lang w:eastAsia="en-GB"/>
+              <w:lang w:val="en-GB" w:eastAsia="en-GB"/>
               <w14:ligatures w14:val="standardContextual"/>
             </w:rPr>
           </w:pPr>
-          <w:hyperlink w:anchor="_Toc227748423" w:history="1">
+          <w:hyperlink w:anchor="_Toc230871603" w:history="1">
             <w:r>
               <w:rPr>
                 <w:rStyle w:val="Hyperlink"/>
@@ -1969,7 +1915,7 @@
                 <w:kern w:val="2"/>
                 <w:sz w:val="24"/>
                 <w:szCs w:val="24"/>
-                <w:lang w:eastAsia="en-GB"/>
+                <w:lang w:val="en-GB" w:eastAsia="en-GB"/>
                 <w14:ligatures w14:val="standardContextual"/>
               </w:rPr>
               <w:tab/>
@@ -2000,7 +1946,7 @@
                 <w:noProof/>
                 <w:webHidden/>
               </w:rPr>
-              <w:instrText xml:space="preserve"> PAGEREF _Toc227748423 \h </w:instrText>
+              <w:instrText xml:space="preserve"> PAGEREF _Toc230871603 \h </w:instrText>
             </w:r>
             <w:r>
               <w:rPr>
@@ -2035,7 +1981,7 @@
           <w:pPr>
             <w:pStyle w:val="TOC2"/>
             <w:tabs>
-              <w:tab w:val="left" w:pos="522"/>
+              <w:tab w:val="left" w:pos="541"/>
               <w:tab w:val="right" w:leader="dot" w:pos="9628"/>
             </w:tabs>
             <w:rPr>
@@ -2047,11 +1993,11 @@
               <w:kern w:val="2"/>
               <w:sz w:val="24"/>
               <w:szCs w:val="24"/>
-              <w:lang w:eastAsia="en-GB"/>
+              <w:lang w:val="en-GB" w:eastAsia="en-GB"/>
               <w14:ligatures w14:val="standardContextual"/>
             </w:rPr>
           </w:pPr>
-          <w:hyperlink w:anchor="_Toc227748424" w:history="1">
+          <w:hyperlink w:anchor="_Toc230871604" w:history="1">
             <w:r>
               <w:rPr>
                 <w:rStyle w:val="Hyperlink"/>
@@ -2069,7 +2015,7 @@
                 <w:kern w:val="2"/>
                 <w:sz w:val="24"/>
                 <w:szCs w:val="24"/>
-                <w:lang w:eastAsia="en-GB"/>
+                <w:lang w:val="en-GB" w:eastAsia="en-GB"/>
                 <w14:ligatures w14:val="standardContextual"/>
               </w:rPr>
               <w:tab/>
@@ -2100,7 +2046,7 @@
                 <w:noProof/>
                 <w:webHidden/>
               </w:rPr>
-              <w:instrText xml:space="preserve"> PAGEREF _Toc227748424 \h </w:instrText>
+              <w:instrText xml:space="preserve"> PAGEREF _Toc230871604 \h </w:instrText>
             </w:r>
             <w:r>
               <w:rPr>
@@ -2135,7 +2081,7 @@
           <w:pPr>
             <w:pStyle w:val="TOC2"/>
             <w:tabs>
-              <w:tab w:val="left" w:pos="522"/>
+              <w:tab w:val="left" w:pos="541"/>
               <w:tab w:val="right" w:leader="dot" w:pos="9628"/>
             </w:tabs>
             <w:rPr>
@@ -2147,11 +2093,11 @@
               <w:kern w:val="2"/>
               <w:sz w:val="24"/>
               <w:szCs w:val="24"/>
-              <w:lang w:eastAsia="en-GB"/>
+              <w:lang w:val="en-GB" w:eastAsia="en-GB"/>
               <w14:ligatures w14:val="standardContextual"/>
             </w:rPr>
           </w:pPr>
-          <w:hyperlink w:anchor="_Toc227748425" w:history="1">
+          <w:hyperlink w:anchor="_Toc230871605" w:history="1">
             <w:r>
               <w:rPr>
                 <w:rStyle w:val="Hyperlink"/>
@@ -2169,7 +2115,7 @@
                 <w:kern w:val="2"/>
                 <w:sz w:val="24"/>
                 <w:szCs w:val="24"/>
-                <w:lang w:eastAsia="en-GB"/>
+                <w:lang w:val="en-GB" w:eastAsia="en-GB"/>
                 <w14:ligatures w14:val="standardContextual"/>
               </w:rPr>
               <w:tab/>
@@ -2200,7 +2146,7 @@
                 <w:noProof/>
                 <w:webHidden/>
               </w:rPr>
-              <w:instrText xml:space="preserve"> PAGEREF _Toc227748425 \h </w:instrText>
+              <w:instrText xml:space="preserve"> PAGEREF _Toc230871605 \h </w:instrText>
             </w:r>
             <w:r>
               <w:rPr>
@@ -2235,7 +2181,7 @@
           <w:pPr>
             <w:pStyle w:val="TOC1"/>
             <w:tabs>
-              <w:tab w:val="left" w:pos="352"/>
+              <w:tab w:val="left" w:pos="358"/>
               <w:tab w:val="right" w:leader="dot" w:pos="9628"/>
             </w:tabs>
             <w:rPr>
@@ -2248,11 +2194,11 @@
               <w:sz w:val="24"/>
               <w:szCs w:val="24"/>
               <w:u w:val="none"/>
-              <w:lang w:eastAsia="en-GB"/>
+              <w:lang w:val="en-GB" w:eastAsia="en-GB"/>
               <w14:ligatures w14:val="standardContextual"/>
             </w:rPr>
           </w:pPr>
-          <w:hyperlink w:anchor="_Toc227748426" w:history="1">
+          <w:hyperlink w:anchor="_Toc230871606" w:history="1">
             <w:r>
               <w:rPr>
                 <w:rStyle w:val="Hyperlink"/>
@@ -2271,7 +2217,7 @@
                 <w:sz w:val="24"/>
                 <w:szCs w:val="24"/>
                 <w:u w:val="none"/>
-                <w:lang w:eastAsia="en-GB"/>
+                <w:lang w:val="en-GB" w:eastAsia="en-GB"/>
                 <w14:ligatures w14:val="standardContextual"/>
               </w:rPr>
               <w:tab/>
@@ -2302,7 +2248,7 @@
                 <w:noProof/>
                 <w:webHidden/>
               </w:rPr>
-              <w:instrText xml:space="preserve"> PAGEREF _Toc227748426 \h </w:instrText>
+              <w:instrText xml:space="preserve"> PAGEREF _Toc230871606 \h </w:instrText>
             </w:r>
             <w:r>
               <w:rPr>
@@ -2337,7 +2283,7 @@
           <w:pPr>
             <w:pStyle w:val="TOC2"/>
             <w:tabs>
-              <w:tab w:val="left" w:pos="522"/>
+              <w:tab w:val="left" w:pos="541"/>
               <w:tab w:val="right" w:leader="dot" w:pos="9628"/>
             </w:tabs>
             <w:rPr>
@@ -2349,11 +2295,11 @@
               <w:kern w:val="2"/>
               <w:sz w:val="24"/>
               <w:szCs w:val="24"/>
-              <w:lang w:eastAsia="en-GB"/>
+              <w:lang w:val="en-GB" w:eastAsia="en-GB"/>
               <w14:ligatures w14:val="standardContextual"/>
             </w:rPr>
           </w:pPr>
-          <w:hyperlink w:anchor="_Toc227748427" w:history="1">
+          <w:hyperlink w:anchor="_Toc230871607" w:history="1">
             <w:r>
               <w:rPr>
                 <w:rStyle w:val="Hyperlink"/>
@@ -2371,7 +2317,7 @@
                 <w:kern w:val="2"/>
                 <w:sz w:val="24"/>
                 <w:szCs w:val="24"/>
-                <w:lang w:eastAsia="en-GB"/>
+                <w:lang w:val="en-GB" w:eastAsia="en-GB"/>
                 <w14:ligatures w14:val="standardContextual"/>
               </w:rPr>
               <w:tab/>
@@ -2402,7 +2348,7 @@
                 <w:noProof/>
                 <w:webHidden/>
               </w:rPr>
-              <w:instrText xml:space="preserve"> PAGEREF _Toc227748427 \h </w:instrText>
+              <w:instrText xml:space="preserve"> PAGEREF _Toc230871607 \h </w:instrText>
             </w:r>
             <w:r>
               <w:rPr>
@@ -2437,7 +2383,7 @@
           <w:pPr>
             <w:pStyle w:val="TOC2"/>
             <w:tabs>
-              <w:tab w:val="left" w:pos="522"/>
+              <w:tab w:val="left" w:pos="541"/>
               <w:tab w:val="right" w:leader="dot" w:pos="9628"/>
             </w:tabs>
             <w:rPr>
@@ -2449,11 +2395,11 @@
               <w:kern w:val="2"/>
               <w:sz w:val="24"/>
               <w:szCs w:val="24"/>
-              <w:lang w:eastAsia="en-GB"/>
+              <w:lang w:val="en-GB" w:eastAsia="en-GB"/>
               <w14:ligatures w14:val="standardContextual"/>
             </w:rPr>
           </w:pPr>
-          <w:hyperlink w:anchor="_Toc227748428" w:history="1">
+          <w:hyperlink w:anchor="_Toc230871608" w:history="1">
             <w:r>
               <w:rPr>
                 <w:rStyle w:val="Hyperlink"/>
@@ -2471,7 +2417,7 @@
                 <w:kern w:val="2"/>
                 <w:sz w:val="24"/>
                 <w:szCs w:val="24"/>
-                <w:lang w:eastAsia="en-GB"/>
+                <w:lang w:val="en-GB" w:eastAsia="en-GB"/>
                 <w14:ligatures w14:val="standardContextual"/>
               </w:rPr>
               <w:tab/>
@@ -2502,7 +2448,7 @@
                 <w:noProof/>
                 <w:webHidden/>
               </w:rPr>
-              <w:instrText xml:space="preserve"> PAGEREF _Toc227748428 \h </w:instrText>
+              <w:instrText xml:space="preserve"> PAGEREF _Toc230871608 \h </w:instrText>
             </w:r>
             <w:r>
               <w:rPr>
@@ -2537,7 +2483,7 @@
           <w:pPr>
             <w:pStyle w:val="TOC2"/>
             <w:tabs>
-              <w:tab w:val="left" w:pos="522"/>
+              <w:tab w:val="left" w:pos="541"/>
               <w:tab w:val="right" w:leader="dot" w:pos="9628"/>
             </w:tabs>
             <w:rPr>
@@ -2549,11 +2495,11 @@
               <w:kern w:val="2"/>
               <w:sz w:val="24"/>
               <w:szCs w:val="24"/>
-              <w:lang w:eastAsia="en-GB"/>
+              <w:lang w:val="en-GB" w:eastAsia="en-GB"/>
               <w14:ligatures w14:val="standardContextual"/>
             </w:rPr>
           </w:pPr>
-          <w:hyperlink w:anchor="_Toc227748429" w:history="1">
+          <w:hyperlink w:anchor="_Toc230871609" w:history="1">
             <w:r>
               <w:rPr>
                 <w:rStyle w:val="Hyperlink"/>
@@ -2571,7 +2517,7 @@
                 <w:kern w:val="2"/>
                 <w:sz w:val="24"/>
                 <w:szCs w:val="24"/>
-                <w:lang w:eastAsia="en-GB"/>
+                <w:lang w:val="en-GB" w:eastAsia="en-GB"/>
                 <w14:ligatures w14:val="standardContextual"/>
               </w:rPr>
               <w:tab/>
@@ -2602,7 +2548,7 @@
                 <w:noProof/>
                 <w:webHidden/>
               </w:rPr>
-              <w:instrText xml:space="preserve"> PAGEREF _Toc227748429 \h </w:instrText>
+              <w:instrText xml:space="preserve"> PAGEREF _Toc230871609 \h </w:instrText>
             </w:r>
             <w:r>
               <w:rPr>
@@ -2637,7 +2583,7 @@
           <w:pPr>
             <w:pStyle w:val="TOC2"/>
             <w:tabs>
-              <w:tab w:val="left" w:pos="522"/>
+              <w:tab w:val="left" w:pos="541"/>
               <w:tab w:val="right" w:leader="dot" w:pos="9628"/>
             </w:tabs>
             <w:rPr>
@@ -2649,11 +2595,11 @@
               <w:kern w:val="2"/>
               <w:sz w:val="24"/>
               <w:szCs w:val="24"/>
-              <w:lang w:eastAsia="en-GB"/>
+              <w:lang w:val="en-GB" w:eastAsia="en-GB"/>
               <w14:ligatures w14:val="standardContextual"/>
             </w:rPr>
           </w:pPr>
-          <w:hyperlink w:anchor="_Toc227748430" w:history="1">
+          <w:hyperlink w:anchor="_Toc230871610" w:history="1">
             <w:r>
               <w:rPr>
                 <w:rStyle w:val="Hyperlink"/>
@@ -2671,7 +2617,7 @@
                 <w:kern w:val="2"/>
                 <w:sz w:val="24"/>
                 <w:szCs w:val="24"/>
-                <w:lang w:eastAsia="en-GB"/>
+                <w:lang w:val="en-GB" w:eastAsia="en-GB"/>
                 <w14:ligatures w14:val="standardContextual"/>
               </w:rPr>
               <w:tab/>
@@ -2702,7 +2648,7 @@
                 <w:noProof/>
                 <w:webHidden/>
               </w:rPr>
-              <w:instrText xml:space="preserve"> PAGEREF _Toc227748430 \h </w:instrText>
+              <w:instrText xml:space="preserve"> PAGEREF _Toc230871610 \h </w:instrText>
             </w:r>
             <w:r>
               <w:rPr>
@@ -2722,7 +2668,7 @@
                 <w:noProof/>
                 <w:webHidden/>
               </w:rPr>
-              <w:t>14</w:t>
+              <w:t>16</w:t>
             </w:r>
             <w:r>
               <w:rPr>
@@ -2737,7 +2683,7 @@
           <w:pPr>
             <w:pStyle w:val="TOC3"/>
             <w:tabs>
-              <w:tab w:val="left" w:pos="686"/>
+              <w:tab w:val="left" w:pos="718"/>
               <w:tab w:val="right" w:leader="dot" w:pos="9628"/>
             </w:tabs>
             <w:rPr>
@@ -2747,11 +2693,11 @@
               <w:kern w:val="2"/>
               <w:sz w:val="24"/>
               <w:szCs w:val="24"/>
-              <w:lang w:eastAsia="en-GB"/>
+              <w:lang w:val="en-GB" w:eastAsia="en-GB"/>
               <w14:ligatures w14:val="standardContextual"/>
             </w:rPr>
           </w:pPr>
-          <w:hyperlink w:anchor="_Toc227748431" w:history="1">
+          <w:hyperlink w:anchor="_Toc230871611" w:history="1">
             <w:r>
               <w:rPr>
                 <w:rStyle w:val="Hyperlink"/>
@@ -2767,7 +2713,7 @@
                 <w:kern w:val="2"/>
                 <w:sz w:val="24"/>
                 <w:szCs w:val="24"/>
-                <w:lang w:eastAsia="en-GB"/>
+                <w:lang w:val="en-GB" w:eastAsia="en-GB"/>
                 <w14:ligatures w14:val="standardContextual"/>
               </w:rPr>
               <w:tab/>
@@ -2813,7 +2759,7 @@
                 <w:noProof/>
                 <w:webHidden/>
               </w:rPr>
-              <w:instrText xml:space="preserve"> PAGEREF _Toc227748431 \h </w:instrText>
+              <w:instrText xml:space="preserve"> PAGEREF _Toc230871611 \h </w:instrText>
             </w:r>
             <w:r>
               <w:rPr>
@@ -2833,7 +2779,7 @@
                 <w:noProof/>
                 <w:webHidden/>
               </w:rPr>
-              <w:t>14</w:t>
+              <w:t>16</w:t>
             </w:r>
             <w:r>
               <w:rPr>
@@ -2848,7 +2794,7 @@
           <w:pPr>
             <w:pStyle w:val="TOC3"/>
             <w:tabs>
-              <w:tab w:val="left" w:pos="686"/>
+              <w:tab w:val="left" w:pos="718"/>
               <w:tab w:val="right" w:leader="dot" w:pos="9628"/>
             </w:tabs>
             <w:rPr>
@@ -2858,11 +2804,11 @@
               <w:kern w:val="2"/>
               <w:sz w:val="24"/>
               <w:szCs w:val="24"/>
-              <w:lang w:eastAsia="en-GB"/>
+              <w:lang w:val="en-GB" w:eastAsia="en-GB"/>
               <w14:ligatures w14:val="standardContextual"/>
             </w:rPr>
           </w:pPr>
-          <w:hyperlink w:anchor="_Toc227748432" w:history="1">
+          <w:hyperlink w:anchor="_Toc230871612" w:history="1">
             <w:r>
               <w:rPr>
                 <w:rStyle w:val="Hyperlink"/>
@@ -2878,7 +2824,7 @@
                 <w:kern w:val="2"/>
                 <w:sz w:val="24"/>
                 <w:szCs w:val="24"/>
-                <w:lang w:eastAsia="en-GB"/>
+                <w:lang w:val="en-GB" w:eastAsia="en-GB"/>
                 <w14:ligatures w14:val="standardContextual"/>
               </w:rPr>
               <w:tab/>
@@ -2924,7 +2870,7 @@
                 <w:noProof/>
                 <w:webHidden/>
               </w:rPr>
-              <w:instrText xml:space="preserve"> PAGEREF _Toc227748432 \h </w:instrText>
+              <w:instrText xml:space="preserve"> PAGEREF _Toc230871612 \h </w:instrText>
             </w:r>
             <w:r>
               <w:rPr>
@@ -2944,7 +2890,7 @@
                 <w:noProof/>
                 <w:webHidden/>
               </w:rPr>
-              <w:t>16</w:t>
+              <w:t>18</w:t>
             </w:r>
             <w:r>
               <w:rPr>
@@ -2959,7 +2905,7 @@
           <w:pPr>
             <w:pStyle w:val="TOC3"/>
             <w:tabs>
-              <w:tab w:val="left" w:pos="686"/>
+              <w:tab w:val="left" w:pos="718"/>
               <w:tab w:val="right" w:leader="dot" w:pos="9628"/>
             </w:tabs>
             <w:rPr>
@@ -2969,11 +2915,11 @@
               <w:kern w:val="2"/>
               <w:sz w:val="24"/>
               <w:szCs w:val="24"/>
-              <w:lang w:eastAsia="en-GB"/>
+              <w:lang w:val="en-GB" w:eastAsia="en-GB"/>
               <w14:ligatures w14:val="standardContextual"/>
             </w:rPr>
           </w:pPr>
-          <w:hyperlink w:anchor="_Toc227748433" w:history="1">
+          <w:hyperlink w:anchor="_Toc230871613" w:history="1">
             <w:r>
               <w:rPr>
                 <w:rStyle w:val="Hyperlink"/>
@@ -2989,7 +2935,7 @@
                 <w:kern w:val="2"/>
                 <w:sz w:val="24"/>
                 <w:szCs w:val="24"/>
-                <w:lang w:eastAsia="en-GB"/>
+                <w:lang w:val="en-GB" w:eastAsia="en-GB"/>
                 <w14:ligatures w14:val="standardContextual"/>
               </w:rPr>
               <w:tab/>
@@ -3035,7 +2981,7 @@
                 <w:noProof/>
                 <w:webHidden/>
               </w:rPr>
-              <w:instrText xml:space="preserve"> PAGEREF _Toc227748433 \h </w:instrText>
+              <w:instrText xml:space="preserve"> PAGEREF _Toc230871613 \h </w:instrText>
             </w:r>
             <w:r>
               <w:rPr>
@@ -3055,7 +3001,7 @@
                 <w:noProof/>
                 <w:webHidden/>
               </w:rPr>
-              <w:t>18</w:t>
+              <w:t>20</w:t>
             </w:r>
             <w:r>
               <w:rPr>
@@ -3070,7 +3016,7 @@
           <w:pPr>
             <w:pStyle w:val="TOC2"/>
             <w:tabs>
-              <w:tab w:val="left" w:pos="522"/>
+              <w:tab w:val="left" w:pos="541"/>
               <w:tab w:val="right" w:leader="dot" w:pos="9628"/>
             </w:tabs>
             <w:rPr>
@@ -3082,11 +3028,11 @@
               <w:kern w:val="2"/>
               <w:sz w:val="24"/>
               <w:szCs w:val="24"/>
-              <w:lang w:eastAsia="en-GB"/>
+              <w:lang w:val="en-GB" w:eastAsia="en-GB"/>
               <w14:ligatures w14:val="standardContextual"/>
             </w:rPr>
           </w:pPr>
-          <w:hyperlink w:anchor="_Toc227748434" w:history="1">
+          <w:hyperlink w:anchor="_Toc230871614" w:history="1">
             <w:r>
               <w:rPr>
                 <w:rStyle w:val="Hyperlink"/>
@@ -3104,7 +3050,7 @@
                 <w:kern w:val="2"/>
                 <w:sz w:val="24"/>
                 <w:szCs w:val="24"/>
-                <w:lang w:eastAsia="en-GB"/>
+                <w:lang w:val="en-GB" w:eastAsia="en-GB"/>
                 <w14:ligatures w14:val="standardContextual"/>
               </w:rPr>
               <w:tab/>
@@ -3144,7 +3090,7 @@
                 <w:noProof/>
                 <w:webHidden/>
               </w:rPr>
-              <w:instrText xml:space="preserve"> PAGEREF _Toc227748434 \h </w:instrText>
+              <w:instrText xml:space="preserve"> PAGEREF _Toc230871614 \h </w:instrText>
             </w:r>
             <w:r>
               <w:rPr>
@@ -3164,7 +3110,7 @@
                 <w:noProof/>
                 <w:webHidden/>
               </w:rPr>
-              <w:t>19</w:t>
+              <w:t>21</w:t>
             </w:r>
             <w:r>
               <w:rPr>
@@ -3179,7 +3125,7 @@
           <w:pPr>
             <w:pStyle w:val="TOC1"/>
             <w:tabs>
-              <w:tab w:val="left" w:pos="352"/>
+              <w:tab w:val="left" w:pos="358"/>
               <w:tab w:val="right" w:leader="dot" w:pos="9628"/>
             </w:tabs>
             <w:rPr>
@@ -3192,11 +3138,11 @@
               <w:sz w:val="24"/>
               <w:szCs w:val="24"/>
               <w:u w:val="none"/>
-              <w:lang w:eastAsia="en-GB"/>
+              <w:lang w:val="en-GB" w:eastAsia="en-GB"/>
               <w14:ligatures w14:val="standardContextual"/>
             </w:rPr>
           </w:pPr>
-          <w:hyperlink w:anchor="_Toc227748435" w:history="1">
+          <w:hyperlink w:anchor="_Toc230871615" w:history="1">
             <w:r>
               <w:rPr>
                 <w:rStyle w:val="Hyperlink"/>
@@ -3215,7 +3161,7 @@
                 <w:sz w:val="24"/>
                 <w:szCs w:val="24"/>
                 <w:u w:val="none"/>
-                <w:lang w:eastAsia="en-GB"/>
+                <w:lang w:val="en-GB" w:eastAsia="en-GB"/>
                 <w14:ligatures w14:val="standardContextual"/>
               </w:rPr>
               <w:tab/>
@@ -3246,7 +3192,7 @@
                 <w:noProof/>
                 <w:webHidden/>
               </w:rPr>
-              <w:instrText xml:space="preserve"> PAGEREF _Toc227748435 \h </w:instrText>
+              <w:instrText xml:space="preserve"> PAGEREF _Toc230871615 \h </w:instrText>
             </w:r>
             <w:r>
               <w:rPr>
@@ -3266,7 +3212,7 @@
                 <w:noProof/>
                 <w:webHidden/>
               </w:rPr>
-              <w:t>21</w:t>
+              <w:t>23</w:t>
             </w:r>
             <w:r>
               <w:rPr>
@@ -3321,7 +3267,7 @@
           <w:noProof/>
         </w:rPr>
       </w:pPr>
-      <w:bookmarkStart w:id="0" w:name="_Toc227748413"/>
+      <w:bookmarkStart w:id="0" w:name="_Toc230871593"/>
       <w:r>
         <w:rPr>
           <w:noProof/>
@@ -3525,7 +3471,7 @@
         </w:numPr>
         <w:ind w:left="432" w:hanging="432"/>
       </w:pPr>
-      <w:bookmarkStart w:id="1" w:name="_Toc227748414"/>
+      <w:bookmarkStart w:id="1" w:name="_Toc230871594"/>
       <w:r>
         <w:lastRenderedPageBreak/>
         <w:t>Índice de Tabelas</w:t>
@@ -3950,7 +3896,7 @@
       <w:pPr>
         <w:pStyle w:val="Heading1"/>
       </w:pPr>
-      <w:bookmarkStart w:id="2" w:name="_Toc227748415"/>
+      <w:bookmarkStart w:id="2" w:name="_Toc230871595"/>
       <w:r>
         <w:lastRenderedPageBreak/>
         <w:t>Introdução</w:t>
@@ -3961,159 +3907,145 @@
       <w:pPr>
         <w:rPr>
           <w:noProof/>
-          <w:highlight w:val="yellow"/>
         </w:rPr>
       </w:pPr>
       <w:r>
         <w:rPr>
           <w:noProof/>
-          <w:highlight w:val="yellow"/>
-        </w:rPr>
-        <w:t>&lt;Contextualizar o projeto a implementar, indicando</w:t>
+        </w:rPr>
+        <w:t xml:space="preserve">O </w:t>
       </w:r>
       <w:r>
         <w:rPr>
           <w:noProof/>
-          <w:highlight w:val="yellow"/>
-        </w:rPr>
-        <w:t>:</w:t>
+        </w:rPr>
+        <w:t>projeto</w:t>
+      </w:r>
+      <w:r>
+        <w:rPr>
+          <w:noProof/>
+        </w:rPr>
+        <w:t xml:space="preserve"> foi </w:t>
+      </w:r>
+      <w:r>
+        <w:rPr>
+          <w:noProof/>
+        </w:rPr>
+        <w:t>realizado</w:t>
+      </w:r>
+      <w:r>
+        <w:rPr>
+          <w:noProof/>
+        </w:rPr>
+        <w:t xml:space="preserve"> no âmbito da unidade curricular de Desenvolvimento de Aplicações</w:t>
+      </w:r>
+      <w:r>
+        <w:rPr>
+          <w:noProof/>
+        </w:rPr>
+        <w:t xml:space="preserve"> (DA)</w:t>
+      </w:r>
+      <w:r>
+        <w:rPr>
+          <w:noProof/>
+        </w:rPr>
+        <w:t xml:space="preserve">, do Curso Técnico Superior Profissional de Programação de Sistemas de Informação do Instituto Politécnico de Leiria. O objetivo deste </w:t>
+      </w:r>
+      <w:r>
+        <w:rPr>
+          <w:noProof/>
+        </w:rPr>
+        <w:t>relatório</w:t>
+      </w:r>
+      <w:r>
+        <w:rPr>
+          <w:noProof/>
+        </w:rPr>
+        <w:t xml:space="preserve"> é descrever e documentar o processo de desenvolvimento do projeto final, desde a especificação do sistema até à sua implementação e avaliação.</w:t>
       </w:r>
     </w:p>
     <w:p>
       <w:pPr>
-        <w:pStyle w:val="ListParagraph"/>
-        <w:numPr>
-          <w:ilvl w:val="0"/>
-          <w:numId w:val="22"/>
-        </w:numPr>
         <w:rPr>
           <w:noProof/>
-          <w:highlight w:val="yellow"/>
         </w:rPr>
       </w:pPr>
       <w:r>
         <w:rPr>
           <w:noProof/>
-          <w:highlight w:val="yellow"/>
-        </w:rPr>
-        <w:t>Objetivo do relatório</w:t>
+        </w:rPr>
+        <w:t xml:space="preserve">O iShopping é uma aplicação desktop desenvolvida em C# com Windows Forms, destinada à gestão de compras domésticas de um agregado familiar. A aplicação permite gerir orçamentos mensais, planear listas de compras, registar artigos </w:t>
+      </w:r>
+      <w:r>
+        <w:rPr>
+          <w:noProof/>
+        </w:rPr>
+        <w:t>obtidos</w:t>
+      </w:r>
+      <w:r>
+        <w:rPr>
+          <w:noProof/>
+        </w:rPr>
+        <w:t xml:space="preserve"> e consultar estatísticas de consumo. O projeto foi desenvolvido em </w:t>
+      </w:r>
+      <w:r>
+        <w:rPr>
+          <w:noProof/>
+        </w:rPr>
+        <w:t>união</w:t>
+      </w:r>
+      <w:r>
+        <w:rPr>
+          <w:noProof/>
+        </w:rPr>
+        <w:t xml:space="preserve"> com a unidade curricular de Metodologia de Desenvolvimento de Software, na aplicação da metodologia ágil Scrum e na modelação do sistema através de diagramas de classes e modelo de dados</w:t>
+      </w:r>
+      <w:r>
+        <w:rPr>
+          <w:noProof/>
+        </w:rPr>
+        <w:t xml:space="preserve"> usando o website Jira.</w:t>
       </w:r>
     </w:p>
     <w:p>
       <w:pPr>
-        <w:pStyle w:val="ListParagraph"/>
-        <w:numPr>
-          <w:ilvl w:val="0"/>
-          <w:numId w:val="22"/>
-        </w:numPr>
         <w:rPr>
           <w:noProof/>
-          <w:highlight w:val="yellow"/>
         </w:rPr>
       </w:pPr>
       <w:r>
         <w:rPr>
           <w:noProof/>
-          <w:highlight w:val="yellow"/>
-        </w:rPr>
-        <w:t>Descrição breve do projeto</w:t>
+        </w:rPr>
+        <w:t xml:space="preserve">O desenvolvimento foi planeado em três sprints, seguindo os princípios do Scrum, com definição de User Stories, estimativa em Story Points e revisão contínua do trabalho realizado. A equipa é composta por dois elementos: </w:t>
       </w:r>
       <w:r>
         <w:rPr>
           <w:noProof/>
-          <w:highlight w:val="yellow"/>
-        </w:rPr>
-        <w:t xml:space="preserve"> (incluindo </w:t>
+        </w:rPr>
+        <w:t>Thomaz</w:t>
       </w:r>
       <w:r>
         <w:rPr>
           <w:noProof/>
-          <w:highlight w:val="yellow"/>
-        </w:rPr>
-        <w:t>ligação entre DA e MDS</w:t>
+        </w:rPr>
+        <w:t xml:space="preserve"> e </w:t>
       </w:r>
       <w:r>
         <w:rPr>
           <w:noProof/>
-          <w:highlight w:val="yellow"/>
-        </w:rPr>
-        <w:t>)</w:t>
+        </w:rPr>
+        <w:t>Paulo.</w:t>
       </w:r>
     </w:p>
     <w:p>
       <w:pPr>
-        <w:pStyle w:val="ListParagraph"/>
-        <w:numPr>
-          <w:ilvl w:val="0"/>
-          <w:numId w:val="22"/>
-        </w:numPr>
+        <w:pStyle w:val="Heading2"/>
         <w:rPr>
           <w:noProof/>
-          <w:highlight w:val="yellow"/>
-        </w:rPr>
-      </w:pPr>
-      <w:r>
-        <w:rPr>
-          <w:noProof/>
-          <w:highlight w:val="yellow"/>
-        </w:rPr>
-        <w:t>Planeamento geral do projeto</w:t>
-      </w:r>
-    </w:p>
-    <w:p>
-      <w:pPr>
-        <w:pStyle w:val="ListParagraph"/>
-        <w:numPr>
-          <w:ilvl w:val="0"/>
-          <w:numId w:val="22"/>
-        </w:numPr>
-        <w:rPr>
-          <w:noProof/>
-          <w:highlight w:val="yellow"/>
-        </w:rPr>
-      </w:pPr>
-      <w:r>
-        <w:rPr>
-          <w:noProof/>
-          <w:highlight w:val="yellow"/>
-        </w:rPr>
-        <w:t>Equipa envolvida</w:t>
-      </w:r>
-    </w:p>
-    <w:p>
-      <w:pPr>
-        <w:pStyle w:val="ListParagraph"/>
-        <w:numPr>
-          <w:ilvl w:val="0"/>
-          <w:numId w:val="22"/>
-        </w:numPr>
-        <w:rPr>
-          <w:noProof/>
-        </w:rPr>
-      </w:pPr>
-      <w:r>
-        <w:rPr>
-          <w:noProof/>
-          <w:highlight w:val="yellow"/>
-        </w:rPr>
-        <w:t xml:space="preserve">Metodologia ágil adotada </w:t>
-      </w:r>
-      <w:r>
-        <w:rPr>
-          <w:noProof/>
-          <w:highlight w:val="yellow"/>
-        </w:rPr>
-        <w:t>&gt;</w:t>
-      </w:r>
-    </w:p>
-    <w:p>
-      <w:pPr>
-        <w:pStyle w:val="Heading2"/>
-        <w:rPr>
-          <w:noProof/>
-        </w:rPr>
-      </w:pPr>
-      <w:bookmarkStart w:id="3" w:name="_Toc227748416"/>
+        </w:rPr>
+      </w:pPr>
+      <w:bookmarkStart w:id="3" w:name="_Toc230871596"/>
       <w:r>
         <w:rPr>
           <w:noProof/>
@@ -4124,70 +4056,103 @@
     </w:p>
     <w:p>
       <w:r>
-        <w:rPr>
-          <w:highlight w:val="yellow"/>
-        </w:rPr>
-        <w:t xml:space="preserve">&lt;Sumário da estruturação do presente documento (resumo de cada </w:t>
-      </w:r>
-      <w:r>
-        <w:rPr>
-          <w:highlight w:val="yellow"/>
-        </w:rPr>
-        <w:t>capítulo</w:t>
-      </w:r>
-      <w:r>
-        <w:rPr>
-          <w:highlight w:val="yellow"/>
-        </w:rPr>
-        <w:t>). “N</w:t>
-      </w:r>
-      <w:r>
-        <w:rPr>
-          <w:highlight w:val="yellow"/>
-        </w:rPr>
-        <w:t>o</w:t>
-      </w:r>
-      <w:r>
-        <w:rPr>
-          <w:highlight w:val="yellow"/>
-        </w:rPr>
-        <w:t xml:space="preserve"> presente </w:t>
-      </w:r>
-      <w:r>
-        <w:rPr>
-          <w:highlight w:val="yellow"/>
-        </w:rPr>
-        <w:t>capítulo</w:t>
-      </w:r>
-      <w:r>
-        <w:rPr>
-          <w:highlight w:val="yellow"/>
-        </w:rPr>
-        <w:t xml:space="preserve"> é feita uma descrição</w:t>
-      </w:r>
-      <w:r>
-        <w:rPr>
-          <w:highlight w:val="yellow"/>
-        </w:rPr>
-        <w:t xml:space="preserve"> dos objetivos</w:t>
-      </w:r>
-      <w:r>
-        <w:rPr>
-          <w:highlight w:val="yellow"/>
-        </w:rPr>
-        <w:t xml:space="preserve">.... </w:t>
-      </w:r>
-      <w:r>
-        <w:rPr>
-          <w:highlight w:val="yellow"/>
-        </w:rPr>
-        <w:t xml:space="preserve">O capítulo </w:t>
-      </w:r>
-      <w:r>
-        <w:rPr>
-          <w:highlight w:val="yellow"/>
-        </w:rPr>
-        <w:t>2 tem como objetivo...”&gt;</w:t>
+        <w:t>No capítulo</w:t>
+      </w:r>
+      <w:r>
+        <w:t xml:space="preserve"> 1</w:t>
+      </w:r>
+      <w:r>
+        <w:t xml:space="preserve"> é feita </w:t>
+      </w:r>
+      <w:r>
+        <w:t xml:space="preserve">a introdução do </w:t>
+      </w:r>
+      <w:r>
+        <w:t>, descrevendo os seus objetivos, a equipa envolvida e a metodologia de desenvolvimento adotada.</w:t>
+      </w:r>
+    </w:p>
+    <w:p>
+      <w:r>
+        <w:t>No</w:t>
+      </w:r>
+      <w:r>
+        <w:t xml:space="preserve"> capítulo 2 </w:t>
+      </w:r>
+      <w:r>
+        <w:t xml:space="preserve">é </w:t>
+      </w:r>
+      <w:r>
+        <w:t>apresenta</w:t>
+      </w:r>
+      <w:r>
+        <w:t>da</w:t>
+      </w:r>
+      <w:r>
+        <w:t xml:space="preserve"> a especificação do sistema, incluindo </w:t>
+      </w:r>
+      <w:r>
+        <w:t>a</w:t>
+      </w:r>
+      <w:r>
+        <w:t xml:space="preserve"> análise concorrencial a sistemas similares existentes no mercado, os wireframes e mockups </w:t>
+      </w:r>
+      <w:r>
+        <w:t>para a aplicação</w:t>
+      </w:r>
+      <w:r>
+        <w:t>, e o diagrama de classes que modela a estrutura de dados da aplicação.</w:t>
+      </w:r>
+    </w:p>
+    <w:p>
+      <w:r>
+        <w:t>No</w:t>
+      </w:r>
+      <w:r>
+        <w:t xml:space="preserve"> capítulo 3 </w:t>
+      </w:r>
+      <w:r>
+        <w:t>é descrita</w:t>
+      </w:r>
+      <w:r>
+        <w:t xml:space="preserve"> a aplicação da metodologia Scrum ao projeto, identificando os stakeholders, a equipa </w:t>
+      </w:r>
+      <w:r>
+        <w:t xml:space="preserve">do </w:t>
+      </w:r>
+      <w:r>
+        <w:t>Scrum, as User Stories definidas e a execução detalhada de cada sprint, incluindo o trabalho planeado e realizado</w:t>
+      </w:r>
+      <w:r>
+        <w:t>, t</w:t>
+      </w:r>
+      <w:r>
+        <w:t>ermina</w:t>
+      </w:r>
+      <w:r>
+        <w:t>ndo</w:t>
+      </w:r>
+      <w:r>
+        <w:t xml:space="preserve"> com uma retrospetiva global do projeto.</w:t>
+      </w:r>
+    </w:p>
+    <w:p>
+      <w:r>
+        <w:t>E no</w:t>
+      </w:r>
+      <w:r>
+        <w:t xml:space="preserve"> capítulo 4</w:t>
+      </w:r>
+      <w:r>
+        <w:t xml:space="preserve">, são </w:t>
+      </w:r>
+      <w:r>
+        <w:t>apresenta</w:t>
+      </w:r>
+      <w:r>
+        <w:t>das</w:t>
+      </w:r>
+      <w:r>
+        <w:t xml:space="preserve"> as conclusões do projeto, refletindo sobre os resultados obtidos, as dificuldades encontradas e possíveis melhorias futuras.</w:t>
       </w:r>
     </w:p>
     <w:p/>
@@ -4195,7 +4160,7 @@
       <w:pPr>
         <w:pStyle w:val="Heading1"/>
       </w:pPr>
-      <w:bookmarkStart w:id="4" w:name="_Toc227748417"/>
+      <w:bookmarkStart w:id="4" w:name="_Toc230871597"/>
       <w:r>
         <w:lastRenderedPageBreak/>
         <w:t>Especificação do Sistema</w:t>
@@ -4347,7 +4312,7 @@
       <w:pPr>
         <w:pStyle w:val="Heading2"/>
       </w:pPr>
-      <w:bookmarkStart w:id="5" w:name="_Toc227748418"/>
+      <w:bookmarkStart w:id="5" w:name="_Toc230871598"/>
       <w:r>
         <w:t>Análise Concorrencial</w:t>
       </w:r>
@@ -4384,7 +4349,7 @@
       <w:pPr>
         <w:pStyle w:val="Heading3"/>
       </w:pPr>
-      <w:bookmarkStart w:id="6" w:name="_Toc227748419"/>
+      <w:bookmarkStart w:id="6" w:name="_Toc230871599"/>
       <w:r>
         <w:rPr>
           <w:highlight w:val="yellow"/>
@@ -4831,7 +4796,7 @@
       <w:pPr>
         <w:pStyle w:val="Heading3"/>
       </w:pPr>
-      <w:bookmarkStart w:id="8" w:name="_Toc227748420"/>
+      <w:bookmarkStart w:id="8" w:name="_Toc230871600"/>
       <w:r>
         <w:rPr>
           <w:highlight w:val="yellow"/>
@@ -5283,7 +5248,7 @@
       <w:pPr>
         <w:pStyle w:val="Heading3"/>
       </w:pPr>
-      <w:bookmarkStart w:id="10" w:name="_Toc227748421"/>
+      <w:bookmarkStart w:id="10" w:name="_Toc230871601"/>
       <w:r>
         <w:rPr>
           <w:highlight w:val="yellow"/>
@@ -5734,7 +5699,7 @@
       <w:pPr>
         <w:pStyle w:val="Heading3"/>
       </w:pPr>
-      <w:bookmarkStart w:id="12" w:name="_Toc227748422"/>
+      <w:bookmarkStart w:id="12" w:name="_Toc230871602"/>
       <w:r>
         <w:t>Comparação dos Sistemas</w:t>
       </w:r>
@@ -6266,7 +6231,7 @@
       <w:pPr>
         <w:pStyle w:val="Heading3"/>
       </w:pPr>
-      <w:bookmarkStart w:id="14" w:name="_Toc227748423"/>
+      <w:bookmarkStart w:id="14" w:name="_Toc230871603"/>
       <w:r>
         <w:t>Enquadramento da análise concorrencial no SI</w:t>
       </w:r>
@@ -6405,7 +6370,7 @@
       <w:pPr>
         <w:pStyle w:val="Heading2"/>
       </w:pPr>
-      <w:bookmarkStart w:id="15" w:name="_Toc227748424"/>
+      <w:bookmarkStart w:id="15" w:name="_Toc230871604"/>
       <w:r>
         <w:t>Wireframes/Mockups</w:t>
       </w:r>
@@ -6526,7 +6491,7 @@
         <w:pStyle w:val="Heading2"/>
       </w:pPr>
       <w:bookmarkStart w:id="17" w:name="_Toc102664379"/>
-      <w:bookmarkStart w:id="18" w:name="_Toc227748425"/>
+      <w:bookmarkStart w:id="18" w:name="_Toc230871605"/>
       <w:r>
         <w:t>Diagrama de Classes</w:t>
       </w:r>
@@ -6654,7 +6619,7 @@
       <w:pPr>
         <w:pStyle w:val="Heading1"/>
       </w:pPr>
-      <w:bookmarkStart w:id="21" w:name="_Toc227748426"/>
+      <w:bookmarkStart w:id="21" w:name="_Toc230871606"/>
       <w:r>
         <w:lastRenderedPageBreak/>
         <w:t>Scrum</w:t>
@@ -6674,7 +6639,7 @@
       <w:pPr>
         <w:pStyle w:val="Heading2"/>
       </w:pPr>
-      <w:bookmarkStart w:id="22" w:name="_Toc227748427"/>
+      <w:bookmarkStart w:id="22" w:name="_Toc230871607"/>
       <w:r>
         <w:t>Aplicação do Scrum ao Projeto</w:t>
       </w:r>
@@ -6830,7 +6795,7 @@
       <w:pPr>
         <w:pStyle w:val="Heading2"/>
       </w:pPr>
-      <w:bookmarkStart w:id="23" w:name="_Toc227748428"/>
+      <w:bookmarkStart w:id="23" w:name="_Toc230871608"/>
       <w:r>
         <w:t>Stakeholders e Scrum Team</w:t>
       </w:r>
@@ -7184,7 +7149,7 @@
       <w:pPr>
         <w:pStyle w:val="Heading2"/>
       </w:pPr>
-      <w:bookmarkStart w:id="25" w:name="_Toc227748429"/>
+      <w:bookmarkStart w:id="25" w:name="_Toc230871609"/>
       <w:r>
         <w:t>User Stories</w:t>
       </w:r>
@@ -10235,7 +10200,7 @@
       <w:pPr>
         <w:pStyle w:val="Heading2"/>
       </w:pPr>
-      <w:bookmarkStart w:id="26" w:name="_Toc227748430"/>
+      <w:bookmarkStart w:id="26" w:name="_Toc230871610"/>
       <w:r>
         <w:lastRenderedPageBreak/>
         <w:t>Execução do projeto</w:t>
@@ -10376,7 +10341,7 @@
       <w:pPr>
         <w:pStyle w:val="Heading3"/>
       </w:pPr>
-      <w:bookmarkStart w:id="27" w:name="_Toc227748431"/>
+      <w:bookmarkStart w:id="27" w:name="_Toc230871611"/>
       <w:r>
         <w:t>Sprint 1 (</w:t>
       </w:r>
@@ -10539,6 +10504,9 @@
           </w:p>
           <w:p>
             <w:r>
+              <w:rPr>
+                <w:noProof/>
+              </w:rPr>
               <w:drawing>
                 <wp:inline distT="0" distB="0" distL="0" distR="0" wp14:anchorId="39371D5E" wp14:editId="126E843B">
                   <wp:extent cx="6120130" cy="1384300"/>
@@ -11032,108 +11000,6 @@
               <w:t>(nada)</w:t>
             </w:r>
           </w:p>
-          <w:p>
-            <w:pPr>
-              <w:jc w:val="left"/>
-              <w:rPr>
-                <w:b w:val="0"/>
-                <w:bCs w:val="0"/>
-              </w:rPr>
-            </w:pPr>
-            <w:r>
-              <w:t>Artur</w:t>
-            </w:r>
-          </w:p>
-          <w:p>
-            <w:pPr>
-              <w:pStyle w:val="ListParagraph"/>
-              <w:numPr>
-                <w:ilvl w:val="0"/>
-                <w:numId w:val="14"/>
-              </w:numPr>
-              <w:contextualSpacing w:val="0"/>
-              <w:jc w:val="left"/>
-              <w:rPr>
-                <w:b w:val="0"/>
-                <w:bCs w:val="0"/>
-              </w:rPr>
-            </w:pPr>
-            <w:r>
-              <w:rPr>
-                <w:b w:val="0"/>
-                <w:bCs w:val="0"/>
-                <w:u w:val="single"/>
-              </w:rPr>
-              <w:t>O que fez na semana anterior</w:t>
-            </w:r>
-            <w:r>
-              <w:rPr>
-                <w:b w:val="0"/>
-                <w:bCs w:val="0"/>
-              </w:rPr>
-              <w:t xml:space="preserve">: </w:t>
-            </w:r>
-          </w:p>
-          <w:p>
-            <w:pPr>
-              <w:pStyle w:val="ListParagraph"/>
-              <w:numPr>
-                <w:ilvl w:val="0"/>
-                <w:numId w:val="14"/>
-              </w:numPr>
-              <w:contextualSpacing w:val="0"/>
-              <w:jc w:val="left"/>
-              <w:rPr>
-                <w:b w:val="0"/>
-                <w:bCs w:val="0"/>
-              </w:rPr>
-            </w:pPr>
-            <w:r>
-              <w:rPr>
-                <w:b w:val="0"/>
-                <w:bCs w:val="0"/>
-                <w:u w:val="single"/>
-              </w:rPr>
-              <w:t>O que vai fazer esta semana</w:t>
-            </w:r>
-            <w:r>
-              <w:rPr>
-                <w:b w:val="0"/>
-                <w:bCs w:val="0"/>
-              </w:rPr>
-              <w:t>:</w:t>
-            </w:r>
-          </w:p>
-          <w:p>
-            <w:pPr>
-              <w:pStyle w:val="ListParagraph"/>
-              <w:numPr>
-                <w:ilvl w:val="0"/>
-                <w:numId w:val="14"/>
-              </w:numPr>
-              <w:contextualSpacing w:val="0"/>
-              <w:jc w:val="left"/>
-              <w:rPr>
-                <w:b w:val="0"/>
-                <w:bCs w:val="0"/>
-              </w:rPr>
-            </w:pPr>
-            <w:r>
-              <w:rPr>
-                <w:b w:val="0"/>
-                <w:bCs w:val="0"/>
-                <w:u w:val="single"/>
-              </w:rPr>
-              <w:t>Dificuldades que prevê</w:t>
-            </w:r>
-            <w:r>
-              <w:rPr>
-                <w:b w:val="0"/>
-                <w:bCs w:val="0"/>
-              </w:rPr>
-              <w:t>:</w:t>
-            </w:r>
-          </w:p>
         </w:tc>
       </w:tr>
     </w:tbl>
@@ -11801,39 +11667,39 @@
                 <w:bCs w:val="0"/>
                 <w:highlight w:val="yellow"/>
               </w:rPr>
+              <w:t>&lt;</w:t>
+            </w:r>
+            <w:r>
+              <w:rPr>
+                <w:b w:val="0"/>
+                <w:bCs w:val="0"/>
+                <w:highlight w:val="yellow"/>
+              </w:rPr>
+              <w:t xml:space="preserve">retirar do jira </w:t>
+            </w:r>
+            <w:r>
+              <w:rPr>
+                <w:b w:val="0"/>
+                <w:bCs w:val="0"/>
+                <w:highlight w:val="yellow"/>
+              </w:rPr>
+              <w:t xml:space="preserve">o gráfico e tabela de eventos </w:t>
+            </w:r>
+            <w:r>
+              <w:rPr>
+                <w:b w:val="0"/>
+                <w:bCs w:val="0"/>
+                <w:highlight w:val="yellow"/>
+              </w:rPr>
+              <w:t>tal como na imagem:&gt;</w:t>
+            </w:r>
+          </w:p>
+          <w:p>
+            <w:r>
+              <w:rPr>
+                <w:noProof/>
+              </w:rPr>
               <w:lastRenderedPageBreak/>
-              <w:t>&lt;</w:t>
-            </w:r>
-            <w:r>
-              <w:rPr>
-                <w:b w:val="0"/>
-                <w:bCs w:val="0"/>
-                <w:highlight w:val="yellow"/>
-              </w:rPr>
-              <w:t xml:space="preserve">retirar do jira </w:t>
-            </w:r>
-            <w:r>
-              <w:rPr>
-                <w:b w:val="0"/>
-                <w:bCs w:val="0"/>
-                <w:highlight w:val="yellow"/>
-              </w:rPr>
-              <w:t xml:space="preserve">o gráfico e tabela de eventos </w:t>
-            </w:r>
-            <w:r>
-              <w:rPr>
-                <w:b w:val="0"/>
-                <w:bCs w:val="0"/>
-                <w:highlight w:val="yellow"/>
-              </w:rPr>
-              <w:t>tal como na imagem:&gt;</w:t>
-            </w:r>
-          </w:p>
-          <w:p>
-            <w:r>
-              <w:rPr>
-                <w:noProof/>
-              </w:rPr>
               <w:drawing>
                 <wp:inline distT="0" distB="0" distL="0" distR="0" wp14:anchorId="16694A60" wp14:editId="605708C2">
                   <wp:extent cx="6120130" cy="6272530"/>
@@ -11881,7 +11747,7 @@
       <w:pPr>
         <w:pStyle w:val="Heading3"/>
       </w:pPr>
-      <w:bookmarkStart w:id="28" w:name="_Toc227748432"/>
+      <w:bookmarkStart w:id="28" w:name="_Toc230871612"/>
       <w:r>
         <w:t>Sprint 2 (</w:t>
       </w:r>
@@ -12048,7 +11914,6 @@
                 <w:i/>
                 <w:iCs/>
               </w:rPr>
-              <w:lastRenderedPageBreak/>
               <w:t>Sprint Backlog</w:t>
             </w:r>
             <w:r>
@@ -12943,7 +12808,6 @@
         <w:pStyle w:val="Heading4"/>
       </w:pPr>
       <w:r>
-        <w:lastRenderedPageBreak/>
         <w:t>Sprint Retrospective</w:t>
       </w:r>
     </w:p>
@@ -13010,6 +12874,7 @@
               </w:rPr>
             </w:pPr>
             <w:r>
+              <w:lastRenderedPageBreak/>
               <w:t>Data:</w:t>
             </w:r>
           </w:p>
@@ -13234,7 +13099,7 @@
       <w:pPr>
         <w:pStyle w:val="Heading3"/>
       </w:pPr>
-      <w:bookmarkStart w:id="29" w:name="_Toc227748433"/>
+      <w:bookmarkStart w:id="29" w:name="_Toc230871613"/>
       <w:r>
         <w:t>Sprint 3 (</w:t>
       </w:r>
@@ -13849,7 +13714,6 @@
                 <w:bCs w:val="0"/>
                 <w:u w:val="single"/>
               </w:rPr>
-              <w:lastRenderedPageBreak/>
               <w:t>Dificuldades que prevê</w:t>
             </w:r>
             <w:r>
@@ -13926,6 +13790,7 @@
               </w:rPr>
             </w:pPr>
             <w:r>
+              <w:lastRenderedPageBreak/>
               <w:t>Data:</w:t>
             </w:r>
           </w:p>
@@ -14581,7 +14446,7 @@
       <w:pPr>
         <w:pStyle w:val="Heading2"/>
       </w:pPr>
-      <w:bookmarkStart w:id="30" w:name="_Toc227748434"/>
+      <w:bookmarkStart w:id="30" w:name="_Toc230871614"/>
       <w:r>
         <w:rPr>
           <w:i/>
@@ -14717,7 +14582,6 @@
                 <w:b w:val="0"/>
                 <w:bCs w:val="0"/>
               </w:rPr>
-              <w:lastRenderedPageBreak/>
               <w:t>...</w:t>
             </w:r>
           </w:p>
@@ -14785,6 +14649,7 @@
                 <w:iCs/>
                 <w:lang w:val="en-US"/>
               </w:rPr>
+              <w:lastRenderedPageBreak/>
               <w:t>Things that could have gone better</w:t>
             </w:r>
           </w:p>
@@ -15247,7 +15112,7 @@
       <w:pPr>
         <w:pStyle w:val="Heading1"/>
       </w:pPr>
-      <w:bookmarkStart w:id="31" w:name="_Toc227748435"/>
+      <w:bookmarkStart w:id="31" w:name="_Toc230871615"/>
       <w:r>
         <w:lastRenderedPageBreak/>
         <w:t>Conclus</w:t>
@@ -15739,7 +15604,10 @@
               <w:t xml:space="preserve">                                                            </w:t>
             </w:r>
             <w:r>
-              <w:t xml:space="preserve">              Página </w:t>
+              <w:t xml:space="preserve">              </w:t>
+            </w:r>
+            <w:r>
+              <w:t xml:space="preserve">Página </w:t>
             </w:r>
             <w:r>
               <w:rPr>
@@ -20220,7 +20088,6 @@
   <w:style w:type="character" w:default="1" w:styleId="DefaultParagraphFont">
     <w:name w:val="Default Paragraph Font"/>
     <w:uiPriority w:val="1"/>
-    <w:semiHidden/>
     <w:unhideWhenUsed/>
   </w:style>
   <w:style w:type="table" w:default="1" w:styleId="TableNormal">

</xml_diff>

<commit_message>
Modo de compra feito
</commit_message>
<xml_diff>
--- a/IPL-TeSP-PSI-MDS-2526-Template_Projeto.docx
+++ b/IPL-TeSP-PSI-MDS-2526-Template_Projeto.docx
@@ -954,7 +954,7 @@
             </w:rPr>
             <w:fldChar w:fldCharType="separate"/>
           </w:r>
-          <w:hyperlink w:anchor="_Toc231221391" w:history="1">
+          <w:hyperlink w:anchor="_Toc230871593" w:history="1">
             <w:r>
               <w:rPr>
                 <w:rStyle w:val="Hyperlink"/>
@@ -981,7 +981,7 @@
                 <w:noProof/>
                 <w:webHidden/>
               </w:rPr>
-              <w:instrText xml:space="preserve"> PAGEREF _Toc231221391 \h </w:instrText>
+              <w:instrText xml:space="preserve"> PAGEREF _Toc230871593 \h </w:instrText>
             </w:r>
             <w:r>
               <w:rPr>
@@ -1032,7 +1032,7 @@
               <w14:ligatures w14:val="standardContextual"/>
             </w:rPr>
           </w:pPr>
-          <w:hyperlink w:anchor="_Toc231221392" w:history="1">
+          <w:hyperlink w:anchor="_Toc230871594" w:history="1">
             <w:r>
               <w:rPr>
                 <w:rStyle w:val="Hyperlink"/>
@@ -1059,7 +1059,7 @@
                 <w:noProof/>
                 <w:webHidden/>
               </w:rPr>
-              <w:instrText xml:space="preserve"> PAGEREF _Toc231221392 \h </w:instrText>
+              <w:instrText xml:space="preserve"> PAGEREF _Toc230871594 \h </w:instrText>
             </w:r>
             <w:r>
               <w:rPr>
@@ -1111,7 +1111,7 @@
               <w14:ligatures w14:val="standardContextual"/>
             </w:rPr>
           </w:pPr>
-          <w:hyperlink w:anchor="_Toc231221393" w:history="1">
+          <w:hyperlink w:anchor="_Toc230871595" w:history="1">
             <w:r>
               <w:rPr>
                 <w:rStyle w:val="Hyperlink"/>
@@ -1161,7 +1161,7 @@
                 <w:noProof/>
                 <w:webHidden/>
               </w:rPr>
-              <w:instrText xml:space="preserve"> PAGEREF _Toc231221393 \h </w:instrText>
+              <w:instrText xml:space="preserve"> PAGEREF _Toc230871595 \h </w:instrText>
             </w:r>
             <w:r>
               <w:rPr>
@@ -1212,7 +1212,7 @@
               <w14:ligatures w14:val="standardContextual"/>
             </w:rPr>
           </w:pPr>
-          <w:hyperlink w:anchor="_Toc231221394" w:history="1">
+          <w:hyperlink w:anchor="_Toc230871596" w:history="1">
             <w:r>
               <w:rPr>
                 <w:rStyle w:val="Hyperlink"/>
@@ -1261,7 +1261,7 @@
                 <w:noProof/>
                 <w:webHidden/>
               </w:rPr>
-              <w:instrText xml:space="preserve"> PAGEREF _Toc231221394 \h </w:instrText>
+              <w:instrText xml:space="preserve"> PAGEREF _Toc230871596 \h </w:instrText>
             </w:r>
             <w:r>
               <w:rPr>
@@ -1313,7 +1313,7 @@
               <w14:ligatures w14:val="standardContextual"/>
             </w:rPr>
           </w:pPr>
-          <w:hyperlink w:anchor="_Toc231221395" w:history="1">
+          <w:hyperlink w:anchor="_Toc230871597" w:history="1">
             <w:r>
               <w:rPr>
                 <w:rStyle w:val="Hyperlink"/>
@@ -1363,7 +1363,7 @@
                 <w:noProof/>
                 <w:webHidden/>
               </w:rPr>
-              <w:instrText xml:space="preserve"> PAGEREF _Toc231221395 \h </w:instrText>
+              <w:instrText xml:space="preserve"> PAGEREF _Toc230871597 \h </w:instrText>
             </w:r>
             <w:r>
               <w:rPr>
@@ -1414,7 +1414,7 @@
               <w14:ligatures w14:val="standardContextual"/>
             </w:rPr>
           </w:pPr>
-          <w:hyperlink w:anchor="_Toc231221396" w:history="1">
+          <w:hyperlink w:anchor="_Toc230871598" w:history="1">
             <w:r>
               <w:rPr>
                 <w:rStyle w:val="Hyperlink"/>
@@ -1463,7 +1463,7 @@
                 <w:noProof/>
                 <w:webHidden/>
               </w:rPr>
-              <w:instrText xml:space="preserve"> PAGEREF _Toc231221396 \h </w:instrText>
+              <w:instrText xml:space="preserve"> PAGEREF _Toc230871598 \h </w:instrText>
             </w:r>
             <w:r>
               <w:rPr>
@@ -1512,7 +1512,7 @@
               <w14:ligatures w14:val="standardContextual"/>
             </w:rPr>
           </w:pPr>
-          <w:hyperlink w:anchor="_Toc231221397" w:history="1">
+          <w:hyperlink w:anchor="_Toc230871599" w:history="1">
             <w:r>
               <w:rPr>
                 <w:rStyle w:val="Hyperlink"/>
@@ -1537,8 +1537,9 @@
               <w:rPr>
                 <w:rStyle w:val="Hyperlink"/>
                 <w:noProof/>
-              </w:rPr>
-              <w:t>AnyList</w:t>
+                <w:highlight w:val="yellow"/>
+              </w:rPr>
+              <w:t>&lt;Sistema 1 (mudar o nome para o website/aplicação escolhida para análise)&gt;</w:t>
             </w:r>
             <w:r>
               <w:rPr>
@@ -1559,7 +1560,7 @@
                 <w:noProof/>
                 <w:webHidden/>
               </w:rPr>
-              <w:instrText xml:space="preserve"> PAGEREF _Toc231221397 \h </w:instrText>
+              <w:instrText xml:space="preserve"> PAGEREF _Toc230871599 \h </w:instrText>
             </w:r>
             <w:r>
               <w:rPr>
@@ -1608,7 +1609,7 @@
               <w14:ligatures w14:val="standardContextual"/>
             </w:rPr>
           </w:pPr>
-          <w:hyperlink w:anchor="_Toc231221398" w:history="1">
+          <w:hyperlink w:anchor="_Toc230871600" w:history="1">
             <w:r>
               <w:rPr>
                 <w:rStyle w:val="Hyperlink"/>
@@ -1633,8 +1634,9 @@
               <w:rPr>
                 <w:rStyle w:val="Hyperlink"/>
                 <w:noProof/>
-              </w:rPr>
-              <w:t>Bring!</w:t>
+                <w:highlight w:val="yellow"/>
+              </w:rPr>
+              <w:t>&lt;Sistema 2 (mudar o nome para o website/aplicação escolhida para análise)&gt;</w:t>
             </w:r>
             <w:r>
               <w:rPr>
@@ -1655,7 +1657,7 @@
                 <w:noProof/>
                 <w:webHidden/>
               </w:rPr>
-              <w:instrText xml:space="preserve"> PAGEREF _Toc231221398 \h </w:instrText>
+              <w:instrText xml:space="preserve"> PAGEREF _Toc230871600 \h </w:instrText>
             </w:r>
             <w:r>
               <w:rPr>
@@ -1704,12 +1706,11 @@
               <w14:ligatures w14:val="standardContextual"/>
             </w:rPr>
           </w:pPr>
-          <w:hyperlink w:anchor="_Toc231221399" w:history="1">
+          <w:hyperlink w:anchor="_Toc230871601" w:history="1">
             <w:r>
               <w:rPr>
                 <w:rStyle w:val="Hyperlink"/>
                 <w:noProof/>
-                <w:lang w:val="en-GB"/>
               </w:rPr>
               <w:t>2.1.3</w:t>
             </w:r>
@@ -1730,9 +1731,9 @@
               <w:rPr>
                 <w:rStyle w:val="Hyperlink"/>
                 <w:noProof/>
-                <w:lang w:val="en-GB"/>
-              </w:rPr>
-              <w:t>YNAB (You Need A Budget)</w:t>
+                <w:highlight w:val="yellow"/>
+              </w:rPr>
+              <w:t>&lt;Sistema 3 (mudar o nome para o website/aplicação escolhida para análise)&gt;</w:t>
             </w:r>
             <w:r>
               <w:rPr>
@@ -1753,7 +1754,7 @@
                 <w:noProof/>
                 <w:webHidden/>
               </w:rPr>
-              <w:instrText xml:space="preserve"> PAGEREF _Toc231221399 \h </w:instrText>
+              <w:instrText xml:space="preserve"> PAGEREF _Toc230871601 \h </w:instrText>
             </w:r>
             <w:r>
               <w:rPr>
@@ -1802,7 +1803,7 @@
               <w14:ligatures w14:val="standardContextual"/>
             </w:rPr>
           </w:pPr>
-          <w:hyperlink w:anchor="_Toc231221400" w:history="1">
+          <w:hyperlink w:anchor="_Toc230871602" w:history="1">
             <w:r>
               <w:rPr>
                 <w:rStyle w:val="Hyperlink"/>
@@ -1849,7 +1850,7 @@
                 <w:noProof/>
                 <w:webHidden/>
               </w:rPr>
-              <w:instrText xml:space="preserve"> PAGEREF _Toc231221400 \h </w:instrText>
+              <w:instrText xml:space="preserve"> PAGEREF _Toc230871602 \h </w:instrText>
             </w:r>
             <w:r>
               <w:rPr>
@@ -1898,7 +1899,7 @@
               <w14:ligatures w14:val="standardContextual"/>
             </w:rPr>
           </w:pPr>
-          <w:hyperlink w:anchor="_Toc231221401" w:history="1">
+          <w:hyperlink w:anchor="_Toc230871603" w:history="1">
             <w:r>
               <w:rPr>
                 <w:rStyle w:val="Hyperlink"/>
@@ -1945,7 +1946,7 @@
                 <w:noProof/>
                 <w:webHidden/>
               </w:rPr>
-              <w:instrText xml:space="preserve"> PAGEREF _Toc231221401 \h </w:instrText>
+              <w:instrText xml:space="preserve"> PAGEREF _Toc230871603 \h </w:instrText>
             </w:r>
             <w:r>
               <w:rPr>
@@ -1965,7 +1966,7 @@
                 <w:noProof/>
                 <w:webHidden/>
               </w:rPr>
-              <w:t>10</w:t>
+              <w:t>9</w:t>
             </w:r>
             <w:r>
               <w:rPr>
@@ -1996,7 +1997,7 @@
               <w14:ligatures w14:val="standardContextual"/>
             </w:rPr>
           </w:pPr>
-          <w:hyperlink w:anchor="_Toc231221402" w:history="1">
+          <w:hyperlink w:anchor="_Toc230871604" w:history="1">
             <w:r>
               <w:rPr>
                 <w:rStyle w:val="Hyperlink"/>
@@ -2045,7 +2046,7 @@
                 <w:noProof/>
                 <w:webHidden/>
               </w:rPr>
-              <w:instrText xml:space="preserve"> PAGEREF _Toc231221402 \h </w:instrText>
+              <w:instrText xml:space="preserve"> PAGEREF _Toc230871604 \h </w:instrText>
             </w:r>
             <w:r>
               <w:rPr>
@@ -2065,7 +2066,7 @@
                 <w:noProof/>
                 <w:webHidden/>
               </w:rPr>
-              <w:t>10</w:t>
+              <w:t>9</w:t>
             </w:r>
             <w:r>
               <w:rPr>
@@ -2096,7 +2097,7 @@
               <w14:ligatures w14:val="standardContextual"/>
             </w:rPr>
           </w:pPr>
-          <w:hyperlink w:anchor="_Toc231221403" w:history="1">
+          <w:hyperlink w:anchor="_Toc230871605" w:history="1">
             <w:r>
               <w:rPr>
                 <w:rStyle w:val="Hyperlink"/>
@@ -2145,7 +2146,7 @@
                 <w:noProof/>
                 <w:webHidden/>
               </w:rPr>
-              <w:instrText xml:space="preserve"> PAGEREF _Toc231221403 \h </w:instrText>
+              <w:instrText xml:space="preserve"> PAGEREF _Toc230871605 \h </w:instrText>
             </w:r>
             <w:r>
               <w:rPr>
@@ -2165,7 +2166,7 @@
                 <w:noProof/>
                 <w:webHidden/>
               </w:rPr>
-              <w:t>11</w:t>
+              <w:t>10</w:t>
             </w:r>
             <w:r>
               <w:rPr>
@@ -2197,7 +2198,7 @@
               <w14:ligatures w14:val="standardContextual"/>
             </w:rPr>
           </w:pPr>
-          <w:hyperlink w:anchor="_Toc231221404" w:history="1">
+          <w:hyperlink w:anchor="_Toc230871606" w:history="1">
             <w:r>
               <w:rPr>
                 <w:rStyle w:val="Hyperlink"/>
@@ -2247,7 +2248,7 @@
                 <w:noProof/>
                 <w:webHidden/>
               </w:rPr>
-              <w:instrText xml:space="preserve"> PAGEREF _Toc231221404 \h </w:instrText>
+              <w:instrText xml:space="preserve"> PAGEREF _Toc230871606 \h </w:instrText>
             </w:r>
             <w:r>
               <w:rPr>
@@ -2267,7 +2268,7 @@
                 <w:noProof/>
                 <w:webHidden/>
               </w:rPr>
-              <w:t>13</w:t>
+              <w:t>12</w:t>
             </w:r>
             <w:r>
               <w:rPr>
@@ -2298,7 +2299,7 @@
               <w14:ligatures w14:val="standardContextual"/>
             </w:rPr>
           </w:pPr>
-          <w:hyperlink w:anchor="_Toc231221405" w:history="1">
+          <w:hyperlink w:anchor="_Toc230871607" w:history="1">
             <w:r>
               <w:rPr>
                 <w:rStyle w:val="Hyperlink"/>
@@ -2347,7 +2348,7 @@
                 <w:noProof/>
                 <w:webHidden/>
               </w:rPr>
-              <w:instrText xml:space="preserve"> PAGEREF _Toc231221405 \h </w:instrText>
+              <w:instrText xml:space="preserve"> PAGEREF _Toc230871607 \h </w:instrText>
             </w:r>
             <w:r>
               <w:rPr>
@@ -2367,7 +2368,7 @@
                 <w:noProof/>
                 <w:webHidden/>
               </w:rPr>
-              <w:t>13</w:t>
+              <w:t>12</w:t>
             </w:r>
             <w:r>
               <w:rPr>
@@ -2398,7 +2399,7 @@
               <w14:ligatures w14:val="standardContextual"/>
             </w:rPr>
           </w:pPr>
-          <w:hyperlink w:anchor="_Toc231221406" w:history="1">
+          <w:hyperlink w:anchor="_Toc230871608" w:history="1">
             <w:r>
               <w:rPr>
                 <w:rStyle w:val="Hyperlink"/>
@@ -2447,7 +2448,7 @@
                 <w:noProof/>
                 <w:webHidden/>
               </w:rPr>
-              <w:instrText xml:space="preserve"> PAGEREF _Toc231221406 \h </w:instrText>
+              <w:instrText xml:space="preserve"> PAGEREF _Toc230871608 \h </w:instrText>
             </w:r>
             <w:r>
               <w:rPr>
@@ -2467,7 +2468,7 @@
                 <w:noProof/>
                 <w:webHidden/>
               </w:rPr>
-              <w:t>13</w:t>
+              <w:t>12</w:t>
             </w:r>
             <w:r>
               <w:rPr>
@@ -2498,7 +2499,7 @@
               <w14:ligatures w14:val="standardContextual"/>
             </w:rPr>
           </w:pPr>
-          <w:hyperlink w:anchor="_Toc231221407" w:history="1">
+          <w:hyperlink w:anchor="_Toc230871609" w:history="1">
             <w:r>
               <w:rPr>
                 <w:rStyle w:val="Hyperlink"/>
@@ -2547,7 +2548,7 @@
                 <w:noProof/>
                 <w:webHidden/>
               </w:rPr>
-              <w:instrText xml:space="preserve"> PAGEREF _Toc231221407 \h </w:instrText>
+              <w:instrText xml:space="preserve"> PAGEREF _Toc230871609 \h </w:instrText>
             </w:r>
             <w:r>
               <w:rPr>
@@ -2567,7 +2568,7 @@
                 <w:noProof/>
                 <w:webHidden/>
               </w:rPr>
-              <w:t>13</w:t>
+              <w:t>12</w:t>
             </w:r>
             <w:r>
               <w:rPr>
@@ -2598,7 +2599,7 @@
               <w14:ligatures w14:val="standardContextual"/>
             </w:rPr>
           </w:pPr>
-          <w:hyperlink w:anchor="_Toc231221408" w:history="1">
+          <w:hyperlink w:anchor="_Toc230871610" w:history="1">
             <w:r>
               <w:rPr>
                 <w:rStyle w:val="Hyperlink"/>
@@ -2647,7 +2648,7 @@
                 <w:noProof/>
                 <w:webHidden/>
               </w:rPr>
-              <w:instrText xml:space="preserve"> PAGEREF _Toc231221408 \h </w:instrText>
+              <w:instrText xml:space="preserve"> PAGEREF _Toc230871610 \h </w:instrText>
             </w:r>
             <w:r>
               <w:rPr>
@@ -2667,7 +2668,7 @@
                 <w:noProof/>
                 <w:webHidden/>
               </w:rPr>
-              <w:t>17</w:t>
+              <w:t>16</w:t>
             </w:r>
             <w:r>
               <w:rPr>
@@ -2696,7 +2697,7 @@
               <w14:ligatures w14:val="standardContextual"/>
             </w:rPr>
           </w:pPr>
-          <w:hyperlink w:anchor="_Toc231221409" w:history="1">
+          <w:hyperlink w:anchor="_Toc230871611" w:history="1">
             <w:r>
               <w:rPr>
                 <w:rStyle w:val="Hyperlink"/>
@@ -2758,7 +2759,7 @@
                 <w:noProof/>
                 <w:webHidden/>
               </w:rPr>
-              <w:instrText xml:space="preserve"> PAGEREF _Toc231221409 \h </w:instrText>
+              <w:instrText xml:space="preserve"> PAGEREF _Toc230871611 \h </w:instrText>
             </w:r>
             <w:r>
               <w:rPr>
@@ -2778,7 +2779,7 @@
                 <w:noProof/>
                 <w:webHidden/>
               </w:rPr>
-              <w:t>17</w:t>
+              <w:t>16</w:t>
             </w:r>
             <w:r>
               <w:rPr>
@@ -2807,7 +2808,7 @@
               <w14:ligatures w14:val="standardContextual"/>
             </w:rPr>
           </w:pPr>
-          <w:hyperlink w:anchor="_Toc231221410" w:history="1">
+          <w:hyperlink w:anchor="_Toc230871612" w:history="1">
             <w:r>
               <w:rPr>
                 <w:rStyle w:val="Hyperlink"/>
@@ -2869,7 +2870,7 @@
                 <w:noProof/>
                 <w:webHidden/>
               </w:rPr>
-              <w:instrText xml:space="preserve"> PAGEREF _Toc231221410 \h </w:instrText>
+              <w:instrText xml:space="preserve"> PAGEREF _Toc230871612 \h </w:instrText>
             </w:r>
             <w:r>
               <w:rPr>
@@ -2889,7 +2890,7 @@
                 <w:noProof/>
                 <w:webHidden/>
               </w:rPr>
-              <w:t>19</w:t>
+              <w:t>18</w:t>
             </w:r>
             <w:r>
               <w:rPr>
@@ -2918,7 +2919,7 @@
               <w14:ligatures w14:val="standardContextual"/>
             </w:rPr>
           </w:pPr>
-          <w:hyperlink w:anchor="_Toc231221411" w:history="1">
+          <w:hyperlink w:anchor="_Toc230871613" w:history="1">
             <w:r>
               <w:rPr>
                 <w:rStyle w:val="Hyperlink"/>
@@ -2980,7 +2981,7 @@
                 <w:noProof/>
                 <w:webHidden/>
               </w:rPr>
-              <w:instrText xml:space="preserve"> PAGEREF _Toc231221411 \h </w:instrText>
+              <w:instrText xml:space="preserve"> PAGEREF _Toc230871613 \h </w:instrText>
             </w:r>
             <w:r>
               <w:rPr>
@@ -3000,7 +3001,7 @@
                 <w:noProof/>
                 <w:webHidden/>
               </w:rPr>
-              <w:t>21</w:t>
+              <w:t>20</w:t>
             </w:r>
             <w:r>
               <w:rPr>
@@ -3031,7 +3032,7 @@
               <w14:ligatures w14:val="standardContextual"/>
             </w:rPr>
           </w:pPr>
-          <w:hyperlink w:anchor="_Toc231221412" w:history="1">
+          <w:hyperlink w:anchor="_Toc230871614" w:history="1">
             <w:r>
               <w:rPr>
                 <w:rStyle w:val="Hyperlink"/>
@@ -3089,7 +3090,7 @@
                 <w:noProof/>
                 <w:webHidden/>
               </w:rPr>
-              <w:instrText xml:space="preserve"> PAGEREF _Toc231221412 \h </w:instrText>
+              <w:instrText xml:space="preserve"> PAGEREF _Toc230871614 \h </w:instrText>
             </w:r>
             <w:r>
               <w:rPr>
@@ -3109,7 +3110,7 @@
                 <w:noProof/>
                 <w:webHidden/>
               </w:rPr>
-              <w:t>22</w:t>
+              <w:t>21</w:t>
             </w:r>
             <w:r>
               <w:rPr>
@@ -3141,7 +3142,7 @@
               <w14:ligatures w14:val="standardContextual"/>
             </w:rPr>
           </w:pPr>
-          <w:hyperlink w:anchor="_Toc231221413" w:history="1">
+          <w:hyperlink w:anchor="_Toc230871615" w:history="1">
             <w:r>
               <w:rPr>
                 <w:rStyle w:val="Hyperlink"/>
@@ -3191,7 +3192,7 @@
                 <w:noProof/>
                 <w:webHidden/>
               </w:rPr>
-              <w:instrText xml:space="preserve"> PAGEREF _Toc231221413 \h </w:instrText>
+              <w:instrText xml:space="preserve"> PAGEREF _Toc230871615 \h </w:instrText>
             </w:r>
             <w:r>
               <w:rPr>
@@ -3211,7 +3212,7 @@
                 <w:noProof/>
                 <w:webHidden/>
               </w:rPr>
-              <w:t>24</w:t>
+              <w:t>23</w:t>
             </w:r>
             <w:r>
               <w:rPr>
@@ -3266,7 +3267,7 @@
           <w:noProof/>
         </w:rPr>
       </w:pPr>
-      <w:bookmarkStart w:id="0" w:name="_Toc231221391"/>
+      <w:bookmarkStart w:id="0" w:name="_Toc230871593"/>
       <w:r>
         <w:rPr>
           <w:noProof/>
@@ -3289,7 +3290,7 @@
           <w:kern w:val="2"/>
           <w:sz w:val="24"/>
           <w:szCs w:val="24"/>
-          <w:lang w:val="en-GB" w:eastAsia="en-GB"/>
+          <w:lang w:eastAsia="en-GB"/>
           <w14:ligatures w14:val="standardContextual"/>
         </w:rPr>
       </w:pPr>
@@ -3302,7 +3303,7 @@
       <w:r>
         <w:fldChar w:fldCharType="separate"/>
       </w:r>
-      <w:hyperlink w:anchor="_Toc231221414" w:history="1">
+      <w:hyperlink w:anchor="_Toc227746380" w:history="1">
         <w:r>
           <w:rPr>
             <w:rStyle w:val="Hyperlink"/>
@@ -3337,7 +3338,7 @@
             <w:noProof/>
             <w:webHidden/>
           </w:rPr>
-          <w:instrText xml:space="preserve"> PAGEREF _Toc231221414 \h </w:instrText>
+          <w:instrText xml:space="preserve"> PAGEREF _Toc227746380 \h </w:instrText>
         </w:r>
         <w:r>
           <w:rPr>
@@ -3357,7 +3358,7 @@
             <w:noProof/>
             <w:webHidden/>
           </w:rPr>
-          <w:t>11</w:t>
+          <w:t>10</w:t>
         </w:r>
         <w:r>
           <w:rPr>
@@ -3380,11 +3381,11 @@
           <w:kern w:val="2"/>
           <w:sz w:val="24"/>
           <w:szCs w:val="24"/>
-          <w:lang w:val="en-GB" w:eastAsia="en-GB"/>
+          <w:lang w:eastAsia="en-GB"/>
           <w14:ligatures w14:val="standardContextual"/>
         </w:rPr>
       </w:pPr>
-      <w:hyperlink w:anchor="_Toc231221415" w:history="1">
+      <w:hyperlink w:anchor="_Toc227746381" w:history="1">
         <w:r>
           <w:rPr>
             <w:rStyle w:val="Hyperlink"/>
@@ -3419,7 +3420,438 @@
             <w:noProof/>
             <w:webHidden/>
           </w:rPr>
-          <w:instrText xml:space="preserve"> PAGEREF _Toc231221415 \h </w:instrText>
+          <w:instrText xml:space="preserve"> PAGEREF _Toc227746381 \h </w:instrText>
+        </w:r>
+        <w:r>
+          <w:rPr>
+            <w:noProof/>
+            <w:webHidden/>
+          </w:rPr>
+        </w:r>
+        <w:r>
+          <w:rPr>
+            <w:noProof/>
+            <w:webHidden/>
+          </w:rPr>
+          <w:fldChar w:fldCharType="separate"/>
+        </w:r>
+        <w:r>
+          <w:rPr>
+            <w:noProof/>
+            <w:webHidden/>
+          </w:rPr>
+          <w:t>11</w:t>
+        </w:r>
+        <w:r>
+          <w:rPr>
+            <w:noProof/>
+            <w:webHidden/>
+          </w:rPr>
+          <w:fldChar w:fldCharType="end"/>
+        </w:r>
+      </w:hyperlink>
+    </w:p>
+    <w:p>
+      <w:r>
+        <w:fldChar w:fldCharType="end"/>
+      </w:r>
+    </w:p>
+    <w:p/>
+    <w:p>
+      <w:r>
+        <w:br w:type="page"/>
+      </w:r>
+    </w:p>
+    <w:p>
+      <w:pPr>
+        <w:pStyle w:val="Heading1"/>
+        <w:numPr>
+          <w:ilvl w:val="0"/>
+          <w:numId w:val="0"/>
+        </w:numPr>
+        <w:ind w:left="432" w:hanging="432"/>
+      </w:pPr>
+      <w:bookmarkStart w:id="1" w:name="_Toc230871594"/>
+      <w:r>
+        <w:lastRenderedPageBreak/>
+        <w:t>Índice de Tabelas</w:t>
+      </w:r>
+      <w:bookmarkEnd w:id="1"/>
+    </w:p>
+    <w:p/>
+    <w:p>
+      <w:pPr>
+        <w:pStyle w:val="TableofFigures"/>
+        <w:tabs>
+          <w:tab w:val="right" w:leader="dot" w:pos="9628"/>
+        </w:tabs>
+        <w:rPr>
+          <w:rFonts w:eastAsiaTheme="minorEastAsia"/>
+          <w:noProof/>
+          <w:kern w:val="2"/>
+          <w:sz w:val="24"/>
+          <w:szCs w:val="24"/>
+          <w:lang w:eastAsia="en-GB"/>
+          <w14:ligatures w14:val="standardContextual"/>
+        </w:rPr>
+      </w:pPr>
+      <w:r>
+        <w:fldChar w:fldCharType="begin"/>
+      </w:r>
+      <w:r>
+        <w:instrText xml:space="preserve"> TOC \h \z \c "Tabela" </w:instrText>
+      </w:r>
+      <w:r>
+        <w:fldChar w:fldCharType="separate"/>
+      </w:r>
+      <w:hyperlink w:anchor="_Toc227746391" w:history="1">
+        <w:r>
+          <w:rPr>
+            <w:rStyle w:val="Hyperlink"/>
+            <w:noProof/>
+          </w:rPr>
+          <w:t xml:space="preserve">Tabela 1 – Descrição do </w:t>
+        </w:r>
+        <w:r>
+          <w:rPr>
+            <w:rStyle w:val="Hyperlink"/>
+            <w:noProof/>
+            <w:highlight w:val="yellow"/>
+          </w:rPr>
+          <w:t>Sistema 1</w:t>
+        </w:r>
+        <w:r>
+          <w:rPr>
+            <w:noProof/>
+            <w:webHidden/>
+          </w:rPr>
+          <w:tab/>
+        </w:r>
+        <w:r>
+          <w:rPr>
+            <w:noProof/>
+            <w:webHidden/>
+          </w:rPr>
+          <w:fldChar w:fldCharType="begin"/>
+        </w:r>
+        <w:r>
+          <w:rPr>
+            <w:noProof/>
+            <w:webHidden/>
+          </w:rPr>
+          <w:instrText xml:space="preserve"> PAGEREF _Toc227746391 \h </w:instrText>
+        </w:r>
+        <w:r>
+          <w:rPr>
+            <w:noProof/>
+            <w:webHidden/>
+          </w:rPr>
+        </w:r>
+        <w:r>
+          <w:rPr>
+            <w:noProof/>
+            <w:webHidden/>
+          </w:rPr>
+          <w:fldChar w:fldCharType="separate"/>
+        </w:r>
+        <w:r>
+          <w:rPr>
+            <w:noProof/>
+            <w:webHidden/>
+          </w:rPr>
+          <w:t>7</w:t>
+        </w:r>
+        <w:r>
+          <w:rPr>
+            <w:noProof/>
+            <w:webHidden/>
+          </w:rPr>
+          <w:fldChar w:fldCharType="end"/>
+        </w:r>
+      </w:hyperlink>
+    </w:p>
+    <w:p>
+      <w:pPr>
+        <w:pStyle w:val="TableofFigures"/>
+        <w:tabs>
+          <w:tab w:val="right" w:leader="dot" w:pos="9628"/>
+        </w:tabs>
+        <w:rPr>
+          <w:rFonts w:eastAsiaTheme="minorEastAsia"/>
+          <w:noProof/>
+          <w:kern w:val="2"/>
+          <w:sz w:val="24"/>
+          <w:szCs w:val="24"/>
+          <w:lang w:eastAsia="en-GB"/>
+          <w14:ligatures w14:val="standardContextual"/>
+        </w:rPr>
+      </w:pPr>
+      <w:hyperlink w:anchor="_Toc227746392" w:history="1">
+        <w:r>
+          <w:rPr>
+            <w:rStyle w:val="Hyperlink"/>
+            <w:noProof/>
+          </w:rPr>
+          <w:t xml:space="preserve">Tabela 2 – Descrição do </w:t>
+        </w:r>
+        <w:r>
+          <w:rPr>
+            <w:rStyle w:val="Hyperlink"/>
+            <w:noProof/>
+            <w:highlight w:val="yellow"/>
+          </w:rPr>
+          <w:t>Sistema 1</w:t>
+        </w:r>
+        <w:r>
+          <w:rPr>
+            <w:noProof/>
+            <w:webHidden/>
+          </w:rPr>
+          <w:tab/>
+        </w:r>
+        <w:r>
+          <w:rPr>
+            <w:noProof/>
+            <w:webHidden/>
+          </w:rPr>
+          <w:fldChar w:fldCharType="begin"/>
+        </w:r>
+        <w:r>
+          <w:rPr>
+            <w:noProof/>
+            <w:webHidden/>
+          </w:rPr>
+          <w:instrText xml:space="preserve"> PAGEREF _Toc227746392 \h </w:instrText>
+        </w:r>
+        <w:r>
+          <w:rPr>
+            <w:noProof/>
+            <w:webHidden/>
+          </w:rPr>
+        </w:r>
+        <w:r>
+          <w:rPr>
+            <w:noProof/>
+            <w:webHidden/>
+          </w:rPr>
+          <w:fldChar w:fldCharType="separate"/>
+        </w:r>
+        <w:r>
+          <w:rPr>
+            <w:noProof/>
+            <w:webHidden/>
+          </w:rPr>
+          <w:t>8</w:t>
+        </w:r>
+        <w:r>
+          <w:rPr>
+            <w:noProof/>
+            <w:webHidden/>
+          </w:rPr>
+          <w:fldChar w:fldCharType="end"/>
+        </w:r>
+      </w:hyperlink>
+    </w:p>
+    <w:p>
+      <w:pPr>
+        <w:pStyle w:val="TableofFigures"/>
+        <w:tabs>
+          <w:tab w:val="right" w:leader="dot" w:pos="9628"/>
+        </w:tabs>
+        <w:rPr>
+          <w:rFonts w:eastAsiaTheme="minorEastAsia"/>
+          <w:noProof/>
+          <w:kern w:val="2"/>
+          <w:sz w:val="24"/>
+          <w:szCs w:val="24"/>
+          <w:lang w:eastAsia="en-GB"/>
+          <w14:ligatures w14:val="standardContextual"/>
+        </w:rPr>
+      </w:pPr>
+      <w:hyperlink w:anchor="_Toc227746393" w:history="1">
+        <w:r>
+          <w:rPr>
+            <w:rStyle w:val="Hyperlink"/>
+            <w:noProof/>
+          </w:rPr>
+          <w:t xml:space="preserve">Tabela 3 – Descrição do </w:t>
+        </w:r>
+        <w:r>
+          <w:rPr>
+            <w:rStyle w:val="Hyperlink"/>
+            <w:noProof/>
+            <w:highlight w:val="yellow"/>
+          </w:rPr>
+          <w:t>Sistema 1</w:t>
+        </w:r>
+        <w:r>
+          <w:rPr>
+            <w:noProof/>
+            <w:webHidden/>
+          </w:rPr>
+          <w:tab/>
+        </w:r>
+        <w:r>
+          <w:rPr>
+            <w:noProof/>
+            <w:webHidden/>
+          </w:rPr>
+          <w:fldChar w:fldCharType="begin"/>
+        </w:r>
+        <w:r>
+          <w:rPr>
+            <w:noProof/>
+            <w:webHidden/>
+          </w:rPr>
+          <w:instrText xml:space="preserve"> PAGEREF _Toc227746393 \h </w:instrText>
+        </w:r>
+        <w:r>
+          <w:rPr>
+            <w:noProof/>
+            <w:webHidden/>
+          </w:rPr>
+        </w:r>
+        <w:r>
+          <w:rPr>
+            <w:noProof/>
+            <w:webHidden/>
+          </w:rPr>
+          <w:fldChar w:fldCharType="separate"/>
+        </w:r>
+        <w:r>
+          <w:rPr>
+            <w:noProof/>
+            <w:webHidden/>
+          </w:rPr>
+          <w:t>8</w:t>
+        </w:r>
+        <w:r>
+          <w:rPr>
+            <w:noProof/>
+            <w:webHidden/>
+          </w:rPr>
+          <w:fldChar w:fldCharType="end"/>
+        </w:r>
+      </w:hyperlink>
+    </w:p>
+    <w:p>
+      <w:pPr>
+        <w:pStyle w:val="TableofFigures"/>
+        <w:tabs>
+          <w:tab w:val="right" w:leader="dot" w:pos="9628"/>
+        </w:tabs>
+        <w:rPr>
+          <w:rFonts w:eastAsiaTheme="minorEastAsia"/>
+          <w:noProof/>
+          <w:kern w:val="2"/>
+          <w:sz w:val="24"/>
+          <w:szCs w:val="24"/>
+          <w:lang w:eastAsia="en-GB"/>
+          <w14:ligatures w14:val="standardContextual"/>
+        </w:rPr>
+      </w:pPr>
+      <w:hyperlink w:anchor="_Toc227746394" w:history="1">
+        <w:r>
+          <w:rPr>
+            <w:rStyle w:val="Hyperlink"/>
+            <w:noProof/>
+          </w:rPr>
+          <w:t>Tabela 4 – Resumo das características dos Sistemas concorrenciais</w:t>
+        </w:r>
+        <w:r>
+          <w:rPr>
+            <w:noProof/>
+            <w:webHidden/>
+          </w:rPr>
+          <w:tab/>
+        </w:r>
+        <w:r>
+          <w:rPr>
+            <w:noProof/>
+            <w:webHidden/>
+          </w:rPr>
+          <w:fldChar w:fldCharType="begin"/>
+        </w:r>
+        <w:r>
+          <w:rPr>
+            <w:noProof/>
+            <w:webHidden/>
+          </w:rPr>
+          <w:instrText xml:space="preserve"> PAGEREF _Toc227746394 \h </w:instrText>
+        </w:r>
+        <w:r>
+          <w:rPr>
+            <w:noProof/>
+            <w:webHidden/>
+          </w:rPr>
+        </w:r>
+        <w:r>
+          <w:rPr>
+            <w:noProof/>
+            <w:webHidden/>
+          </w:rPr>
+          <w:fldChar w:fldCharType="separate"/>
+        </w:r>
+        <w:r>
+          <w:rPr>
+            <w:noProof/>
+            <w:webHidden/>
+          </w:rPr>
+          <w:t>9</w:t>
+        </w:r>
+        <w:r>
+          <w:rPr>
+            <w:noProof/>
+            <w:webHidden/>
+          </w:rPr>
+          <w:fldChar w:fldCharType="end"/>
+        </w:r>
+      </w:hyperlink>
+    </w:p>
+    <w:p>
+      <w:pPr>
+        <w:pStyle w:val="TableofFigures"/>
+        <w:tabs>
+          <w:tab w:val="right" w:leader="dot" w:pos="9628"/>
+        </w:tabs>
+        <w:rPr>
+          <w:rFonts w:eastAsiaTheme="minorEastAsia"/>
+          <w:noProof/>
+          <w:kern w:val="2"/>
+          <w:sz w:val="24"/>
+          <w:szCs w:val="24"/>
+          <w:lang w:eastAsia="en-GB"/>
+          <w14:ligatures w14:val="standardContextual"/>
+        </w:rPr>
+      </w:pPr>
+      <w:hyperlink w:anchor="_Toc227746395" w:history="1">
+        <w:r>
+          <w:rPr>
+            <w:rStyle w:val="Hyperlink"/>
+            <w:noProof/>
+          </w:rPr>
+          <w:t>Tabela 5 – Identificação e funções dos Stakeholders e Scrum Team</w:t>
+        </w:r>
+        <w:r>
+          <w:rPr>
+            <w:noProof/>
+            <w:webHidden/>
+          </w:rPr>
+          <w:tab/>
+        </w:r>
+        <w:r>
+          <w:rPr>
+            <w:noProof/>
+            <w:webHidden/>
+          </w:rPr>
+          <w:fldChar w:fldCharType="begin"/>
+        </w:r>
+        <w:r>
+          <w:rPr>
+            <w:noProof/>
+            <w:webHidden/>
+          </w:rPr>
+          <w:instrText xml:space="preserve"> PAGEREF _Toc227746395 \h </w:instrText>
         </w:r>
         <w:r>
           <w:rPr>
@@ -3455,7 +3887,6 @@
         <w:fldChar w:fldCharType="end"/>
       </w:r>
     </w:p>
-    <w:p/>
     <w:p>
       <w:r>
         <w:br w:type="page"/>
@@ -3464,738 +3895,475 @@
     <w:p>
       <w:pPr>
         <w:pStyle w:val="Heading1"/>
-        <w:numPr>
-          <w:ilvl w:val="0"/>
-          <w:numId w:val="0"/>
-        </w:numPr>
-        <w:ind w:left="432" w:hanging="432"/>
-      </w:pPr>
-      <w:bookmarkStart w:id="1" w:name="_Toc231221392"/>
+      </w:pPr>
+      <w:bookmarkStart w:id="2" w:name="_Toc230871595"/>
       <w:r>
         <w:lastRenderedPageBreak/>
-        <w:t>Índice de Tabelas</w:t>
-      </w:r>
-      <w:bookmarkEnd w:id="1"/>
+        <w:t>Introdução</w:t>
+      </w:r>
+      <w:bookmarkEnd w:id="2"/>
+    </w:p>
+    <w:p>
+      <w:pPr>
+        <w:rPr>
+          <w:noProof/>
+        </w:rPr>
+      </w:pPr>
+      <w:r>
+        <w:rPr>
+          <w:noProof/>
+        </w:rPr>
+        <w:t xml:space="preserve">O </w:t>
+      </w:r>
+      <w:r>
+        <w:rPr>
+          <w:noProof/>
+        </w:rPr>
+        <w:t>projeto</w:t>
+      </w:r>
+      <w:r>
+        <w:rPr>
+          <w:noProof/>
+        </w:rPr>
+        <w:t xml:space="preserve"> foi </w:t>
+      </w:r>
+      <w:r>
+        <w:rPr>
+          <w:noProof/>
+        </w:rPr>
+        <w:t>realizado</w:t>
+      </w:r>
+      <w:r>
+        <w:rPr>
+          <w:noProof/>
+        </w:rPr>
+        <w:t xml:space="preserve"> no âmbito da unidade curricular de Desenvolvimento de Aplicações</w:t>
+      </w:r>
+      <w:r>
+        <w:rPr>
+          <w:noProof/>
+        </w:rPr>
+        <w:t xml:space="preserve"> (DA)</w:t>
+      </w:r>
+      <w:r>
+        <w:rPr>
+          <w:noProof/>
+        </w:rPr>
+        <w:t xml:space="preserve">, do Curso Técnico Superior Profissional de Programação de Sistemas de Informação do Instituto Politécnico de Leiria. O objetivo deste </w:t>
+      </w:r>
+      <w:r>
+        <w:rPr>
+          <w:noProof/>
+        </w:rPr>
+        <w:t>relatório</w:t>
+      </w:r>
+      <w:r>
+        <w:rPr>
+          <w:noProof/>
+        </w:rPr>
+        <w:t xml:space="preserve"> é descrever e documentar o processo de desenvolvimento do projeto final, desde a especificação do sistema até à sua implementação e avaliação.</w:t>
+      </w:r>
+    </w:p>
+    <w:p>
+      <w:pPr>
+        <w:rPr>
+          <w:noProof/>
+        </w:rPr>
+      </w:pPr>
+      <w:r>
+        <w:rPr>
+          <w:noProof/>
+        </w:rPr>
+        <w:t xml:space="preserve">O iShopping é uma aplicação desktop desenvolvida em C# com Windows Forms, destinada à gestão de compras domésticas de um agregado familiar. A aplicação permite gerir orçamentos mensais, planear listas de compras, registar artigos </w:t>
+      </w:r>
+      <w:r>
+        <w:rPr>
+          <w:noProof/>
+        </w:rPr>
+        <w:t>obtidos</w:t>
+      </w:r>
+      <w:r>
+        <w:rPr>
+          <w:noProof/>
+        </w:rPr>
+        <w:t xml:space="preserve"> e consultar estatísticas de consumo. O projeto foi desenvolvido em </w:t>
+      </w:r>
+      <w:r>
+        <w:rPr>
+          <w:noProof/>
+        </w:rPr>
+        <w:t>união</w:t>
+      </w:r>
+      <w:r>
+        <w:rPr>
+          <w:noProof/>
+        </w:rPr>
+        <w:t xml:space="preserve"> com a unidade curricular de Metodologia de Desenvolvimento de Software, na aplicação da metodologia ágil Scrum e na modelação do sistema através de diagramas de classes e modelo de dados</w:t>
+      </w:r>
+      <w:r>
+        <w:rPr>
+          <w:noProof/>
+        </w:rPr>
+        <w:t xml:space="preserve"> usando o website Jira.</w:t>
+      </w:r>
+    </w:p>
+    <w:p>
+      <w:pPr>
+        <w:rPr>
+          <w:noProof/>
+        </w:rPr>
+      </w:pPr>
+      <w:r>
+        <w:rPr>
+          <w:noProof/>
+        </w:rPr>
+        <w:t xml:space="preserve">O desenvolvimento foi planeado em três sprints, seguindo os princípios do Scrum, com definição de User Stories, estimativa em Story Points e revisão contínua do trabalho realizado. A equipa é composta por dois elementos: </w:t>
+      </w:r>
+      <w:r>
+        <w:rPr>
+          <w:noProof/>
+        </w:rPr>
+        <w:t>Thomaz</w:t>
+      </w:r>
+      <w:r>
+        <w:rPr>
+          <w:noProof/>
+        </w:rPr>
+        <w:t xml:space="preserve"> e </w:t>
+      </w:r>
+      <w:r>
+        <w:rPr>
+          <w:noProof/>
+        </w:rPr>
+        <w:t>Paulo.</w:t>
+      </w:r>
+    </w:p>
+    <w:p>
+      <w:pPr>
+        <w:pStyle w:val="Heading2"/>
+        <w:rPr>
+          <w:noProof/>
+        </w:rPr>
+      </w:pPr>
+      <w:bookmarkStart w:id="3" w:name="_Toc230871596"/>
+      <w:r>
+        <w:rPr>
+          <w:noProof/>
+        </w:rPr>
+        <w:t>Sumário executivo</w:t>
+      </w:r>
+      <w:bookmarkEnd w:id="3"/>
+    </w:p>
+    <w:p>
+      <w:r>
+        <w:t>No capítulo</w:t>
+      </w:r>
+      <w:r>
+        <w:t xml:space="preserve"> 1</w:t>
+      </w:r>
+      <w:r>
+        <w:t xml:space="preserve"> é feita </w:t>
+      </w:r>
+      <w:r>
+        <w:t xml:space="preserve">a introdução do </w:t>
+      </w:r>
+      <w:r>
+        <w:t>, descrevendo os seus objetivos, a equipa envolvida e a metodologia de desenvolvimento adotada.</w:t>
+      </w:r>
+    </w:p>
+    <w:p>
+      <w:r>
+        <w:t>No</w:t>
+      </w:r>
+      <w:r>
+        <w:t xml:space="preserve"> capítulo 2 </w:t>
+      </w:r>
+      <w:r>
+        <w:t xml:space="preserve">é </w:t>
+      </w:r>
+      <w:r>
+        <w:t>apresenta</w:t>
+      </w:r>
+      <w:r>
+        <w:t>da</w:t>
+      </w:r>
+      <w:r>
+        <w:t xml:space="preserve"> a especificação do sistema, incluindo </w:t>
+      </w:r>
+      <w:r>
+        <w:t>a</w:t>
+      </w:r>
+      <w:r>
+        <w:t xml:space="preserve"> análise concorrencial a sistemas similares existentes no mercado, os wireframes e mockups </w:t>
+      </w:r>
+      <w:r>
+        <w:t>para a aplicação</w:t>
+      </w:r>
+      <w:r>
+        <w:t>, e o diagrama de classes que modela a estrutura de dados da aplicação.</w:t>
+      </w:r>
+    </w:p>
+    <w:p>
+      <w:r>
+        <w:t>No</w:t>
+      </w:r>
+      <w:r>
+        <w:t xml:space="preserve"> capítulo 3 </w:t>
+      </w:r>
+      <w:r>
+        <w:t>é descrita</w:t>
+      </w:r>
+      <w:r>
+        <w:t xml:space="preserve"> a aplicação da metodologia Scrum ao projeto, identificando os stakeholders, a equipa </w:t>
+      </w:r>
+      <w:r>
+        <w:t xml:space="preserve">do </w:t>
+      </w:r>
+      <w:r>
+        <w:t>Scrum, as User Stories definidas e a execução detalhada de cada sprint, incluindo o trabalho planeado e realizado</w:t>
+      </w:r>
+      <w:r>
+        <w:t>, t</w:t>
+      </w:r>
+      <w:r>
+        <w:t>ermina</w:t>
+      </w:r>
+      <w:r>
+        <w:t>ndo</w:t>
+      </w:r>
+      <w:r>
+        <w:t xml:space="preserve"> com uma retrospetiva global do projeto.</w:t>
+      </w:r>
+    </w:p>
+    <w:p>
+      <w:r>
+        <w:t>E no</w:t>
+      </w:r>
+      <w:r>
+        <w:t xml:space="preserve"> capítulo 4</w:t>
+      </w:r>
+      <w:r>
+        <w:t xml:space="preserve">, são </w:t>
+      </w:r>
+      <w:r>
+        <w:t>apresenta</w:t>
+      </w:r>
+      <w:r>
+        <w:t>das</w:t>
+      </w:r>
+      <w:r>
+        <w:t xml:space="preserve"> as conclusões do projeto, refletindo sobre os resultados obtidos, as dificuldades encontradas e possíveis melhorias futuras.</w:t>
+      </w:r>
     </w:p>
     <w:p/>
     <w:p>
       <w:pPr>
-        <w:pStyle w:val="TableofFigures"/>
-        <w:tabs>
-          <w:tab w:val="right" w:leader="dot" w:pos="9628"/>
-        </w:tabs>
-        <w:rPr>
-          <w:rFonts w:eastAsiaTheme="minorEastAsia"/>
-          <w:noProof/>
-          <w:kern w:val="2"/>
-          <w:sz w:val="24"/>
-          <w:szCs w:val="24"/>
-          <w:lang w:val="en-GB" w:eastAsia="en-GB"/>
-          <w14:ligatures w14:val="standardContextual"/>
-        </w:rPr>
-      </w:pPr>
-      <w:r>
-        <w:fldChar w:fldCharType="begin"/>
-      </w:r>
-      <w:r>
-        <w:instrText xml:space="preserve"> TOC \h \z \c "Tabela" </w:instrText>
-      </w:r>
-      <w:r>
-        <w:fldChar w:fldCharType="separate"/>
-      </w:r>
-      <w:hyperlink w:anchor="_Toc231221419" w:history="1">
-        <w:r>
-          <w:rPr>
-            <w:rStyle w:val="Hyperlink"/>
-            <w:noProof/>
-          </w:rPr>
-          <w:t>Tabela 1 – Descrição do AnyList</w:t>
-        </w:r>
-        <w:r>
-          <w:rPr>
-            <w:noProof/>
-            <w:webHidden/>
-          </w:rPr>
-          <w:tab/>
-        </w:r>
-        <w:r>
-          <w:rPr>
-            <w:noProof/>
-            <w:webHidden/>
-          </w:rPr>
-          <w:fldChar w:fldCharType="begin"/>
-        </w:r>
-        <w:r>
-          <w:rPr>
-            <w:noProof/>
-            <w:webHidden/>
-          </w:rPr>
-          <w:instrText xml:space="preserve"> PAGEREF _Toc231221419 \h </w:instrText>
-        </w:r>
-        <w:r>
-          <w:rPr>
-            <w:noProof/>
-            <w:webHidden/>
-          </w:rPr>
-        </w:r>
-        <w:r>
-          <w:rPr>
-            <w:noProof/>
-            <w:webHidden/>
-          </w:rPr>
-          <w:fldChar w:fldCharType="separate"/>
-        </w:r>
-        <w:r>
-          <w:rPr>
-            <w:noProof/>
-            <w:webHidden/>
-          </w:rPr>
-          <w:t>7</w:t>
-        </w:r>
-        <w:r>
-          <w:rPr>
-            <w:noProof/>
-            <w:webHidden/>
-          </w:rPr>
-          <w:fldChar w:fldCharType="end"/>
-        </w:r>
-      </w:hyperlink>
+        <w:pStyle w:val="Heading1"/>
+      </w:pPr>
+      <w:bookmarkStart w:id="4" w:name="_Toc230871597"/>
+      <w:r>
+        <w:lastRenderedPageBreak/>
+        <w:t>Especificação do Sistema</w:t>
+      </w:r>
+      <w:bookmarkEnd w:id="4"/>
     </w:p>
     <w:p>
-      <w:pPr>
-        <w:pStyle w:val="TableofFigures"/>
-        <w:tabs>
-          <w:tab w:val="right" w:leader="dot" w:pos="9628"/>
-        </w:tabs>
-        <w:rPr>
-          <w:rFonts w:eastAsiaTheme="minorEastAsia"/>
-          <w:noProof/>
-          <w:kern w:val="2"/>
-          <w:sz w:val="24"/>
-          <w:szCs w:val="24"/>
-          <w:lang w:val="en-GB" w:eastAsia="en-GB"/>
-          <w14:ligatures w14:val="standardContextual"/>
-        </w:rPr>
-      </w:pPr>
-      <w:hyperlink w:anchor="_Toc231221420" w:history="1">
-        <w:r>
-          <w:rPr>
-            <w:rStyle w:val="Hyperlink"/>
-            <w:noProof/>
-          </w:rPr>
-          <w:t>Tabela 2 – Descrição do Bring!</w:t>
-        </w:r>
-        <w:r>
-          <w:rPr>
-            <w:noProof/>
-            <w:webHidden/>
-          </w:rPr>
-          <w:tab/>
-        </w:r>
-        <w:r>
-          <w:rPr>
-            <w:noProof/>
-            <w:webHidden/>
-          </w:rPr>
-          <w:fldChar w:fldCharType="begin"/>
-        </w:r>
-        <w:r>
-          <w:rPr>
-            <w:noProof/>
-            <w:webHidden/>
-          </w:rPr>
-          <w:instrText xml:space="preserve"> PAGEREF _Toc231221420 \h </w:instrText>
-        </w:r>
-        <w:r>
-          <w:rPr>
-            <w:noProof/>
-            <w:webHidden/>
-          </w:rPr>
-        </w:r>
-        <w:r>
-          <w:rPr>
-            <w:noProof/>
-            <w:webHidden/>
-          </w:rPr>
-          <w:fldChar w:fldCharType="separate"/>
-        </w:r>
-        <w:r>
-          <w:rPr>
-            <w:noProof/>
-            <w:webHidden/>
-          </w:rPr>
-          <w:t>8</w:t>
-        </w:r>
-        <w:r>
-          <w:rPr>
-            <w:noProof/>
-            <w:webHidden/>
-          </w:rPr>
-          <w:fldChar w:fldCharType="end"/>
-        </w:r>
-      </w:hyperlink>
+      <w:r>
+        <w:rPr>
+          <w:highlight w:val="yellow"/>
+        </w:rPr>
+        <w:t>Nest</w:t>
+      </w:r>
+      <w:r>
+        <w:rPr>
+          <w:highlight w:val="yellow"/>
+        </w:rPr>
+        <w:t>e capítulo</w:t>
+      </w:r>
+      <w:r>
+        <w:rPr>
+          <w:highlight w:val="yellow"/>
+        </w:rPr>
+        <w:t>...</w:t>
+      </w:r>
+      <w:r>
+        <w:t xml:space="preserve"> </w:t>
+      </w:r>
+      <w:r>
+        <w:rPr>
+          <w:highlight w:val="yellow"/>
+        </w:rPr>
+        <w:t>&lt;parágrafo introdutório&gt;</w:t>
+      </w:r>
     </w:p>
     <w:p>
       <w:pPr>
-        <w:pStyle w:val="TableofFigures"/>
-        <w:tabs>
-          <w:tab w:val="right" w:leader="dot" w:pos="9628"/>
-        </w:tabs>
-        <w:rPr>
-          <w:rFonts w:eastAsiaTheme="minorEastAsia"/>
-          <w:noProof/>
-          <w:kern w:val="2"/>
-          <w:sz w:val="24"/>
-          <w:szCs w:val="24"/>
-          <w:lang w:val="en-GB" w:eastAsia="en-GB"/>
-          <w14:ligatures w14:val="standardContextual"/>
-        </w:rPr>
-      </w:pPr>
-      <w:hyperlink w:anchor="_Toc231221421" w:history="1">
-        <w:r>
-          <w:rPr>
-            <w:rStyle w:val="Hyperlink"/>
-            <w:noProof/>
-          </w:rPr>
-          <w:t>Tabela 3 – Descrição do YNAB</w:t>
-        </w:r>
-        <w:r>
-          <w:rPr>
-            <w:noProof/>
-            <w:webHidden/>
-          </w:rPr>
-          <w:tab/>
-        </w:r>
-        <w:r>
-          <w:rPr>
-            <w:noProof/>
-            <w:webHidden/>
-          </w:rPr>
-          <w:fldChar w:fldCharType="begin"/>
-        </w:r>
-        <w:r>
-          <w:rPr>
-            <w:noProof/>
-            <w:webHidden/>
-          </w:rPr>
-          <w:instrText xml:space="preserve"> PAGEREF _Toc231221421 \h </w:instrText>
-        </w:r>
-        <w:r>
-          <w:rPr>
-            <w:noProof/>
-            <w:webHidden/>
-          </w:rPr>
-        </w:r>
-        <w:r>
-          <w:rPr>
-            <w:noProof/>
-            <w:webHidden/>
-          </w:rPr>
-          <w:fldChar w:fldCharType="separate"/>
-        </w:r>
-        <w:r>
-          <w:rPr>
-            <w:noProof/>
-            <w:webHidden/>
-          </w:rPr>
-          <w:t>9</w:t>
-        </w:r>
-        <w:r>
-          <w:rPr>
-            <w:noProof/>
-            <w:webHidden/>
-          </w:rPr>
-          <w:fldChar w:fldCharType="end"/>
-        </w:r>
-      </w:hyperlink>
+        <w:rPr>
+          <w:highlight w:val="yellow"/>
+        </w:rPr>
+      </w:pPr>
+      <w:r>
+        <w:rPr>
+          <w:highlight w:val="yellow"/>
+        </w:rPr>
+        <w:t>&lt;</w:t>
+      </w:r>
+      <w:r>
+        <w:rPr>
+          <w:highlight w:val="yellow"/>
+        </w:rPr>
+        <w:t>Descrever</w:t>
+      </w:r>
+      <w:r>
+        <w:rPr>
+          <w:highlight w:val="yellow"/>
+        </w:rPr>
+        <w:t>:</w:t>
+      </w:r>
+      <w:r>
+        <w:rPr>
+          <w:highlight w:val="yellow"/>
+        </w:rPr>
+        <w:t xml:space="preserve"> </w:t>
+      </w:r>
     </w:p>
     <w:p>
       <w:pPr>
-        <w:pStyle w:val="TableofFigures"/>
-        <w:tabs>
-          <w:tab w:val="right" w:leader="dot" w:pos="9628"/>
-        </w:tabs>
-        <w:rPr>
-          <w:rFonts w:eastAsiaTheme="minorEastAsia"/>
-          <w:noProof/>
-          <w:kern w:val="2"/>
-          <w:sz w:val="24"/>
-          <w:szCs w:val="24"/>
-          <w:lang w:val="en-GB" w:eastAsia="en-GB"/>
-          <w14:ligatures w14:val="standardContextual"/>
-        </w:rPr>
-      </w:pPr>
-      <w:hyperlink w:anchor="_Toc231221422" w:history="1">
-        <w:r>
-          <w:rPr>
-            <w:rStyle w:val="Hyperlink"/>
-            <w:noProof/>
-          </w:rPr>
-          <w:t>Tabela 4 – Resumo das características dos Sistemas concorrenciais</w:t>
-        </w:r>
-        <w:r>
-          <w:rPr>
-            <w:noProof/>
-            <w:webHidden/>
-          </w:rPr>
-          <w:tab/>
-        </w:r>
-        <w:r>
-          <w:rPr>
-            <w:noProof/>
-            <w:webHidden/>
-          </w:rPr>
-          <w:fldChar w:fldCharType="begin"/>
-        </w:r>
-        <w:r>
-          <w:rPr>
-            <w:noProof/>
-            <w:webHidden/>
-          </w:rPr>
-          <w:instrText xml:space="preserve"> PAGEREF _Toc231221422 \h </w:instrText>
-        </w:r>
-        <w:r>
-          <w:rPr>
-            <w:noProof/>
-            <w:webHidden/>
-          </w:rPr>
-        </w:r>
-        <w:r>
-          <w:rPr>
-            <w:noProof/>
-            <w:webHidden/>
-          </w:rPr>
-          <w:fldChar w:fldCharType="separate"/>
-        </w:r>
-        <w:r>
-          <w:rPr>
-            <w:noProof/>
-            <w:webHidden/>
-          </w:rPr>
-          <w:t>9</w:t>
-        </w:r>
-        <w:r>
-          <w:rPr>
-            <w:noProof/>
-            <w:webHidden/>
-          </w:rPr>
-          <w:fldChar w:fldCharType="end"/>
-        </w:r>
-      </w:hyperlink>
+        <w:rPr>
+          <w:highlight w:val="yellow"/>
+        </w:rPr>
+      </w:pPr>
+      <w:r>
+        <w:rPr>
+          <w:highlight w:val="yellow"/>
+        </w:rPr>
+        <w:t xml:space="preserve">- descrição geral do sistema, ou seja, </w:t>
+      </w:r>
+      <w:r>
+        <w:rPr>
+          <w:highlight w:val="yellow"/>
+        </w:rPr>
+        <w:t>os objetivos do sistema a desenvolver</w:t>
+      </w:r>
+      <w:r>
+        <w:rPr>
+          <w:highlight w:val="yellow"/>
+        </w:rPr>
+        <w:t xml:space="preserve"> (</w:t>
+      </w:r>
+      <w:r>
+        <w:rPr>
+          <w:highlight w:val="yellow"/>
+        </w:rPr>
+        <w:t>as necessidades do utilizador de forma geral</w:t>
+      </w:r>
+      <w:r>
+        <w:rPr>
+          <w:highlight w:val="yellow"/>
+        </w:rPr>
+        <w:t>)</w:t>
+      </w:r>
     </w:p>
     <w:p>
-      <w:pPr>
-        <w:pStyle w:val="TableofFigures"/>
-        <w:tabs>
-          <w:tab w:val="right" w:leader="dot" w:pos="9628"/>
-        </w:tabs>
-        <w:rPr>
-          <w:rFonts w:eastAsiaTheme="minorEastAsia"/>
-          <w:noProof/>
-          <w:kern w:val="2"/>
-          <w:sz w:val="24"/>
-          <w:szCs w:val="24"/>
-          <w:lang w:val="en-GB" w:eastAsia="en-GB"/>
-          <w14:ligatures w14:val="standardContextual"/>
-        </w:rPr>
-      </w:pPr>
-      <w:hyperlink w:anchor="_Toc231221423" w:history="1">
-        <w:r>
-          <w:rPr>
-            <w:rStyle w:val="Hyperlink"/>
-            <w:noProof/>
-          </w:rPr>
-          <w:t>Tabela 5 – Identificação e funções dos Stakeholders e Scrum Team</w:t>
-        </w:r>
-        <w:r>
-          <w:rPr>
-            <w:noProof/>
-            <w:webHidden/>
-          </w:rPr>
-          <w:tab/>
-        </w:r>
-        <w:r>
-          <w:rPr>
-            <w:noProof/>
-            <w:webHidden/>
-          </w:rPr>
-          <w:fldChar w:fldCharType="begin"/>
-        </w:r>
-        <w:r>
-          <w:rPr>
-            <w:noProof/>
-            <w:webHidden/>
-          </w:rPr>
-          <w:instrText xml:space="preserve"> PAGEREF _Toc231221423 \h </w:instrText>
-        </w:r>
-        <w:r>
-          <w:rPr>
-            <w:noProof/>
-            <w:webHidden/>
-          </w:rPr>
-        </w:r>
-        <w:r>
-          <w:rPr>
-            <w:noProof/>
-            <w:webHidden/>
-          </w:rPr>
-          <w:fldChar w:fldCharType="separate"/>
-        </w:r>
-        <w:r>
-          <w:rPr>
-            <w:noProof/>
-            <w:webHidden/>
-          </w:rPr>
-          <w:t>13</w:t>
-        </w:r>
-        <w:r>
-          <w:rPr>
-            <w:noProof/>
-            <w:webHidden/>
-          </w:rPr>
-          <w:fldChar w:fldCharType="end"/>
-        </w:r>
-      </w:hyperlink>
+      <w:r>
+        <w:rPr>
+          <w:highlight w:val="yellow"/>
+        </w:rPr>
+        <w:t xml:space="preserve">- </w:t>
+      </w:r>
+      <w:r>
+        <w:rPr>
+          <w:highlight w:val="yellow"/>
+        </w:rPr>
+        <w:t>o problema que o sistema pretende resolver e identificar os principais stakeholders (pessoas, grupos ou entidades com interesse direto no sistema</w:t>
+      </w:r>
     </w:p>
     <w:p>
       <w:r>
-        <w:fldChar w:fldCharType="end"/>
-      </w:r>
-    </w:p>
-    <w:p>
-      <w:r>
-        <w:br w:type="page"/>
-      </w:r>
-    </w:p>
-    <w:p>
-      <w:pPr>
-        <w:pStyle w:val="Heading1"/>
-      </w:pPr>
-      <w:bookmarkStart w:id="2" w:name="_Toc231221393"/>
-      <w:r>
-        <w:lastRenderedPageBreak/>
-        <w:t>Introdução</w:t>
-      </w:r>
-      <w:bookmarkEnd w:id="2"/>
-    </w:p>
-    <w:p>
-      <w:pPr>
-        <w:rPr>
-          <w:noProof/>
-        </w:rPr>
-      </w:pPr>
-      <w:r>
-        <w:rPr>
-          <w:noProof/>
-        </w:rPr>
-        <w:t xml:space="preserve">O </w:t>
-      </w:r>
-      <w:r>
-        <w:rPr>
-          <w:noProof/>
-        </w:rPr>
-        <w:t>projeto</w:t>
-      </w:r>
-      <w:r>
-        <w:rPr>
-          <w:noProof/>
-        </w:rPr>
-        <w:t xml:space="preserve"> foi </w:t>
-      </w:r>
-      <w:r>
-        <w:rPr>
-          <w:noProof/>
-        </w:rPr>
-        <w:t>realizado</w:t>
-      </w:r>
-      <w:r>
-        <w:rPr>
-          <w:noProof/>
-        </w:rPr>
-        <w:t xml:space="preserve"> no âmbito da unidade curricular de Desenvolvimento de Aplicações</w:t>
-      </w:r>
-      <w:r>
-        <w:rPr>
-          <w:noProof/>
-        </w:rPr>
-        <w:t xml:space="preserve"> (DA)</w:t>
-      </w:r>
-      <w:r>
-        <w:rPr>
-          <w:noProof/>
-        </w:rPr>
-        <w:t xml:space="preserve">, do Curso Técnico Superior Profissional de Programação de Sistemas de Informação do Instituto Politécnico de Leiria. O objetivo deste </w:t>
-      </w:r>
-      <w:r>
-        <w:rPr>
-          <w:noProof/>
-        </w:rPr>
-        <w:t>relatório</w:t>
-      </w:r>
-      <w:r>
-        <w:rPr>
-          <w:noProof/>
-        </w:rPr>
-        <w:t xml:space="preserve"> é descrever e documentar o processo de desenvolvimento do projeto final, desde a especificação do sistema até à sua implementação e avaliação.</w:t>
-      </w:r>
-    </w:p>
-    <w:p>
-      <w:pPr>
-        <w:rPr>
-          <w:noProof/>
-        </w:rPr>
-      </w:pPr>
-      <w:r>
-        <w:rPr>
-          <w:noProof/>
-        </w:rPr>
-        <w:t xml:space="preserve">O iShopping é uma aplicação desktop desenvolvida em C# com Windows Forms, destinada à gestão de compras domésticas de um agregado familiar. A aplicação permite gerir orçamentos mensais, planear listas de compras, registar artigos </w:t>
-      </w:r>
-      <w:r>
-        <w:rPr>
-          <w:noProof/>
-        </w:rPr>
-        <w:t>obtidos</w:t>
-      </w:r>
-      <w:r>
-        <w:rPr>
-          <w:noProof/>
-        </w:rPr>
-        <w:t xml:space="preserve"> e consultar estatísticas de consumo. O projeto foi desenvolvido em </w:t>
-      </w:r>
-      <w:r>
-        <w:rPr>
-          <w:noProof/>
-        </w:rPr>
-        <w:t>união</w:t>
-      </w:r>
-      <w:r>
-        <w:rPr>
-          <w:noProof/>
-        </w:rPr>
-        <w:t xml:space="preserve"> com a unidade curricular de Metodologia de Desenvolvimento de Software, na aplicação da metodologia ágil Scrum e na modelação do sistema através de diagramas de classes e modelo de dados</w:t>
-      </w:r>
-      <w:r>
-        <w:rPr>
-          <w:noProof/>
-        </w:rPr>
-        <w:t xml:space="preserve"> usando o website Jira.</w:t>
-      </w:r>
-    </w:p>
-    <w:p>
-      <w:pPr>
-        <w:rPr>
-          <w:noProof/>
-        </w:rPr>
-      </w:pPr>
-      <w:r>
-        <w:rPr>
-          <w:noProof/>
-        </w:rPr>
-        <w:t xml:space="preserve">O desenvolvimento foi planeado em três sprints, seguindo os princípios do Scrum, com definição de User Stories, estimativa em Story Points e revisão contínua do trabalho realizado. A equipa é composta por dois elementos: </w:t>
-      </w:r>
-      <w:r>
-        <w:rPr>
-          <w:noProof/>
-        </w:rPr>
-        <w:t>Thomaz</w:t>
-      </w:r>
-      <w:r>
-        <w:rPr>
-          <w:noProof/>
-        </w:rPr>
-        <w:t xml:space="preserve"> e </w:t>
-      </w:r>
-      <w:r>
-        <w:rPr>
-          <w:noProof/>
-        </w:rPr>
-        <w:t>Paulo.</w:t>
-      </w:r>
-    </w:p>
-    <w:p>
-      <w:pPr>
-        <w:pStyle w:val="Heading2"/>
-        <w:rPr>
-          <w:noProof/>
-        </w:rPr>
-      </w:pPr>
-      <w:bookmarkStart w:id="3" w:name="_Toc231221394"/>
-      <w:r>
-        <w:rPr>
-          <w:noProof/>
-        </w:rPr>
-        <w:t>Sumário executivo</w:t>
-      </w:r>
-      <w:bookmarkEnd w:id="3"/>
-    </w:p>
-    <w:p>
-      <w:r>
-        <w:t>No capítulo</w:t>
-      </w:r>
-      <w:r>
-        <w:t xml:space="preserve"> 1</w:t>
-      </w:r>
-      <w:r>
-        <w:t xml:space="preserve"> é feita </w:t>
-      </w:r>
-      <w:r>
-        <w:t xml:space="preserve">a introdução do </w:t>
-      </w:r>
-      <w:r>
-        <w:t>, descrevendo os seus objetivos, a equipa envolvida e a metodologia de desenvolvimento adotada.</w:t>
-      </w:r>
-    </w:p>
-    <w:p>
-      <w:r>
-        <w:t>No</w:t>
-      </w:r>
-      <w:r>
-        <w:t xml:space="preserve"> capítulo 2 </w:t>
-      </w:r>
-      <w:r>
-        <w:t xml:space="preserve">é </w:t>
-      </w:r>
-      <w:r>
-        <w:t>apresenta</w:t>
-      </w:r>
-      <w:r>
-        <w:t>da</w:t>
-      </w:r>
-      <w:r>
-        <w:t xml:space="preserve"> a especificação do sistema, incluindo </w:t>
-      </w:r>
-      <w:r>
-        <w:t>a</w:t>
-      </w:r>
-      <w:r>
-        <w:t xml:space="preserve"> análise concorrencial a sistemas similares existentes no mercado, os wireframes e mockups </w:t>
-      </w:r>
-      <w:r>
-        <w:t>para a aplicação</w:t>
-      </w:r>
-      <w:r>
-        <w:t>, e o diagrama de classes que modela a estrutura de dados da aplicação.</w:t>
-      </w:r>
-    </w:p>
-    <w:p>
-      <w:r>
-        <w:t>No</w:t>
-      </w:r>
-      <w:r>
-        <w:t xml:space="preserve"> capítulo 3 </w:t>
-      </w:r>
-      <w:r>
-        <w:t>é descrita</w:t>
-      </w:r>
-      <w:r>
-        <w:t xml:space="preserve"> a aplicação da metodologia Scrum ao projeto, identificando os stakeholders, a equipa </w:t>
-      </w:r>
-      <w:r>
-        <w:t xml:space="preserve">do </w:t>
-      </w:r>
-      <w:r>
-        <w:t>Scrum, as User Stories definidas e a execução detalhada de cada sprint, incluindo o trabalho planeado e realizado</w:t>
-      </w:r>
-      <w:r>
-        <w:t>, t</w:t>
-      </w:r>
-      <w:r>
-        <w:t>ermina</w:t>
-      </w:r>
-      <w:r>
-        <w:t>ndo</w:t>
-      </w:r>
-      <w:r>
-        <w:t xml:space="preserve"> com uma retrospetiva global do projeto.</w:t>
-      </w:r>
-    </w:p>
-    <w:p>
-      <w:r>
-        <w:t>E no</w:t>
-      </w:r>
-      <w:r>
-        <w:t xml:space="preserve"> capítulo 4</w:t>
-      </w:r>
-      <w:r>
-        <w:t xml:space="preserve">, são </w:t>
-      </w:r>
-      <w:r>
-        <w:t>apresenta</w:t>
-      </w:r>
-      <w:r>
-        <w:t>das</w:t>
-      </w:r>
-      <w:r>
-        <w:t xml:space="preserve"> as conclusões do projeto, refletindo sobre os resultados obtidos, as dificuldades encontradas e possíveis melhorias futuras.</w:t>
+        <w:t xml:space="preserve">- </w:t>
+      </w:r>
+      <w:r>
+        <w:rPr>
+          <w:highlight w:val="yellow"/>
+        </w:rPr>
+        <w:t>i</w:t>
+      </w:r>
+      <w:r>
+        <w:rPr>
+          <w:highlight w:val="yellow"/>
+        </w:rPr>
+        <w:t>mpactos positivos e negativos do sistema a desenvolver</w:t>
+      </w:r>
+      <w:r>
+        <w:rPr>
+          <w:highlight w:val="yellow"/>
+        </w:rPr>
+        <w:t xml:space="preserve"> tendo em conta o impacto que tem no mercado, para as pessoas (que vão usar o sistema ou não), etc. </w:t>
+      </w:r>
+      <w:r>
+        <w:rPr>
+          <w:highlight w:val="yellow"/>
+        </w:rPr>
+        <w:t>&gt;</w:t>
       </w:r>
     </w:p>
     <w:p/>
     <w:p>
       <w:pPr>
-        <w:pStyle w:val="Heading1"/>
-      </w:pPr>
-      <w:bookmarkStart w:id="4" w:name="_Toc231221395"/>
-      <w:r>
-        <w:lastRenderedPageBreak/>
-        <w:t>Especificação do Sistema</w:t>
-      </w:r>
-      <w:bookmarkEnd w:id="4"/>
+        <w:pStyle w:val="Heading2"/>
+      </w:pPr>
+      <w:bookmarkStart w:id="5" w:name="_Toc230871598"/>
+      <w:r>
+        <w:t>Análise Concorrencial</w:t>
+      </w:r>
+      <w:bookmarkEnd w:id="5"/>
     </w:p>
     <w:p>
       <w:r>
-        <w:t>Neste capítulo é apresentad</w:t>
-      </w:r>
-      <w:r>
-        <w:t>o</w:t>
-      </w:r>
-      <w:r>
-        <w:t xml:space="preserve"> a especificação do sistema iShopping, incluindo os seus objetivos, o problema que pretende resolver e uma análise concorrencial a sistemas similares.</w:t>
-      </w:r>
-    </w:p>
-    <w:p>
-      <w:r>
-        <w:t>O iShopping é uma aplicação desktop de gestão de compras domésticas para agregados familiares, permitindo planear listas de compras, gerir orçamentos mensais e acompanhar despesas em tempo real. O problema que pretende resolver é a falta de controlo financeiro nas compras do quotidiano, onde muitas famílias não têm forma organizada de comparar o previsto com o real ou acompanhar a evolução dos gastos. Os principais stakeholders são os membros do agregado familiar que utilizam a aplicação.</w:t>
-      </w:r>
-    </w:p>
-    <w:p>
-      <w:r>
-        <w:t>Como impactos positivos destacam-se a maior consciência financeira, a redução de desperdício e a melhor gestão do orçamento mensal. Como impacto negativo, o registo manual de todos os itens pode ser percecionado como trabalhoso face a aplicações mais simples.</w:t>
+        <w:rPr>
+          <w:highlight w:val="yellow"/>
+        </w:rPr>
+        <w:t>&lt;Análise de 3 sistemas relacionados</w:t>
+      </w:r>
+      <w:r>
+        <w:rPr>
+          <w:highlight w:val="yellow"/>
+        </w:rPr>
+        <w:t xml:space="preserve"> </w:t>
+      </w:r>
+      <w:r>
+        <w:rPr>
+          <w:highlight w:val="yellow"/>
+        </w:rPr>
+        <w:t>usados em outras configurações operacionais que disponibilizam funcionalidades idênticas ou relacionadas</w:t>
+      </w:r>
+      <w:r>
+        <w:rPr>
+          <w:highlight w:val="yellow"/>
+        </w:rPr>
+        <w:t xml:space="preserve"> &gt;</w:t>
       </w:r>
     </w:p>
     <w:p/>
     <w:p>
       <w:pPr>
-        <w:pStyle w:val="Heading2"/>
-      </w:pPr>
-      <w:bookmarkStart w:id="5" w:name="_Toc231221396"/>
-      <w:r>
-        <w:t>Análise Concorrencial</w:t>
-      </w:r>
-      <w:bookmarkEnd w:id="5"/>
-    </w:p>
-    <w:p>
-      <w:r>
-        <w:t>Para a análise concorrencial foram selecionadas três aplicações com funcionalidades relacionadas com a gestão de compras e orçamentos domésticos: AnyList, Bring! e YNAB.</w:t>
-      </w:r>
-    </w:p>
-    <w:p/>
-    <w:p>
-      <w:pPr>
         <w:pStyle w:val="Heading3"/>
       </w:pPr>
-      <w:bookmarkStart w:id="6" w:name="_Toc231221397"/>
-      <w:r>
-        <w:t>AnyList</w:t>
+      <w:bookmarkStart w:id="6" w:name="_Toc230871599"/>
+      <w:r>
+        <w:rPr>
+          <w:highlight w:val="yellow"/>
+        </w:rPr>
+        <w:t>&lt;Sistema 1 (mudar o nome para o website/aplicação escolhida para análise)&gt;</w:t>
       </w:r>
       <w:bookmarkEnd w:id="6"/>
     </w:p>
     <w:p>
       <w:r>
-        <w:t>A próxima tabela resume as características do sistema</w:t>
-      </w:r>
-      <w:r>
-        <w:t xml:space="preserve"> AnyList.</w:t>
+        <w:rPr>
+          <w:highlight w:val="yellow"/>
+        </w:rPr>
+        <w:t>A próxima tabela resume as características do sistema...</w:t>
       </w:r>
     </w:p>
     <w:p>
@@ -4204,7 +4372,7 @@
         <w:keepNext/>
         <w:jc w:val="center"/>
       </w:pPr>
-      <w:bookmarkStart w:id="7" w:name="_Toc231221419"/>
+      <w:bookmarkStart w:id="7" w:name="_Toc227746391"/>
       <w:r>
         <w:t xml:space="preserve">Tabela </w:t>
       </w:r>
@@ -4233,7 +4401,10 @@
         <w:t xml:space="preserve"> – Descrição do </w:t>
       </w:r>
       <w:r>
-        <w:t>AnyList</w:t>
+        <w:rPr>
+          <w:highlight w:val="yellow"/>
+        </w:rPr>
+        <w:t>Sistema 1</w:t>
       </w:r>
       <w:bookmarkEnd w:id="7"/>
     </w:p>
@@ -4273,10 +4444,10 @@
                 <w:noProof/>
               </w:rPr>
               <w:drawing>
-                <wp:inline distT="0" distB="0" distL="0" distR="0" wp14:anchorId="15730833" wp14:editId="4E5A610D">
-                  <wp:extent cx="3440951" cy="2821880"/>
-                  <wp:effectExtent l="0" t="0" r="7620" b="0"/>
-                  <wp:docPr id="128556463" name="Picture 2" descr="AnyList - About AnyList for the Web"/>
+                <wp:inline distT="0" distB="0" distL="0" distR="0" wp14:anchorId="718A97ED" wp14:editId="2F9FCF15">
+                  <wp:extent cx="4368800" cy="2265539"/>
+                  <wp:effectExtent l="0" t="0" r="0" b="0"/>
+                  <wp:docPr id="7" name="Picture 7"/>
                   <wp:cNvGraphicFramePr>
                     <a:graphicFrameLocks xmlns:a="http://schemas.openxmlformats.org/drawingml/2006/main" noChangeAspect="1"/>
                   </wp:cNvGraphicFramePr>
@@ -4284,36 +4455,23 @@
                     <a:graphicData uri="http://schemas.openxmlformats.org/drawingml/2006/picture">
                       <pic:pic xmlns:pic="http://schemas.openxmlformats.org/drawingml/2006/picture">
                         <pic:nvPicPr>
-                          <pic:cNvPr id="0" name="Picture 6" descr="AnyList - About AnyList for the Web"/>
-                          <pic:cNvPicPr>
-                            <a:picLocks noChangeAspect="1" noChangeArrowheads="1"/>
-                          </pic:cNvPicPr>
+                          <pic:cNvPr id="1" name=""/>
+                          <pic:cNvPicPr/>
                         </pic:nvPicPr>
                         <pic:blipFill>
-                          <a:blip r:embed="rId11" cstate="print">
-                            <a:extLst>
-                              <a:ext uri="{28A0092B-C50C-407E-A947-70E740481C1C}">
-                                <a14:useLocalDpi xmlns:a14="http://schemas.microsoft.com/office/drawing/2010/main" val="0"/>
-                              </a:ext>
-                            </a:extLst>
-                          </a:blip>
-                          <a:srcRect/>
+                          <a:blip r:embed="rId11"/>
                           <a:stretch>
                             <a:fillRect/>
                           </a:stretch>
                         </pic:blipFill>
-                        <pic:spPr bwMode="auto">
+                        <pic:spPr>
                           <a:xfrm>
                             <a:off x="0" y="0"/>
-                            <a:ext cx="3449274" cy="2828705"/>
+                            <a:ext cx="4394605" cy="2278921"/>
                           </a:xfrm>
                           <a:prstGeom prst="rect">
                             <a:avLst/>
                           </a:prstGeom>
-                          <a:noFill/>
-                          <a:ln>
-                            <a:noFill/>
-                          </a:ln>
                         </pic:spPr>
                       </pic:pic>
                     </a:graphicData>
@@ -4322,6 +4480,23 @@
               </w:drawing>
             </w:r>
           </w:p>
+          <w:p>
+            <w:pPr>
+              <w:jc w:val="center"/>
+              <w:rPr>
+                <w:b w:val="0"/>
+                <w:bCs w:val="0"/>
+              </w:rPr>
+            </w:pPr>
+            <w:r>
+              <w:rPr>
+                <w:b w:val="0"/>
+                <w:bCs w:val="0"/>
+                <w:highlight w:val="yellow"/>
+              </w:rPr>
+              <w:t>&lt;colocar imagem principal&gt;</w:t>
+            </w:r>
+          </w:p>
         </w:tc>
       </w:tr>
       <w:tr>
@@ -4367,7 +4542,10 @@
               </w:rPr>
             </w:pPr>
             <w:r>
-              <w:t>AnyList</w:t>
+              <w:rPr>
+                <w:highlight w:val="yellow"/>
+              </w:rPr>
+              <w:t>&lt;nome do website/aplicação&gt;</w:t>
             </w:r>
           </w:p>
         </w:tc>
@@ -4409,7 +4587,10 @@
               <w:cnfStyle w:val="000000000000" w:firstRow="0" w:lastRow="0" w:firstColumn="0" w:lastColumn="0" w:oddVBand="0" w:evenVBand="0" w:oddHBand="0" w:evenHBand="0" w:firstRowFirstColumn="0" w:firstRowLastColumn="0" w:lastRowFirstColumn="0" w:lastRowLastColumn="0"/>
             </w:pPr>
             <w:r>
-              <w:t>https://www.anylist.com</w:t>
+              <w:rPr>
+                <w:highlight w:val="yellow"/>
+              </w:rPr>
+              <w:t>&lt;link do website/aplicação&gt;</w:t>
             </w:r>
           </w:p>
         </w:tc>
@@ -4463,7 +4644,10 @@
               <w:cnfStyle w:val="000000100000" w:firstRow="0" w:lastRow="0" w:firstColumn="0" w:lastColumn="0" w:oddVBand="0" w:evenVBand="0" w:oddHBand="1" w:evenHBand="0" w:firstRowFirstColumn="0" w:firstRowLastColumn="0" w:lastRowFirstColumn="0" w:lastRowLastColumn="0"/>
             </w:pPr>
             <w:r>
-              <w:t>Aplicação móvel e web focada em listas de compras colaborativas para famílias e grupos. Permite criar e partilhar listas em tempo real entre vários utilizadores, com sugestões automáticas de artigos.</w:t>
+              <w:rPr>
+                <w:highlight w:val="yellow"/>
+              </w:rPr>
+              <w:t>&lt;descrição detalhada do website/aplicação&gt;</w:t>
             </w:r>
           </w:p>
         </w:tc>
@@ -4505,7 +4689,10 @@
               <w:cnfStyle w:val="000000000000" w:firstRow="0" w:lastRow="0" w:firstColumn="0" w:lastColumn="0" w:oddVBand="0" w:evenVBand="0" w:oddHBand="0" w:evenHBand="0" w:firstRowFirstColumn="0" w:firstRowLastColumn="0" w:lastRowFirstColumn="0" w:lastRowLastColumn="0"/>
             </w:pPr>
             <w:r>
-              <w:t>Interface simples e intuitiva; sincronização em tempo real; colaboração familiar; sugestões automáticas de artigos; integração com receitas</w:t>
+              <w:rPr>
+                <w:highlight w:val="yellow"/>
+              </w:rPr>
+              <w:t>&lt;vantagens do website/aplicação&gt;</w:t>
             </w:r>
           </w:p>
         </w:tc>
@@ -4536,7 +4723,6 @@
                 <w:i w:val="0"/>
                 <w:iCs w:val="0"/>
               </w:rPr>
-              <w:lastRenderedPageBreak/>
               <w:t>Desvantagens:</w:t>
             </w:r>
           </w:p>
@@ -4551,7 +4737,10 @@
               <w:cnfStyle w:val="000000100000" w:firstRow="0" w:lastRow="0" w:firstColumn="0" w:lastColumn="0" w:oddVBand="0" w:evenVBand="0" w:oddHBand="1" w:evenHBand="0" w:firstRowFirstColumn="0" w:firstRowLastColumn="0" w:lastRowFirstColumn="0" w:lastRowLastColumn="0"/>
             </w:pPr>
             <w:r>
-              <w:t>Gestão de orçamento muito limitada; sem controlo financeiro detalhado; sem análise de gastos por categoria</w:t>
+              <w:rPr>
+                <w:highlight w:val="yellow"/>
+              </w:rPr>
+              <w:t>&lt;desvantagens do website/aplicação&gt;</w:t>
             </w:r>
           </w:p>
         </w:tc>
@@ -4593,7 +4782,10 @@
               <w:cnfStyle w:val="000000000000" w:firstRow="0" w:lastRow="0" w:firstColumn="0" w:lastColumn="0" w:oddVBand="0" w:evenVBand="0" w:oddHBand="0" w:evenHBand="0" w:firstRowFirstColumn="0" w:firstRowLastColumn="0" w:lastRowFirstColumn="0" w:lastRowLastColumn="0"/>
             </w:pPr>
             <w:r>
-              <w:t>Gestão de orçamento mensal; comparação entre itens previstos e não previstos; histórico financeiro; sugestão de listas baseada em histórico</w:t>
+              <w:rPr>
+                <w:highlight w:val="yellow"/>
+              </w:rPr>
+              <w:t>&lt;funcionalidades que possam faltar ao website/aplicação&gt;</w:t>
             </w:r>
           </w:p>
         </w:tc>
@@ -4604,18 +4796,34 @@
       <w:pPr>
         <w:pStyle w:val="Heading3"/>
       </w:pPr>
-      <w:bookmarkStart w:id="8" w:name="_Toc231221398"/>
-      <w:r>
-        <w:t>Bring!</w:t>
+      <w:bookmarkStart w:id="8" w:name="_Toc230871600"/>
+      <w:r>
+        <w:rPr>
+          <w:highlight w:val="yellow"/>
+        </w:rPr>
+        <w:lastRenderedPageBreak/>
+        <w:t xml:space="preserve">&lt;Sistema </w:t>
+      </w:r>
+      <w:r>
+        <w:rPr>
+          <w:highlight w:val="yellow"/>
+        </w:rPr>
+        <w:t>2</w:t>
+      </w:r>
+      <w:r>
+        <w:rPr>
+          <w:highlight w:val="yellow"/>
+        </w:rPr>
+        <w:t xml:space="preserve"> (mudar o nome para o website/aplicação escolhida para análise)&gt;</w:t>
       </w:r>
       <w:bookmarkEnd w:id="8"/>
     </w:p>
     <w:p>
       <w:r>
-        <w:t>A próxima tabela resume as características do sistema</w:t>
-      </w:r>
-      <w:r>
-        <w:t xml:space="preserve"> Bring!</w:t>
+        <w:rPr>
+          <w:highlight w:val="yellow"/>
+        </w:rPr>
+        <w:t>A próxima tabela resume as características do sistema...</w:t>
       </w:r>
     </w:p>
     <w:p>
@@ -4624,7 +4832,7 @@
         <w:keepNext/>
         <w:jc w:val="center"/>
       </w:pPr>
-      <w:bookmarkStart w:id="9" w:name="_Toc231221420"/>
+      <w:bookmarkStart w:id="9" w:name="_Toc227746392"/>
       <w:r>
         <w:t xml:space="preserve">Tabela </w:t>
       </w:r>
@@ -4653,7 +4861,10 @@
         <w:t xml:space="preserve"> – Descrição do </w:t>
       </w:r>
       <w:r>
-        <w:t>Bring!</w:t>
+        <w:rPr>
+          <w:highlight w:val="yellow"/>
+        </w:rPr>
+        <w:t>Sistema 1</w:t>
       </w:r>
       <w:bookmarkEnd w:id="9"/>
     </w:p>
@@ -4693,10 +4904,10 @@
                 <w:noProof/>
               </w:rPr>
               <w:drawing>
-                <wp:inline distT="0" distB="0" distL="0" distR="0" wp14:anchorId="3DBB140A" wp14:editId="64DD5F48">
-                  <wp:extent cx="1575101" cy="2799712"/>
-                  <wp:effectExtent l="0" t="0" r="6350" b="1270"/>
-                  <wp:docPr id="1365652243" name="Picture 3" descr="Bring! Lista de Compras - Download do APK para Android | Aptoide"/>
+                <wp:inline distT="0" distB="0" distL="0" distR="0" wp14:anchorId="4BC29FC6" wp14:editId="04785330">
+                  <wp:extent cx="4368800" cy="2265539"/>
+                  <wp:effectExtent l="0" t="0" r="0" b="0"/>
+                  <wp:docPr id="12" name="Picture 12" descr="Graphical user interface, application, Teams&#10;&#10;Description automatically generated"/>
                   <wp:cNvGraphicFramePr>
                     <a:graphicFrameLocks xmlns:a="http://schemas.openxmlformats.org/drawingml/2006/main" noChangeAspect="1"/>
                   </wp:cNvGraphicFramePr>
@@ -4704,36 +4915,23 @@
                     <a:graphicData uri="http://schemas.openxmlformats.org/drawingml/2006/picture">
                       <pic:pic xmlns:pic="http://schemas.openxmlformats.org/drawingml/2006/picture">
                         <pic:nvPicPr>
-                          <pic:cNvPr id="0" name="Picture 8" descr="Bring! Lista de Compras - Download do APK para Android | Aptoide"/>
-                          <pic:cNvPicPr>
-                            <a:picLocks noChangeAspect="1" noChangeArrowheads="1"/>
-                          </pic:cNvPicPr>
+                          <pic:cNvPr id="12" name="Picture 12" descr="Graphical user interface, application, Teams&#10;&#10;Description automatically generated"/>
+                          <pic:cNvPicPr/>
                         </pic:nvPicPr>
                         <pic:blipFill>
-                          <a:blip r:embed="rId12" cstate="print">
-                            <a:extLst>
-                              <a:ext uri="{28A0092B-C50C-407E-A947-70E740481C1C}">
-                                <a14:useLocalDpi xmlns:a14="http://schemas.microsoft.com/office/drawing/2010/main" val="0"/>
-                              </a:ext>
-                            </a:extLst>
-                          </a:blip>
-                          <a:srcRect/>
+                          <a:blip r:embed="rId11"/>
                           <a:stretch>
                             <a:fillRect/>
                           </a:stretch>
                         </pic:blipFill>
-                        <pic:spPr bwMode="auto">
+                        <pic:spPr>
                           <a:xfrm>
                             <a:off x="0" y="0"/>
-                            <a:ext cx="1593760" cy="2832877"/>
+                            <a:ext cx="4394605" cy="2278921"/>
                           </a:xfrm>
                           <a:prstGeom prst="rect">
                             <a:avLst/>
                           </a:prstGeom>
-                          <a:noFill/>
-                          <a:ln>
-                            <a:noFill/>
-                          </a:ln>
                         </pic:spPr>
                       </pic:pic>
                     </a:graphicData>
@@ -4742,6 +4940,23 @@
               </w:drawing>
             </w:r>
           </w:p>
+          <w:p>
+            <w:pPr>
+              <w:jc w:val="center"/>
+              <w:rPr>
+                <w:b w:val="0"/>
+                <w:bCs w:val="0"/>
+              </w:rPr>
+            </w:pPr>
+            <w:r>
+              <w:rPr>
+                <w:b w:val="0"/>
+                <w:bCs w:val="0"/>
+                <w:highlight w:val="yellow"/>
+              </w:rPr>
+              <w:t>&lt;colocar imagem principal&gt;</w:t>
+            </w:r>
+          </w:p>
         </w:tc>
       </w:tr>
       <w:tr>
@@ -4782,9 +4997,15 @@
             <w:pPr>
               <w:jc w:val="left"/>
               <w:cnfStyle w:val="000000100000" w:firstRow="0" w:lastRow="0" w:firstColumn="0" w:lastColumn="0" w:oddVBand="0" w:evenVBand="0" w:oddHBand="1" w:evenHBand="0" w:firstRowFirstColumn="0" w:firstRowLastColumn="0" w:lastRowFirstColumn="0" w:lastRowLastColumn="0"/>
-            </w:pPr>
-            <w:r>
-              <w:t>Bring!</w:t>
+              <w:rPr>
+                <w:highlight w:val="yellow"/>
+              </w:rPr>
+            </w:pPr>
+            <w:r>
+              <w:rPr>
+                <w:highlight w:val="yellow"/>
+              </w:rPr>
+              <w:t>&lt;nome do website/aplicação&gt;</w:t>
             </w:r>
           </w:p>
         </w:tc>
@@ -4826,7 +5047,10 @@
               <w:cnfStyle w:val="000000000000" w:firstRow="0" w:lastRow="0" w:firstColumn="0" w:lastColumn="0" w:oddVBand="0" w:evenVBand="0" w:oddHBand="0" w:evenHBand="0" w:firstRowFirstColumn="0" w:firstRowLastColumn="0" w:lastRowFirstColumn="0" w:lastRowLastColumn="0"/>
             </w:pPr>
             <w:r>
-              <w:t>https://www.getbring.com</w:t>
+              <w:rPr>
+                <w:highlight w:val="yellow"/>
+              </w:rPr>
+              <w:t>&lt;link do website/aplicação&gt;</w:t>
             </w:r>
           </w:p>
         </w:tc>
@@ -4871,7 +5095,10 @@
               <w:cnfStyle w:val="000000100000" w:firstRow="0" w:lastRow="0" w:firstColumn="0" w:lastColumn="0" w:oddVBand="0" w:evenVBand="0" w:oddHBand="1" w:evenHBand="0" w:firstRowFirstColumn="0" w:firstRowLastColumn="0" w:lastRowFirstColumn="0" w:lastRowLastColumn="0"/>
             </w:pPr>
             <w:r>
-              <w:t>Aplicação móvel de lista de compras com interface visual baseada em ícones de produtos. Focada na experiência de utilização rápida e colaborativa, permitindo partilhar listas com familiares e amigos em tempo real.</w:t>
+              <w:rPr>
+                <w:highlight w:val="yellow"/>
+              </w:rPr>
+              <w:t>&lt;descrição detalhada do website/aplicação&gt;</w:t>
             </w:r>
           </w:p>
         </w:tc>
@@ -4913,7 +5140,10 @@
               <w:cnfStyle w:val="000000000000" w:firstRow="0" w:lastRow="0" w:firstColumn="0" w:lastColumn="0" w:oddVBand="0" w:evenVBand="0" w:oddHBand="0" w:evenHBand="0" w:firstRowFirstColumn="0" w:firstRowLastColumn="0" w:lastRowFirstColumn="0" w:lastRowLastColumn="0"/>
             </w:pPr>
             <w:r>
-              <w:t>Interface muito visual e apelativa; rápida de utilizar; colaboração em tempo real; disponível em múltiplas plataformas; suporte a múltiplas listas</w:t>
+              <w:rPr>
+                <w:highlight w:val="yellow"/>
+              </w:rPr>
+              <w:t>&lt;vantagens do website/aplicação&gt;</w:t>
             </w:r>
           </w:p>
         </w:tc>
@@ -4958,7 +5188,10 @@
               <w:cnfStyle w:val="000000100000" w:firstRow="0" w:lastRow="0" w:firstColumn="0" w:lastColumn="0" w:oddVBand="0" w:evenVBand="0" w:oddHBand="1" w:evenHBand="0" w:firstRowFirstColumn="0" w:firstRowLastColumn="0" w:lastRowFirstColumn="0" w:lastRowLastColumn="0"/>
             </w:pPr>
             <w:r>
-              <w:t>Sem qualquer funcionalidade de gestão de orçamento; sem registo de preços ou gastos; sem histórico financeiro</w:t>
+              <w:rPr>
+                <w:highlight w:val="yellow"/>
+              </w:rPr>
+              <w:t>&lt;desvantagens do website/aplicação&gt;</w:t>
             </w:r>
           </w:p>
         </w:tc>
@@ -5000,7 +5233,10 @@
               <w:cnfStyle w:val="000000000000" w:firstRow="0" w:lastRow="0" w:firstColumn="0" w:lastColumn="0" w:oddVBand="0" w:evenVBand="0" w:oddHBand="0" w:evenHBand="0" w:firstRowFirstColumn="0" w:firstRowLastColumn="0" w:lastRowFirstColumn="0" w:lastRowLastColumn="0"/>
             </w:pPr>
             <w:r>
-              <w:t>Controlo de orçamento; registo de preços unitários; comparação entre planeado e adquirido; estatísticas de consumo; sugestão de compras baseada em histórico</w:t>
+              <w:rPr>
+                <w:highlight w:val="yellow"/>
+              </w:rPr>
+              <w:t>&lt;funcionalidades que possam faltar ao website/aplicação&gt;</w:t>
             </w:r>
           </w:p>
         </w:tc>
@@ -5008,53 +5244,37 @@
     </w:tbl>
     <w:p/>
     <w:p/>
-    <w:p/>
-    <w:p/>
-    <w:p/>
-    <w:p/>
     <w:p>
       <w:pPr>
         <w:pStyle w:val="Heading3"/>
-        <w:rPr>
-          <w:lang w:val="en-GB"/>
-        </w:rPr>
-      </w:pPr>
-      <w:bookmarkStart w:id="10" w:name="_Toc231221399"/>
-      <w:r>
-        <w:rPr>
-          <w:lang w:val="en-GB"/>
-        </w:rPr>
-        <w:lastRenderedPageBreak/>
-        <w:t xml:space="preserve">YNAB (You Need </w:t>
-      </w:r>
-      <w:proofErr w:type="gramStart"/>
-      <w:r>
-        <w:rPr>
-          <w:lang w:val="en-GB"/>
-        </w:rPr>
-        <w:t>A</w:t>
-      </w:r>
-      <w:proofErr w:type="gramEnd"/>
-      <w:r>
-        <w:rPr>
-          <w:lang w:val="en-GB"/>
-        </w:rPr>
-        <w:t xml:space="preserve"> B</w:t>
-      </w:r>
-      <w:r>
-        <w:rPr>
-          <w:lang w:val="en-GB"/>
-        </w:rPr>
-        <w:t>udget)</w:t>
+      </w:pPr>
+      <w:bookmarkStart w:id="10" w:name="_Toc230871601"/>
+      <w:r>
+        <w:rPr>
+          <w:highlight w:val="yellow"/>
+        </w:rPr>
+        <w:t xml:space="preserve">&lt;Sistema </w:t>
+      </w:r>
+      <w:r>
+        <w:rPr>
+          <w:highlight w:val="yellow"/>
+        </w:rPr>
+        <w:t>3</w:t>
+      </w:r>
+      <w:r>
+        <w:rPr>
+          <w:highlight w:val="yellow"/>
+        </w:rPr>
+        <w:t xml:space="preserve"> (mudar o nome para o website/aplicação escolhida para análise)&gt;</w:t>
       </w:r>
       <w:bookmarkEnd w:id="10"/>
     </w:p>
     <w:p>
       <w:r>
-        <w:t>A próxima tabela resume as características do sistema</w:t>
-      </w:r>
-      <w:r>
-        <w:t xml:space="preserve"> YNAB.</w:t>
+        <w:rPr>
+          <w:highlight w:val="yellow"/>
+        </w:rPr>
+        <w:t>A próxima tabela resume as características do sistema...</w:t>
       </w:r>
     </w:p>
     <w:p>
@@ -5063,7 +5283,7 @@
         <w:keepNext/>
         <w:jc w:val="center"/>
       </w:pPr>
-      <w:bookmarkStart w:id="11" w:name="_Toc231221421"/>
+      <w:bookmarkStart w:id="11" w:name="_Toc227746393"/>
       <w:r>
         <w:t xml:space="preserve">Tabela </w:t>
       </w:r>
@@ -5092,7 +5312,10 @@
         <w:t xml:space="preserve"> – Descrição do </w:t>
       </w:r>
       <w:r>
-        <w:t>YNAB</w:t>
+        <w:rPr>
+          <w:highlight w:val="yellow"/>
+        </w:rPr>
+        <w:t>Sistema 1</w:t>
       </w:r>
       <w:bookmarkEnd w:id="11"/>
     </w:p>
@@ -5132,10 +5355,10 @@
                 <w:noProof/>
               </w:rPr>
               <w:drawing>
-                <wp:inline distT="0" distB="0" distL="0" distR="0" wp14:anchorId="71820763" wp14:editId="68EB55C2">
-                  <wp:extent cx="2952120" cy="2148389"/>
-                  <wp:effectExtent l="0" t="0" r="635" b="4445"/>
-                  <wp:docPr id="1394026735" name="Picture 4" descr="How I Use YNAB to Budget Days Off | YNAB"/>
+                <wp:inline distT="0" distB="0" distL="0" distR="0" wp14:anchorId="0B7AD73E" wp14:editId="02A02D16">
+                  <wp:extent cx="4368800" cy="2265539"/>
+                  <wp:effectExtent l="0" t="0" r="0" b="0"/>
+                  <wp:docPr id="13" name="Picture 13" descr="Graphical user interface, application, Teams&#10;&#10;Description automatically generated"/>
                   <wp:cNvGraphicFramePr>
                     <a:graphicFrameLocks xmlns:a="http://schemas.openxmlformats.org/drawingml/2006/main" noChangeAspect="1"/>
                   </wp:cNvGraphicFramePr>
@@ -5143,36 +5366,23 @@
                     <a:graphicData uri="http://schemas.openxmlformats.org/drawingml/2006/picture">
                       <pic:pic xmlns:pic="http://schemas.openxmlformats.org/drawingml/2006/picture">
                         <pic:nvPicPr>
-                          <pic:cNvPr id="0" name="Picture 10" descr="How I Use YNAB to Budget Days Off | YNAB"/>
-                          <pic:cNvPicPr>
-                            <a:picLocks noChangeAspect="1" noChangeArrowheads="1"/>
-                          </pic:cNvPicPr>
+                          <pic:cNvPr id="13" name="Picture 13" descr="Graphical user interface, application, Teams&#10;&#10;Description automatically generated"/>
+                          <pic:cNvPicPr/>
                         </pic:nvPicPr>
                         <pic:blipFill>
-                          <a:blip r:embed="rId13" cstate="print">
-                            <a:extLst>
-                              <a:ext uri="{28A0092B-C50C-407E-A947-70E740481C1C}">
-                                <a14:useLocalDpi xmlns:a14="http://schemas.microsoft.com/office/drawing/2010/main" val="0"/>
-                              </a:ext>
-                            </a:extLst>
-                          </a:blip>
-                          <a:srcRect/>
+                          <a:blip r:embed="rId11"/>
                           <a:stretch>
                             <a:fillRect/>
                           </a:stretch>
                         </pic:blipFill>
-                        <pic:spPr bwMode="auto">
+                        <pic:spPr>
                           <a:xfrm>
                             <a:off x="0" y="0"/>
-                            <a:ext cx="2965329" cy="2158002"/>
+                            <a:ext cx="4394605" cy="2278921"/>
                           </a:xfrm>
                           <a:prstGeom prst="rect">
                             <a:avLst/>
                           </a:prstGeom>
-                          <a:noFill/>
-                          <a:ln>
-                            <a:noFill/>
-                          </a:ln>
                         </pic:spPr>
                       </pic:pic>
                     </a:graphicData>
@@ -5181,6 +5391,23 @@
               </w:drawing>
             </w:r>
           </w:p>
+          <w:p>
+            <w:pPr>
+              <w:jc w:val="center"/>
+              <w:rPr>
+                <w:b w:val="0"/>
+                <w:bCs w:val="0"/>
+              </w:rPr>
+            </w:pPr>
+            <w:r>
+              <w:rPr>
+                <w:b w:val="0"/>
+                <w:bCs w:val="0"/>
+                <w:highlight w:val="yellow"/>
+              </w:rPr>
+              <w:t>&lt;colocar imagem principal&gt;</w:t>
+            </w:r>
+          </w:p>
         </w:tc>
       </w:tr>
       <w:tr>
@@ -5209,6 +5436,7 @@
                 <w:i w:val="0"/>
                 <w:iCs w:val="0"/>
               </w:rPr>
+              <w:lastRenderedPageBreak/>
               <w:t>Nome:</w:t>
             </w:r>
           </w:p>
@@ -5223,28 +5451,13 @@
               <w:cnfStyle w:val="000000100000" w:firstRow="0" w:lastRow="0" w:firstColumn="0" w:lastColumn="0" w:oddVBand="0" w:evenVBand="0" w:oddHBand="1" w:evenHBand="0" w:firstRowFirstColumn="0" w:firstRowLastColumn="0" w:lastRowFirstColumn="0" w:lastRowLastColumn="0"/>
               <w:rPr>
                 <w:highlight w:val="yellow"/>
-                <w:lang w:val="en-GB"/>
-              </w:rPr>
-            </w:pPr>
-            <w:r>
-              <w:rPr>
-                <w:lang w:val="en-GB"/>
-              </w:rPr>
-              <w:t xml:space="preserve">YNAB – You Need </w:t>
-            </w:r>
-            <w:proofErr w:type="gramStart"/>
-            <w:r>
-              <w:rPr>
-                <w:lang w:val="en-GB"/>
-              </w:rPr>
-              <w:t>A</w:t>
-            </w:r>
-            <w:proofErr w:type="gramEnd"/>
-            <w:r>
-              <w:rPr>
-                <w:lang w:val="en-GB"/>
-              </w:rPr>
-              <w:t xml:space="preserve"> Budget</w:t>
+              </w:rPr>
+            </w:pPr>
+            <w:r>
+              <w:rPr>
+                <w:highlight w:val="yellow"/>
+              </w:rPr>
+              <w:t>&lt;nome do website/aplicação&gt;</w:t>
             </w:r>
           </w:p>
         </w:tc>
@@ -5286,7 +5499,10 @@
               <w:cnfStyle w:val="000000000000" w:firstRow="0" w:lastRow="0" w:firstColumn="0" w:lastColumn="0" w:oddVBand="0" w:evenVBand="0" w:oddHBand="0" w:evenHBand="0" w:firstRowFirstColumn="0" w:firstRowLastColumn="0" w:lastRowFirstColumn="0" w:lastRowLastColumn="0"/>
             </w:pPr>
             <w:r>
-              <w:t>https://www.ynab.com</w:t>
+              <w:rPr>
+                <w:highlight w:val="yellow"/>
+              </w:rPr>
+              <w:t>&lt;link do website/aplicação&gt;</w:t>
             </w:r>
           </w:p>
         </w:tc>
@@ -5331,7 +5547,10 @@
               <w:cnfStyle w:val="000000100000" w:firstRow="0" w:lastRow="0" w:firstColumn="0" w:lastColumn="0" w:oddVBand="0" w:evenVBand="0" w:oddHBand="1" w:evenHBand="0" w:firstRowFirstColumn="0" w:firstRowLastColumn="0" w:lastRowFirstColumn="0" w:lastRowLastColumn="0"/>
             </w:pPr>
             <w:r>
-              <w:t>Aplicação web e móvel de gestão de orçamento pessoal e familiar baseada na metodologia "zero-based budgeting". Permite definir categorias de despesas, atribuir orçamentos mensais e registar transações.</w:t>
+              <w:rPr>
+                <w:highlight w:val="yellow"/>
+              </w:rPr>
+              <w:t>&lt;descrição detalhada do website/aplicação&gt;</w:t>
             </w:r>
           </w:p>
         </w:tc>
@@ -5373,7 +5592,10 @@
               <w:cnfStyle w:val="000000000000" w:firstRow="0" w:lastRow="0" w:firstColumn="0" w:lastColumn="0" w:oddVBand="0" w:evenVBand="0" w:oddHBand="0" w:evenHBand="0" w:firstRowFirstColumn="0" w:firstRowLastColumn="0" w:lastRowFirstColumn="0" w:lastRowLastColumn="0"/>
             </w:pPr>
             <w:r>
-              <w:t>Gestão de orçamento muito detalhada; relatórios financeiros avançados; metodologia comprovada de controlo financeiro; sincronização bancária automática</w:t>
+              <w:rPr>
+                <w:highlight w:val="yellow"/>
+              </w:rPr>
+              <w:t>&lt;vantagens do website/aplicação&gt;</w:t>
             </w:r>
           </w:p>
         </w:tc>
@@ -5418,7 +5640,10 @@
               <w:cnfStyle w:val="000000100000" w:firstRow="0" w:lastRow="0" w:firstColumn="0" w:lastColumn="0" w:oddVBand="0" w:evenVBand="0" w:oddHBand="1" w:evenHBand="0" w:firstRowFirstColumn="0" w:firstRowLastColumn="0" w:lastRowFirstColumn="0" w:lastRowLastColumn="0"/>
             </w:pPr>
             <w:r>
-              <w:t>Não é focada em compras domésticas; sem planeamento de listas de compras; custo de subscrição elevado; curva de aprendizagem alta</w:t>
+              <w:rPr>
+                <w:highlight w:val="yellow"/>
+              </w:rPr>
+              <w:t>&lt;desvantagens do website/aplicação&gt;</w:t>
             </w:r>
           </w:p>
         </w:tc>
@@ -5460,7 +5685,10 @@
               <w:cnfStyle w:val="000000000000" w:firstRow="0" w:lastRow="0" w:firstColumn="0" w:lastColumn="0" w:oddVBand="0" w:evenVBand="0" w:oddHBand="0" w:evenHBand="0" w:firstRowFirstColumn="0" w:firstRowLastColumn="0" w:lastRowFirstColumn="0" w:lastRowLastColumn="0"/>
             </w:pPr>
             <w:r>
-              <w:t>Planeamento de listas de compras; registo de itens previstos vs não previstos; modo de compra em tempo real; sugestão de lista baseada em histórico de compras</w:t>
+              <w:rPr>
+                <w:highlight w:val="yellow"/>
+              </w:rPr>
+              <w:t>&lt;funcionalidades que possam faltar ao website/aplicação&gt;</w:t>
             </w:r>
           </w:p>
         </w:tc>
@@ -5471,7 +5699,7 @@
       <w:pPr>
         <w:pStyle w:val="Heading3"/>
       </w:pPr>
-      <w:bookmarkStart w:id="12" w:name="_Toc231221400"/>
+      <w:bookmarkStart w:id="12" w:name="_Toc230871602"/>
       <w:r>
         <w:t>Comparação dos Sistemas</w:t>
       </w:r>
@@ -5479,7 +5707,10 @@
     </w:p>
     <w:p>
       <w:r>
-        <w:t>De seguida uma tabela mostrando a comparação entre os sitemas.</w:t>
+        <w:rPr>
+          <w:highlight w:val="yellow"/>
+        </w:rPr>
+        <w:t>De seguida...</w:t>
       </w:r>
     </w:p>
     <w:p/>
@@ -5489,7 +5720,7 @@
         <w:keepNext/>
         <w:jc w:val="center"/>
       </w:pPr>
-      <w:bookmarkStart w:id="13" w:name="_Toc231221422"/>
+      <w:bookmarkStart w:id="13" w:name="_Toc227746394"/>
       <w:r>
         <w:t xml:space="preserve">Tabela </w:t>
       </w:r>
@@ -5559,7 +5790,10 @@
               <w:cnfStyle w:val="100000000000" w:firstRow="1" w:lastRow="0" w:firstColumn="0" w:lastColumn="0" w:oddVBand="0" w:evenVBand="0" w:oddHBand="0" w:evenHBand="0" w:firstRowFirstColumn="0" w:firstRowLastColumn="0" w:lastRowFirstColumn="0" w:lastRowLastColumn="0"/>
             </w:pPr>
             <w:r>
-              <w:t>AnyList</w:t>
+              <w:rPr>
+                <w:highlight w:val="yellow"/>
+              </w:rPr>
+              <w:t>Sistema 1</w:t>
             </w:r>
           </w:p>
         </w:tc>
@@ -5573,7 +5807,10 @@
               <w:cnfStyle w:val="100000000000" w:firstRow="1" w:lastRow="0" w:firstColumn="0" w:lastColumn="0" w:oddVBand="0" w:evenVBand="0" w:oddHBand="0" w:evenHBand="0" w:firstRowFirstColumn="0" w:firstRowLastColumn="0" w:lastRowFirstColumn="0" w:lastRowLastColumn="0"/>
             </w:pPr>
             <w:r>
-              <w:t>Bring!</w:t>
+              <w:rPr>
+                <w:highlight w:val="yellow"/>
+              </w:rPr>
+              <w:t>Sistema 2</w:t>
             </w:r>
           </w:p>
         </w:tc>
@@ -5587,7 +5824,10 @@
               <w:cnfStyle w:val="100000000000" w:firstRow="1" w:lastRow="0" w:firstColumn="0" w:lastColumn="0" w:oddVBand="0" w:evenVBand="0" w:oddHBand="0" w:evenHBand="0" w:firstRowFirstColumn="0" w:firstRowLastColumn="0" w:lastRowFirstColumn="0" w:lastRowLastColumn="0"/>
             </w:pPr>
             <w:r>
-              <w:t>YNAB</w:t>
+              <w:rPr>
+                <w:highlight w:val="yellow"/>
+              </w:rPr>
+              <w:t>Sistema 3</w:t>
             </w:r>
           </w:p>
         </w:tc>
@@ -5608,7 +5848,10 @@
               </w:rPr>
             </w:pPr>
             <w:r>
-              <w:t>Gestão de orçamento mensal</w:t>
+              <w:rPr>
+                <w:highlight w:val="yellow"/>
+              </w:rPr>
+              <w:t>Caract. 1</w:t>
             </w:r>
           </w:p>
         </w:tc>
@@ -5628,7 +5871,7 @@
               <w:rPr>
                 <w:highlight w:val="yellow"/>
               </w:rPr>
-              <w:t>Não</w:t>
+              <w:t>x</w:t>
             </w:r>
           </w:p>
         </w:tc>
@@ -5648,7 +5891,7 @@
               <w:rPr>
                 <w:highlight w:val="yellow"/>
               </w:rPr>
-              <w:t>Não</w:t>
+              <w:t>-</w:t>
             </w:r>
           </w:p>
         </w:tc>
@@ -5668,7 +5911,7 @@
               <w:rPr>
                 <w:highlight w:val="yellow"/>
               </w:rPr>
-              <w:t>Sim</w:t>
+              <w:t>x</w:t>
             </w:r>
           </w:p>
         </w:tc>
@@ -5686,7 +5929,10 @@
               </w:rPr>
             </w:pPr>
             <w:r>
-              <w:t>Controlo financeiro por compra</w:t>
+              <w:rPr>
+                <w:highlight w:val="yellow"/>
+              </w:rPr>
+              <w:t>Caract. 2</w:t>
             </w:r>
           </w:p>
         </w:tc>
@@ -5699,9 +5945,6 @@
               <w:jc w:val="center"/>
               <w:cnfStyle w:val="000000000000" w:firstRow="0" w:lastRow="0" w:firstColumn="0" w:lastColumn="0" w:oddVBand="0" w:evenVBand="0" w:oddHBand="0" w:evenHBand="0" w:firstRowFirstColumn="0" w:firstRowLastColumn="0" w:lastRowFirstColumn="0" w:lastRowLastColumn="0"/>
             </w:pPr>
-            <w:r>
-              <w:t>Não</w:t>
-            </w:r>
           </w:p>
         </w:tc>
         <w:tc>
@@ -5713,9 +5956,6 @@
               <w:jc w:val="center"/>
               <w:cnfStyle w:val="000000000000" w:firstRow="0" w:lastRow="0" w:firstColumn="0" w:lastColumn="0" w:oddVBand="0" w:evenVBand="0" w:oddHBand="0" w:evenHBand="0" w:firstRowFirstColumn="0" w:firstRowLastColumn="0" w:lastRowFirstColumn="0" w:lastRowLastColumn="0"/>
             </w:pPr>
-            <w:r>
-              <w:t>Não</w:t>
-            </w:r>
           </w:p>
         </w:tc>
         <w:tc>
@@ -5727,9 +5967,6 @@
               <w:jc w:val="center"/>
               <w:cnfStyle w:val="000000000000" w:firstRow="0" w:lastRow="0" w:firstColumn="0" w:lastColumn="0" w:oddVBand="0" w:evenVBand="0" w:oddHBand="0" w:evenHBand="0" w:firstRowFirstColumn="0" w:firstRowLastColumn="0" w:lastRowFirstColumn="0" w:lastRowLastColumn="0"/>
             </w:pPr>
-            <w:r>
-              <w:t>Parcial</w:t>
-            </w:r>
           </w:p>
         </w:tc>
       </w:tr>
@@ -5749,7 +5986,10 @@
               </w:rPr>
             </w:pPr>
             <w:r>
-              <w:t>Planeamento de lista de compras</w:t>
+              <w:rPr>
+                <w:highlight w:val="yellow"/>
+              </w:rPr>
+              <w:t>Caract. 3</w:t>
             </w:r>
           </w:p>
         </w:tc>
@@ -5762,9 +6002,6 @@
               <w:jc w:val="center"/>
               <w:cnfStyle w:val="000000100000" w:firstRow="0" w:lastRow="0" w:firstColumn="0" w:lastColumn="0" w:oddVBand="0" w:evenVBand="0" w:oddHBand="1" w:evenHBand="0" w:firstRowFirstColumn="0" w:firstRowLastColumn="0" w:lastRowFirstColumn="0" w:lastRowLastColumn="0"/>
             </w:pPr>
-            <w:r>
-              <w:t>Sim</w:t>
-            </w:r>
           </w:p>
         </w:tc>
         <w:tc>
@@ -5776,9 +6013,6 @@
               <w:jc w:val="center"/>
               <w:cnfStyle w:val="000000100000" w:firstRow="0" w:lastRow="0" w:firstColumn="0" w:lastColumn="0" w:oddVBand="0" w:evenVBand="0" w:oddHBand="1" w:evenHBand="0" w:firstRowFirstColumn="0" w:firstRowLastColumn="0" w:lastRowFirstColumn="0" w:lastRowLastColumn="0"/>
             </w:pPr>
-            <w:r>
-              <w:t>Sim</w:t>
-            </w:r>
           </w:p>
         </w:tc>
         <w:tc>
@@ -5790,9 +6024,6 @@
               <w:jc w:val="center"/>
               <w:cnfStyle w:val="000000100000" w:firstRow="0" w:lastRow="0" w:firstColumn="0" w:lastColumn="0" w:oddVBand="0" w:evenVBand="0" w:oddHBand="1" w:evenHBand="0" w:firstRowFirstColumn="0" w:firstRowLastColumn="0" w:lastRowFirstColumn="0" w:lastRowLastColumn="0"/>
             </w:pPr>
-            <w:r>
-              <w:t>Não</w:t>
-            </w:r>
           </w:p>
         </w:tc>
       </w:tr>
@@ -5809,7 +6040,10 @@
               </w:rPr>
             </w:pPr>
             <w:r>
-              <w:t>Itens previstos vs não previstos</w:t>
+              <w:rPr>
+                <w:highlight w:val="yellow"/>
+              </w:rPr>
+              <w:t>Caract. 4</w:t>
             </w:r>
           </w:p>
         </w:tc>
@@ -5822,9 +6056,6 @@
               <w:jc w:val="center"/>
               <w:cnfStyle w:val="000000000000" w:firstRow="0" w:lastRow="0" w:firstColumn="0" w:lastColumn="0" w:oddVBand="0" w:evenVBand="0" w:oddHBand="0" w:evenHBand="0" w:firstRowFirstColumn="0" w:firstRowLastColumn="0" w:lastRowFirstColumn="0" w:lastRowLastColumn="0"/>
             </w:pPr>
-            <w:r>
-              <w:t>Não</w:t>
-            </w:r>
           </w:p>
         </w:tc>
         <w:tc>
@@ -5836,9 +6067,6 @@
               <w:jc w:val="center"/>
               <w:cnfStyle w:val="000000000000" w:firstRow="0" w:lastRow="0" w:firstColumn="0" w:lastColumn="0" w:oddVBand="0" w:evenVBand="0" w:oddHBand="0" w:evenHBand="0" w:firstRowFirstColumn="0" w:firstRowLastColumn="0" w:lastRowFirstColumn="0" w:lastRowLastColumn="0"/>
             </w:pPr>
-            <w:r>
-              <w:t>Não</w:t>
-            </w:r>
           </w:p>
         </w:tc>
         <w:tc>
@@ -5850,9 +6078,6 @@
               <w:jc w:val="center"/>
               <w:cnfStyle w:val="000000000000" w:firstRow="0" w:lastRow="0" w:firstColumn="0" w:lastColumn="0" w:oddVBand="0" w:evenVBand="0" w:oddHBand="0" w:evenHBand="0" w:firstRowFirstColumn="0" w:firstRowLastColumn="0" w:lastRowFirstColumn="0" w:lastRowLastColumn="0"/>
             </w:pPr>
-            <w:r>
-              <w:t>Não</w:t>
-            </w:r>
           </w:p>
         </w:tc>
       </w:tr>
@@ -5872,8 +6097,10 @@
               </w:rPr>
             </w:pPr>
             <w:r>
-              <w:lastRenderedPageBreak/>
-              <w:t>Registo de preço unitário</w:t>
+              <w:rPr>
+                <w:highlight w:val="yellow"/>
+              </w:rPr>
+              <w:t>...</w:t>
             </w:r>
           </w:p>
         </w:tc>
@@ -5886,9 +6113,6 @@
               <w:jc w:val="center"/>
               <w:cnfStyle w:val="000000100000" w:firstRow="0" w:lastRow="0" w:firstColumn="0" w:lastColumn="0" w:oddVBand="0" w:evenVBand="0" w:oddHBand="1" w:evenHBand="0" w:firstRowFirstColumn="0" w:firstRowLastColumn="0" w:lastRowFirstColumn="0" w:lastRowLastColumn="0"/>
             </w:pPr>
-            <w:r>
-              <w:t>Não</w:t>
-            </w:r>
           </w:p>
         </w:tc>
         <w:tc>
@@ -5900,9 +6124,6 @@
               <w:jc w:val="center"/>
               <w:cnfStyle w:val="000000100000" w:firstRow="0" w:lastRow="0" w:firstColumn="0" w:lastColumn="0" w:oddVBand="0" w:evenVBand="0" w:oddHBand="1" w:evenHBand="0" w:firstRowFirstColumn="0" w:firstRowLastColumn="0" w:lastRowFirstColumn="0" w:lastRowLastColumn="0"/>
             </w:pPr>
-            <w:r>
-              <w:t>Não</w:t>
-            </w:r>
           </w:p>
         </w:tc>
         <w:tc>
@@ -5914,9 +6135,6 @@
               <w:jc w:val="center"/>
               <w:cnfStyle w:val="000000100000" w:firstRow="0" w:lastRow="0" w:firstColumn="0" w:lastColumn="0" w:oddVBand="0" w:evenVBand="0" w:oddHBand="1" w:evenHBand="0" w:firstRowFirstColumn="0" w:firstRowLastColumn="0" w:lastRowFirstColumn="0" w:lastRowLastColumn="0"/>
             </w:pPr>
-            <w:r>
-              <w:t>Sim</w:t>
-            </w:r>
           </w:p>
         </w:tc>
       </w:tr>
@@ -5926,11 +6144,7 @@
             <w:cnfStyle w:val="001000000000" w:firstRow="0" w:lastRow="0" w:firstColumn="1" w:lastColumn="0" w:oddVBand="0" w:evenVBand="0" w:oddHBand="0" w:evenHBand="0" w:firstRowFirstColumn="0" w:firstRowLastColumn="0" w:lastRowFirstColumn="0" w:lastRowLastColumn="0"/>
             <w:tcW w:w="2348" w:type="dxa"/>
           </w:tcPr>
-          <w:p>
-            <w:r>
-              <w:t>Colaboração familiar</w:t>
-            </w:r>
-          </w:p>
+          <w:p/>
         </w:tc>
         <w:tc>
           <w:tcPr>
@@ -5941,9 +6155,6 @@
               <w:jc w:val="center"/>
               <w:cnfStyle w:val="000000000000" w:firstRow="0" w:lastRow="0" w:firstColumn="0" w:lastColumn="0" w:oddVBand="0" w:evenVBand="0" w:oddHBand="0" w:evenHBand="0" w:firstRowFirstColumn="0" w:firstRowLastColumn="0" w:lastRowFirstColumn="0" w:lastRowLastColumn="0"/>
             </w:pPr>
-            <w:r>
-              <w:t>Sim</w:t>
-            </w:r>
           </w:p>
         </w:tc>
         <w:tc>
@@ -5955,9 +6166,6 @@
               <w:jc w:val="center"/>
               <w:cnfStyle w:val="000000000000" w:firstRow="0" w:lastRow="0" w:firstColumn="0" w:lastColumn="0" w:oddVBand="0" w:evenVBand="0" w:oddHBand="0" w:evenHBand="0" w:firstRowFirstColumn="0" w:firstRowLastColumn="0" w:lastRowFirstColumn="0" w:lastRowLastColumn="0"/>
             </w:pPr>
-            <w:r>
-              <w:t>Sim</w:t>
-            </w:r>
           </w:p>
         </w:tc>
         <w:tc>
@@ -5969,9 +6177,6 @@
               <w:jc w:val="center"/>
               <w:cnfStyle w:val="000000000000" w:firstRow="0" w:lastRow="0" w:firstColumn="0" w:lastColumn="0" w:oddVBand="0" w:evenVBand="0" w:oddHBand="0" w:evenHBand="0" w:firstRowFirstColumn="0" w:firstRowLastColumn="0" w:lastRowFirstColumn="0" w:lastRowLastColumn="0"/>
             </w:pPr>
-            <w:r>
-              <w:t>Parcial</w:t>
-            </w:r>
           </w:p>
         </w:tc>
       </w:tr>
@@ -5984,11 +6189,7 @@
             <w:cnfStyle w:val="001000000000" w:firstRow="0" w:lastRow="0" w:firstColumn="1" w:lastColumn="0" w:oddVBand="0" w:evenVBand="0" w:oddHBand="0" w:evenHBand="0" w:firstRowFirstColumn="0" w:firstRowLastColumn="0" w:lastRowFirstColumn="0" w:lastRowLastColumn="0"/>
             <w:tcW w:w="2348" w:type="dxa"/>
           </w:tcPr>
-          <w:p>
-            <w:r>
-              <w:t>Histórico de compras</w:t>
-            </w:r>
-          </w:p>
+          <w:p/>
         </w:tc>
         <w:tc>
           <w:tcPr>
@@ -5999,9 +6200,6 @@
               <w:jc w:val="center"/>
               <w:cnfStyle w:val="000000100000" w:firstRow="0" w:lastRow="0" w:firstColumn="0" w:lastColumn="0" w:oddVBand="0" w:evenVBand="0" w:oddHBand="1" w:evenHBand="0" w:firstRowFirstColumn="0" w:firstRowLastColumn="0" w:lastRowFirstColumn="0" w:lastRowLastColumn="0"/>
             </w:pPr>
-            <w:r>
-              <w:t>Limitado</w:t>
-            </w:r>
           </w:p>
         </w:tc>
         <w:tc>
@@ -6013,9 +6211,6 @@
               <w:jc w:val="center"/>
               <w:cnfStyle w:val="000000100000" w:firstRow="0" w:lastRow="0" w:firstColumn="0" w:lastColumn="0" w:oddVBand="0" w:evenVBand="0" w:oddHBand="1" w:evenHBand="0" w:firstRowFirstColumn="0" w:firstRowLastColumn="0" w:lastRowFirstColumn="0" w:lastRowLastColumn="0"/>
             </w:pPr>
-            <w:r>
-              <w:t>Não</w:t>
-            </w:r>
           </w:p>
         </w:tc>
         <w:tc>
@@ -6027,290 +6222,6 @@
               <w:jc w:val="center"/>
               <w:cnfStyle w:val="000000100000" w:firstRow="0" w:lastRow="0" w:firstColumn="0" w:lastColumn="0" w:oddVBand="0" w:evenVBand="0" w:oddHBand="1" w:evenHBand="0" w:firstRowFirstColumn="0" w:firstRowLastColumn="0" w:lastRowFirstColumn="0" w:lastRowLastColumn="0"/>
             </w:pPr>
-            <w:r>
-              <w:t>Sim</w:t>
-            </w:r>
-          </w:p>
-        </w:tc>
-      </w:tr>
-      <w:tr>
-        <w:tc>
-          <w:tcPr>
-            <w:cnfStyle w:val="001000000000" w:firstRow="0" w:lastRow="0" w:firstColumn="1" w:lastColumn="0" w:oddVBand="0" w:evenVBand="0" w:oddHBand="0" w:evenHBand="0" w:firstRowFirstColumn="0" w:firstRowLastColumn="0" w:lastRowFirstColumn="0" w:lastRowLastColumn="0"/>
-            <w:tcW w:w="2348" w:type="dxa"/>
-          </w:tcPr>
-          <w:p>
-            <w:r>
-              <w:t>Estatísticas de consumo</w:t>
-            </w:r>
-          </w:p>
-        </w:tc>
-        <w:tc>
-          <w:tcPr>
-            <w:tcW w:w="2348" w:type="dxa"/>
-          </w:tcPr>
-          <w:p>
-            <w:pPr>
-              <w:jc w:val="center"/>
-              <w:cnfStyle w:val="000000000000" w:firstRow="0" w:lastRow="0" w:firstColumn="0" w:lastColumn="0" w:oddVBand="0" w:evenVBand="0" w:oddHBand="0" w:evenHBand="0" w:firstRowFirstColumn="0" w:firstRowLastColumn="0" w:lastRowFirstColumn="0" w:lastRowLastColumn="0"/>
-            </w:pPr>
-            <w:r>
-              <w:t>Não</w:t>
-            </w:r>
-          </w:p>
-        </w:tc>
-        <w:tc>
-          <w:tcPr>
-            <w:tcW w:w="2349" w:type="dxa"/>
-          </w:tcPr>
-          <w:p>
-            <w:pPr>
-              <w:jc w:val="center"/>
-              <w:cnfStyle w:val="000000000000" w:firstRow="0" w:lastRow="0" w:firstColumn="0" w:lastColumn="0" w:oddVBand="0" w:evenVBand="0" w:oddHBand="0" w:evenHBand="0" w:firstRowFirstColumn="0" w:firstRowLastColumn="0" w:lastRowFirstColumn="0" w:lastRowLastColumn="0"/>
-            </w:pPr>
-            <w:r>
-              <w:t>Não</w:t>
-            </w:r>
-          </w:p>
-        </w:tc>
-        <w:tc>
-          <w:tcPr>
-            <w:tcW w:w="2349" w:type="dxa"/>
-          </w:tcPr>
-          <w:p>
-            <w:pPr>
-              <w:jc w:val="center"/>
-              <w:cnfStyle w:val="000000000000" w:firstRow="0" w:lastRow="0" w:firstColumn="0" w:lastColumn="0" w:oddVBand="0" w:evenVBand="0" w:oddHBand="0" w:evenHBand="0" w:firstRowFirstColumn="0" w:firstRowLastColumn="0" w:lastRowFirstColumn="0" w:lastRowLastColumn="0"/>
-            </w:pPr>
-            <w:r>
-              <w:t>Sim</w:t>
-            </w:r>
-          </w:p>
-        </w:tc>
-      </w:tr>
-      <w:tr>
-        <w:trPr>
-          <w:cnfStyle w:val="000000100000" w:firstRow="0" w:lastRow="0" w:firstColumn="0" w:lastColumn="0" w:oddVBand="0" w:evenVBand="0" w:oddHBand="1" w:evenHBand="0" w:firstRowFirstColumn="0" w:firstRowLastColumn="0" w:lastRowFirstColumn="0" w:lastRowLastColumn="0"/>
-        </w:trPr>
-        <w:tc>
-          <w:tcPr>
-            <w:cnfStyle w:val="001000000000" w:firstRow="0" w:lastRow="0" w:firstColumn="1" w:lastColumn="0" w:oddVBand="0" w:evenVBand="0" w:oddHBand="0" w:evenHBand="0" w:firstRowFirstColumn="0" w:firstRowLastColumn="0" w:lastRowFirstColumn="0" w:lastRowLastColumn="0"/>
-            <w:tcW w:w="2348" w:type="dxa"/>
-          </w:tcPr>
-          <w:p>
-            <w:r>
-              <w:t>Sugestão de lista por histórico</w:t>
-            </w:r>
-          </w:p>
-        </w:tc>
-        <w:tc>
-          <w:tcPr>
-            <w:tcW w:w="2348" w:type="dxa"/>
-          </w:tcPr>
-          <w:p>
-            <w:pPr>
-              <w:jc w:val="center"/>
-              <w:cnfStyle w:val="000000100000" w:firstRow="0" w:lastRow="0" w:firstColumn="0" w:lastColumn="0" w:oddVBand="0" w:evenVBand="0" w:oddHBand="1" w:evenHBand="0" w:firstRowFirstColumn="0" w:firstRowLastColumn="0" w:lastRowFirstColumn="0" w:lastRowLastColumn="0"/>
-            </w:pPr>
-            <w:r>
-              <w:t>Não</w:t>
-            </w:r>
-          </w:p>
-        </w:tc>
-        <w:tc>
-          <w:tcPr>
-            <w:tcW w:w="2349" w:type="dxa"/>
-          </w:tcPr>
-          <w:p>
-            <w:pPr>
-              <w:jc w:val="center"/>
-              <w:cnfStyle w:val="000000100000" w:firstRow="0" w:lastRow="0" w:firstColumn="0" w:lastColumn="0" w:oddVBand="0" w:evenVBand="0" w:oddHBand="1" w:evenHBand="0" w:firstRowFirstColumn="0" w:firstRowLastColumn="0" w:lastRowFirstColumn="0" w:lastRowLastColumn="0"/>
-            </w:pPr>
-            <w:r>
-              <w:t>Não</w:t>
-            </w:r>
-          </w:p>
-        </w:tc>
-        <w:tc>
-          <w:tcPr>
-            <w:tcW w:w="2349" w:type="dxa"/>
-          </w:tcPr>
-          <w:p>
-            <w:pPr>
-              <w:jc w:val="center"/>
-              <w:cnfStyle w:val="000000100000" w:firstRow="0" w:lastRow="0" w:firstColumn="0" w:lastColumn="0" w:oddVBand="0" w:evenVBand="0" w:oddHBand="1" w:evenHBand="0" w:firstRowFirstColumn="0" w:firstRowLastColumn="0" w:lastRowFirstColumn="0" w:lastRowLastColumn="0"/>
-            </w:pPr>
-            <w:r>
-              <w:t>Não</w:t>
-            </w:r>
-          </w:p>
-        </w:tc>
-      </w:tr>
-      <w:tr>
-        <w:tc>
-          <w:tcPr>
-            <w:cnfStyle w:val="001000000000" w:firstRow="0" w:lastRow="0" w:firstColumn="1" w:lastColumn="0" w:oddVBand="0" w:evenVBand="0" w:oddHBand="0" w:evenHBand="0" w:firstRowFirstColumn="0" w:firstRowLastColumn="0" w:lastRowFirstColumn="0" w:lastRowLastColumn="0"/>
-            <w:tcW w:w="2348" w:type="dxa"/>
-          </w:tcPr>
-          <w:p>
-            <w:r>
-              <w:t>Exportação de dados</w:t>
-            </w:r>
-          </w:p>
-        </w:tc>
-        <w:tc>
-          <w:tcPr>
-            <w:tcW w:w="2348" w:type="dxa"/>
-          </w:tcPr>
-          <w:p>
-            <w:pPr>
-              <w:jc w:val="center"/>
-              <w:cnfStyle w:val="000000000000" w:firstRow="0" w:lastRow="0" w:firstColumn="0" w:lastColumn="0" w:oddVBand="0" w:evenVBand="0" w:oddHBand="0" w:evenHBand="0" w:firstRowFirstColumn="0" w:firstRowLastColumn="0" w:lastRowFirstColumn="0" w:lastRowLastColumn="0"/>
-            </w:pPr>
-            <w:r>
-              <w:t>Não</w:t>
-            </w:r>
-          </w:p>
-        </w:tc>
-        <w:tc>
-          <w:tcPr>
-            <w:tcW w:w="2349" w:type="dxa"/>
-          </w:tcPr>
-          <w:p>
-            <w:pPr>
-              <w:jc w:val="center"/>
-              <w:cnfStyle w:val="000000000000" w:firstRow="0" w:lastRow="0" w:firstColumn="0" w:lastColumn="0" w:oddVBand="0" w:evenVBand="0" w:oddHBand="0" w:evenHBand="0" w:firstRowFirstColumn="0" w:firstRowLastColumn="0" w:lastRowFirstColumn="0" w:lastRowLastColumn="0"/>
-            </w:pPr>
-            <w:r>
-              <w:t>Não</w:t>
-            </w:r>
-          </w:p>
-        </w:tc>
-        <w:tc>
-          <w:tcPr>
-            <w:tcW w:w="2349" w:type="dxa"/>
-          </w:tcPr>
-          <w:p>
-            <w:pPr>
-              <w:jc w:val="center"/>
-              <w:cnfStyle w:val="000000000000" w:firstRow="0" w:lastRow="0" w:firstColumn="0" w:lastColumn="0" w:oddVBand="0" w:evenVBand="0" w:oddHBand="0" w:evenHBand="0" w:firstRowFirstColumn="0" w:firstRowLastColumn="0" w:lastRowFirstColumn="0" w:lastRowLastColumn="0"/>
-            </w:pPr>
-            <w:r>
-              <w:t>Sim</w:t>
-            </w:r>
-          </w:p>
-        </w:tc>
-      </w:tr>
-      <w:tr>
-        <w:trPr>
-          <w:cnfStyle w:val="000000100000" w:firstRow="0" w:lastRow="0" w:firstColumn="0" w:lastColumn="0" w:oddVBand="0" w:evenVBand="0" w:oddHBand="1" w:evenHBand="0" w:firstRowFirstColumn="0" w:firstRowLastColumn="0" w:lastRowFirstColumn="0" w:lastRowLastColumn="0"/>
-        </w:trPr>
-        <w:tc>
-          <w:tcPr>
-            <w:cnfStyle w:val="001000000000" w:firstRow="0" w:lastRow="0" w:firstColumn="1" w:lastColumn="0" w:oddVBand="0" w:evenVBand="0" w:oddHBand="0" w:evenHBand="0" w:firstRowFirstColumn="0" w:firstRowLastColumn="0" w:lastRowFirstColumn="0" w:lastRowLastColumn="0"/>
-            <w:tcW w:w="2348" w:type="dxa"/>
-          </w:tcPr>
-          <w:p>
-            <w:r>
-              <w:t>Modo de compra em tempo real</w:t>
-            </w:r>
-          </w:p>
-        </w:tc>
-        <w:tc>
-          <w:tcPr>
-            <w:tcW w:w="2348" w:type="dxa"/>
-          </w:tcPr>
-          <w:p>
-            <w:pPr>
-              <w:jc w:val="center"/>
-              <w:cnfStyle w:val="000000100000" w:firstRow="0" w:lastRow="0" w:firstColumn="0" w:lastColumn="0" w:oddVBand="0" w:evenVBand="0" w:oddHBand="1" w:evenHBand="0" w:firstRowFirstColumn="0" w:firstRowLastColumn="0" w:lastRowFirstColumn="0" w:lastRowLastColumn="0"/>
-            </w:pPr>
-            <w:r>
-              <w:t>Não</w:t>
-            </w:r>
-          </w:p>
-        </w:tc>
-        <w:tc>
-          <w:tcPr>
-            <w:tcW w:w="2349" w:type="dxa"/>
-          </w:tcPr>
-          <w:p>
-            <w:pPr>
-              <w:jc w:val="center"/>
-              <w:cnfStyle w:val="000000100000" w:firstRow="0" w:lastRow="0" w:firstColumn="0" w:lastColumn="0" w:oddVBand="0" w:evenVBand="0" w:oddHBand="1" w:evenHBand="0" w:firstRowFirstColumn="0" w:firstRowLastColumn="0" w:lastRowFirstColumn="0" w:lastRowLastColumn="0"/>
-            </w:pPr>
-            <w:r>
-              <w:t>Sim</w:t>
-            </w:r>
-          </w:p>
-        </w:tc>
-        <w:tc>
-          <w:tcPr>
-            <w:tcW w:w="2349" w:type="dxa"/>
-          </w:tcPr>
-          <w:p>
-            <w:pPr>
-              <w:jc w:val="center"/>
-              <w:cnfStyle w:val="000000100000" w:firstRow="0" w:lastRow="0" w:firstColumn="0" w:lastColumn="0" w:oddVBand="0" w:evenVBand="0" w:oddHBand="1" w:evenHBand="0" w:firstRowFirstColumn="0" w:firstRowLastColumn="0" w:lastRowFirstColumn="0" w:lastRowLastColumn="0"/>
-            </w:pPr>
-            <w:r>
-              <w:t>Não</w:t>
-            </w:r>
-          </w:p>
-        </w:tc>
-      </w:tr>
-      <w:tr>
-        <w:tc>
-          <w:tcPr>
-            <w:cnfStyle w:val="001000000000" w:firstRow="0" w:lastRow="0" w:firstColumn="1" w:lastColumn="0" w:oddVBand="0" w:evenVBand="0" w:oddHBand="0" w:evenHBand="0" w:firstRowFirstColumn="0" w:firstRowLastColumn="0" w:lastRowFirstColumn="0" w:lastRowLastColumn="0"/>
-            <w:tcW w:w="2348" w:type="dxa"/>
-          </w:tcPr>
-          <w:p>
-            <w:r>
-              <w:t>Alerta de orçamento excedido</w:t>
-            </w:r>
-          </w:p>
-        </w:tc>
-        <w:tc>
-          <w:tcPr>
-            <w:tcW w:w="2348" w:type="dxa"/>
-          </w:tcPr>
-          <w:p>
-            <w:pPr>
-              <w:jc w:val="center"/>
-              <w:cnfStyle w:val="000000000000" w:firstRow="0" w:lastRow="0" w:firstColumn="0" w:lastColumn="0" w:oddVBand="0" w:evenVBand="0" w:oddHBand="0" w:evenHBand="0" w:firstRowFirstColumn="0" w:firstRowLastColumn="0" w:lastRowFirstColumn="0" w:lastRowLastColumn="0"/>
-            </w:pPr>
-            <w:r>
-              <w:t>Não</w:t>
-            </w:r>
-          </w:p>
-        </w:tc>
-        <w:tc>
-          <w:tcPr>
-            <w:tcW w:w="2349" w:type="dxa"/>
-          </w:tcPr>
-          <w:p>
-            <w:pPr>
-              <w:jc w:val="center"/>
-              <w:cnfStyle w:val="000000000000" w:firstRow="0" w:lastRow="0" w:firstColumn="0" w:lastColumn="0" w:oddVBand="0" w:evenVBand="0" w:oddHBand="0" w:evenHBand="0" w:firstRowFirstColumn="0" w:firstRowLastColumn="0" w:lastRowFirstColumn="0" w:lastRowLastColumn="0"/>
-            </w:pPr>
-            <w:r>
-              <w:t>Não</w:t>
-            </w:r>
-          </w:p>
-        </w:tc>
-        <w:tc>
-          <w:tcPr>
-            <w:tcW w:w="2349" w:type="dxa"/>
-          </w:tcPr>
-          <w:p>
-            <w:pPr>
-              <w:jc w:val="center"/>
-              <w:cnfStyle w:val="000000000000" w:firstRow="0" w:lastRow="0" w:firstColumn="0" w:lastColumn="0" w:oddVBand="0" w:evenVBand="0" w:oddHBand="0" w:evenHBand="0" w:firstRowFirstColumn="0" w:firstRowLastColumn="0" w:lastRowFirstColumn="0" w:lastRowLastColumn="0"/>
-            </w:pPr>
-            <w:r>
-              <w:t>Sim</w:t>
-            </w:r>
           </w:p>
         </w:tc>
       </w:tr>
@@ -6320,56 +6231,147 @@
       <w:pPr>
         <w:pStyle w:val="Heading3"/>
       </w:pPr>
-      <w:bookmarkStart w:id="14" w:name="_Toc231221401"/>
+      <w:bookmarkStart w:id="14" w:name="_Toc230871603"/>
       <w:r>
         <w:t>Enquadramento da análise concorrencial no SI</w:t>
       </w:r>
       <w:bookmarkEnd w:id="14"/>
     </w:p>
     <w:p>
-      <w:r>
-        <w:t>Os três sistemas foram escolhidos por representarem abordagens distintas ao problema: o AnyList pela simplicidade colaborativa, o Bring! pela experiência visual</w:t>
-      </w:r>
-      <w:r>
+      <w:pPr>
+        <w:rPr>
+          <w:highlight w:val="yellow"/>
+        </w:rPr>
+      </w:pPr>
+      <w:r>
+        <w:rPr>
+          <w:highlight w:val="yellow"/>
+        </w:rPr>
+        <w:t>&lt;</w:t>
+      </w:r>
+      <w:r>
+        <w:rPr>
+          <w:highlight w:val="yellow"/>
+        </w:rPr>
         <w:t xml:space="preserve"> </w:t>
       </w:r>
       <w:r>
-        <w:t>e o YNAB pelo controlo financeiro avançado.</w:t>
+        <w:rPr>
+          <w:highlight w:val="yellow"/>
+        </w:rPr>
+        <w:t>Enquadramento estratégico dos 3 sistemas no SI</w:t>
+      </w:r>
+      <w:r>
+        <w:rPr>
+          <w:highlight w:val="yellow"/>
+        </w:rPr>
+        <w:t xml:space="preserve"> a </w:t>
+      </w:r>
+      <w:r>
+        <w:rPr>
+          <w:highlight w:val="yellow"/>
+        </w:rPr>
+        <w:t>desenvolver</w:t>
+      </w:r>
+      <w:r>
+        <w:rPr>
+          <w:highlight w:val="yellow"/>
+        </w:rPr>
+        <w:t xml:space="preserve"> </w:t>
+      </w:r>
+      <w:r>
+        <w:rPr>
+          <w:highlight w:val="yellow"/>
+        </w:rPr>
+        <w:t xml:space="preserve">(razões pelas quais são </w:t>
+      </w:r>
+      <w:r>
+        <w:rPr>
+          <w:highlight w:val="yellow"/>
+        </w:rPr>
+        <w:t xml:space="preserve">os sistemas analisados são </w:t>
+      </w:r>
+      <w:r>
+        <w:rPr>
+          <w:highlight w:val="yellow"/>
+        </w:rPr>
+        <w:t>importantes no SI</w:t>
+      </w:r>
+      <w:r>
+        <w:rPr>
+          <w:highlight w:val="yellow"/>
+        </w:rPr>
+        <w:t xml:space="preserve"> a ser desenvolvido; vantagens e desvantagens da abordagem</w:t>
+      </w:r>
+      <w:r>
+        <w:rPr>
+          <w:highlight w:val="yellow"/>
+        </w:rPr>
+        <w:t>)</w:t>
+      </w:r>
+      <w:r>
+        <w:rPr>
+          <w:highlight w:val="yellow"/>
+        </w:rPr>
+        <w:t xml:space="preserve">. </w:t>
+      </w:r>
+      <w:r>
+        <w:rPr>
+          <w:highlight w:val="yellow"/>
+        </w:rPr>
+        <w:t>Explicar:</w:t>
       </w:r>
     </w:p>
     <w:p>
       <w:pPr>
+        <w:pStyle w:val="ListParagraph"/>
+        <w:numPr>
+          <w:ilvl w:val="0"/>
+          <w:numId w:val="21"/>
+        </w:numPr>
         <w:rPr>
           <w:highlight w:val="yellow"/>
         </w:rPr>
       </w:pPr>
       <w:r>
-        <w:t>A análise revelou que nenhum combina numa única solução o planeamento de compras com controlo financeiro orientado ao agregado familiar, o que representa precisamente o espaço que o iShopping ocupa. Esta conclusão reforçou decisões de desenvolvimento como o modo de compra em tempo real, as estatísticas de consumo e a sugestão automática de orçamento e lista de compras.</w:t>
+        <w:rPr>
+          <w:highlight w:val="yellow"/>
+        </w:rPr>
+        <w:t>Porque é que foram escolhidos estes 3 sistemas no meio de tantos outros</w:t>
+      </w:r>
+    </w:p>
+    <w:p>
+      <w:pPr>
+        <w:pStyle w:val="ListParagraph"/>
+        <w:numPr>
+          <w:ilvl w:val="0"/>
+          <w:numId w:val="21"/>
+        </w:numPr>
+        <w:rPr>
+          <w:highlight w:val="yellow"/>
+        </w:rPr>
+      </w:pPr>
+      <w:r>
+        <w:rPr>
+          <w:highlight w:val="yellow"/>
+        </w:rPr>
+        <w:t>De que forma é que a presente análise irá impactar na estratégia de conceção e desenvolvimento do produto que resulta das atividades do projeto</w:t>
+      </w:r>
+      <w:r>
+        <w:rPr>
+          <w:highlight w:val="yellow"/>
+        </w:rPr>
+        <w:t>&gt;</w:t>
       </w:r>
     </w:p>
     <w:p/>
     <w:p/>
-    <w:p/>
-    <w:p/>
-    <w:p/>
-    <w:p/>
-    <w:p/>
-    <w:p/>
-    <w:p/>
-    <w:p/>
-    <w:p/>
-    <w:p/>
-    <w:p/>
-    <w:p/>
-    <w:p/>
-    <w:p/>
     <w:p>
       <w:pPr>
         <w:pStyle w:val="Heading2"/>
       </w:pPr>
-      <w:bookmarkStart w:id="15" w:name="_Toc231221402"/>
-      <w:r>
-        <w:lastRenderedPageBreak/>
+      <w:bookmarkStart w:id="15" w:name="_Toc230871604"/>
+      <w:r>
         <w:t>Wireframes/Mockups</w:t>
       </w:r>
       <w:bookmarkEnd w:id="15"/>
@@ -6404,6 +6406,7 @@
         <w:rPr>
           <w:noProof/>
         </w:rPr>
+        <w:lastRenderedPageBreak/>
         <w:drawing>
           <wp:inline distT="0" distB="0" distL="0" distR="0" wp14:anchorId="1AA1AEC4" wp14:editId="33110529">
             <wp:extent cx="6120130" cy="6151880"/>
@@ -6420,7 +6423,7 @@
                     <pic:cNvPicPr/>
                   </pic:nvPicPr>
                   <pic:blipFill>
-                    <a:blip r:embed="rId14"/>
+                    <a:blip r:embed="rId12"/>
                     <a:stretch>
                       <a:fillRect/>
                     </a:stretch>
@@ -6446,7 +6449,7 @@
         <w:pStyle w:val="Caption"/>
         <w:jc w:val="center"/>
       </w:pPr>
-      <w:bookmarkStart w:id="16" w:name="_Toc231221414"/>
+      <w:bookmarkStart w:id="16" w:name="_Toc227746380"/>
       <w:r>
         <w:t xml:space="preserve">Figura </w:t>
       </w:r>
@@ -6488,7 +6491,7 @@
         <w:pStyle w:val="Heading2"/>
       </w:pPr>
       <w:bookmarkStart w:id="17" w:name="_Toc102664379"/>
-      <w:bookmarkStart w:id="18" w:name="_Toc231221403"/>
+      <w:bookmarkStart w:id="18" w:name="_Toc230871605"/>
       <w:r>
         <w:t>Diagrama de Classes</w:t>
       </w:r>
@@ -6541,7 +6544,7 @@
                     <pic:cNvPicPr/>
                   </pic:nvPicPr>
                   <pic:blipFill>
-                    <a:blip r:embed="rId15">
+                    <a:blip r:embed="rId13">
                       <a:extLst>
                         <a:ext uri="{28A0092B-C50C-407E-A947-70E740481C1C}">
                           <a14:useLocalDpi xmlns:a14="http://schemas.microsoft.com/office/drawing/2010/main" val="0"/>
@@ -6574,7 +6577,7 @@
         <w:jc w:val="center"/>
       </w:pPr>
       <w:bookmarkStart w:id="19" w:name="_Toc70951687"/>
-      <w:bookmarkStart w:id="20" w:name="_Toc231221415"/>
+      <w:bookmarkStart w:id="20" w:name="_Toc227746381"/>
       <w:r>
         <w:t xml:space="preserve">Figura </w:t>
       </w:r>
@@ -6616,7 +6619,7 @@
       <w:pPr>
         <w:pStyle w:val="Heading1"/>
       </w:pPr>
-      <w:bookmarkStart w:id="21" w:name="_Toc231221404"/>
+      <w:bookmarkStart w:id="21" w:name="_Toc230871606"/>
       <w:r>
         <w:lastRenderedPageBreak/>
         <w:t>Scrum</w:t>
@@ -6636,7 +6639,7 @@
       <w:pPr>
         <w:pStyle w:val="Heading2"/>
       </w:pPr>
-      <w:bookmarkStart w:id="22" w:name="_Toc231221405"/>
+      <w:bookmarkStart w:id="22" w:name="_Toc230871607"/>
       <w:r>
         <w:t>Aplicação do Scrum ao Projeto</w:t>
       </w:r>
@@ -6792,7 +6795,7 @@
       <w:pPr>
         <w:pStyle w:val="Heading2"/>
       </w:pPr>
-      <w:bookmarkStart w:id="23" w:name="_Toc231221406"/>
+      <w:bookmarkStart w:id="23" w:name="_Toc230871608"/>
       <w:r>
         <w:t>Stakeholders e Scrum Team</w:t>
       </w:r>
@@ -6813,7 +6816,7 @@
         <w:keepNext/>
         <w:jc w:val="center"/>
       </w:pPr>
-      <w:bookmarkStart w:id="24" w:name="_Toc231221423"/>
+      <w:bookmarkStart w:id="24" w:name="_Toc227746395"/>
       <w:r>
         <w:t xml:space="preserve">Tabela </w:t>
       </w:r>
@@ -7146,7 +7149,7 @@
       <w:pPr>
         <w:pStyle w:val="Heading2"/>
       </w:pPr>
-      <w:bookmarkStart w:id="25" w:name="_Toc231221407"/>
+      <w:bookmarkStart w:id="25" w:name="_Toc230871609"/>
       <w:r>
         <w:t>User Stories</w:t>
       </w:r>
@@ -10197,7 +10200,7 @@
       <w:pPr>
         <w:pStyle w:val="Heading2"/>
       </w:pPr>
-      <w:bookmarkStart w:id="26" w:name="_Toc231221408"/>
+      <w:bookmarkStart w:id="26" w:name="_Toc230871610"/>
       <w:r>
         <w:lastRenderedPageBreak/>
         <w:t>Execução do projeto</w:t>
@@ -10338,7 +10341,7 @@
       <w:pPr>
         <w:pStyle w:val="Heading3"/>
       </w:pPr>
-      <w:bookmarkStart w:id="27" w:name="_Toc231221409"/>
+      <w:bookmarkStart w:id="27" w:name="_Toc230871611"/>
       <w:r>
         <w:t>Sprint 1 (</w:t>
       </w:r>
@@ -10520,7 +10523,7 @@
                           <pic:cNvPicPr/>
                         </pic:nvPicPr>
                         <pic:blipFill>
-                          <a:blip r:embed="rId16"/>
+                          <a:blip r:embed="rId14"/>
                           <a:stretch>
                             <a:fillRect/>
                           </a:stretch>
@@ -11713,7 +11716,7 @@
                           <pic:cNvPicPr/>
                         </pic:nvPicPr>
                         <pic:blipFill>
-                          <a:blip r:embed="rId17"/>
+                          <a:blip r:embed="rId15"/>
                           <a:stretch>
                             <a:fillRect/>
                           </a:stretch>
@@ -11744,7 +11747,7 @@
       <w:pPr>
         <w:pStyle w:val="Heading3"/>
       </w:pPr>
-      <w:bookmarkStart w:id="28" w:name="_Toc231221410"/>
+      <w:bookmarkStart w:id="28" w:name="_Toc230871612"/>
       <w:r>
         <w:t>Sprint 2 (</w:t>
       </w:r>
@@ -13096,7 +13099,7 @@
       <w:pPr>
         <w:pStyle w:val="Heading3"/>
       </w:pPr>
-      <w:bookmarkStart w:id="29" w:name="_Toc231221411"/>
+      <w:bookmarkStart w:id="29" w:name="_Toc230871613"/>
       <w:r>
         <w:t>Sprint 3 (</w:t>
       </w:r>
@@ -14443,7 +14446,7 @@
       <w:pPr>
         <w:pStyle w:val="Heading2"/>
       </w:pPr>
-      <w:bookmarkStart w:id="30" w:name="_Toc231221412"/>
+      <w:bookmarkStart w:id="30" w:name="_Toc230871614"/>
       <w:r>
         <w:rPr>
           <w:i/>
@@ -15109,7 +15112,7 @@
       <w:pPr>
         <w:pStyle w:val="Heading1"/>
       </w:pPr>
-      <w:bookmarkStart w:id="31" w:name="_Toc231221413"/>
+      <w:bookmarkStart w:id="31" w:name="_Toc230871615"/>
       <w:r>
         <w:lastRenderedPageBreak/>
         <w:t>Conclus</w:t>
@@ -15418,8 +15421,8 @@
     </w:p>
     <w:p/>
     <w:sectPr>
-      <w:headerReference w:type="default" r:id="rId18"/>
-      <w:footerReference w:type="default" r:id="rId19"/>
+      <w:headerReference w:type="default" r:id="rId16"/>
+      <w:footerReference w:type="default" r:id="rId17"/>
       <w:pgSz w:w="11906" w:h="16838"/>
       <w:pgMar w:top="1134" w:right="1134" w:bottom="1418" w:left="1134" w:header="709" w:footer="692" w:gutter="0"/>
       <w:cols w:space="708"/>

</xml_diff>